<commit_message>
Updated OI logic and documents
</commit_message>
<xml_diff>
--- a/Nifty-Intra-OI/SD-X_v11_User_Guide.docx
+++ b/Nifty-Intra-OI/SD-X_v11_User_Guide.docx
@@ -2244,600 +2244,7 @@
         <w:pStyle w:val="FirstParagraph"/>
       </w:pPr>
       <w:r>
-        <w:t xml:space="preserve">OI is the number of contracts outstanding at each strike. Rising call OI means fresh call writing, which builds resistance; rising put OI means put writing, which builds support. The table reads the chain around ATM and summarises the day.</w:t>
-      </w:r>
-    </w:p>
-    <w:tbl>
-      <w:tblPr>
-        <w:tblStyle w:val="Table"/>
-        <w:tblW w:type="pct" w:w="5000"/>
-        <w:tblLayout w:type="fixed"/>
-        <w:tblLook w:firstRow="1" w:lastRow="0" w:firstColumn="0" w:lastColumn="0" w:noHBand="0" w:noVBand="0" w:val="0020"/>
-      </w:tblPr>
-      <w:tblGrid>
-        <w:gridCol w:w="3960"/>
-        <w:gridCol w:w="3960"/>
-      </w:tblGrid>
-      <w:tr>
-        <w:trPr>
-          <w:tblHeader w:val="on"/>
-        </w:trPr>
-        <w:tc>
-          <w:tcPr/>
-          <w:p>
-            <w:pPr>
-              <w:pStyle w:val="Compact"/>
-              <w:jc w:val="left"/>
-            </w:pPr>
-            <w:r>
-              <w:rPr>
-                <w:b/>
-                <w:bCs/>
-              </w:rPr>
-              <w:t xml:space="preserve">Reading</w:t>
-            </w:r>
-          </w:p>
-        </w:tc>
-        <w:tc>
-          <w:tcPr/>
-          <w:p>
-            <w:pPr>
-              <w:pStyle w:val="Compact"/>
-              <w:jc w:val="left"/>
-            </w:pPr>
-            <w:r>
-              <w:rPr>
-                <w:b/>
-                <w:bCs/>
-              </w:rPr>
-              <w:t xml:space="preserve">Interpretation</w:t>
-            </w:r>
-          </w:p>
-        </w:tc>
-      </w:tr>
-      <w:tr>
-        <w:tc>
-          <w:tcPr/>
-          <w:p>
-            <w:pPr>
-              <w:pStyle w:val="Compact"/>
-              <w:jc w:val="left"/>
-            </w:pPr>
-            <w:r>
-              <w:t xml:space="preserve">CE Δ positive (red)</w:t>
-            </w:r>
-          </w:p>
-        </w:tc>
-        <w:tc>
-          <w:tcPr/>
-          <w:p>
-            <w:pPr>
-              <w:pStyle w:val="Compact"/>
-              <w:jc w:val="left"/>
-            </w:pPr>
-            <w:r>
-              <w:t xml:space="preserve">Call writing at that strike — sellers expect price to stay below it</w:t>
-            </w:r>
-          </w:p>
-        </w:tc>
-      </w:tr>
-      <w:tr>
-        <w:tc>
-          <w:tcPr/>
-          <w:p>
-            <w:pPr>
-              <w:pStyle w:val="Compact"/>
-              <w:jc w:val="left"/>
-            </w:pPr>
-            <w:r>
-              <w:t xml:space="preserve">PE Δ positive (green)</w:t>
-            </w:r>
-          </w:p>
-        </w:tc>
-        <w:tc>
-          <w:tcPr/>
-          <w:p>
-            <w:pPr>
-              <w:pStyle w:val="Compact"/>
-              <w:jc w:val="left"/>
-            </w:pPr>
-            <w:r>
-              <w:t xml:space="preserve">Put writing — sellers expect price to hold above it</w:t>
-            </w:r>
-          </w:p>
-        </w:tc>
-      </w:tr>
-      <w:tr>
-        <w:tc>
-          <w:tcPr/>
-          <w:p>
-            <w:pPr>
-              <w:pStyle w:val="Compact"/>
-              <w:jc w:val="left"/>
-            </w:pPr>
-            <w:r>
-              <w:t xml:space="preserve">Res / Sup</w:t>
-            </w:r>
-          </w:p>
-        </w:tc>
-        <w:tc>
-          <w:tcPr/>
-          <w:p>
-            <w:pPr>
-              <w:pStyle w:val="Compact"/>
-              <w:jc w:val="left"/>
-            </w:pPr>
-            <w:r>
-              <w:t xml:space="preserve">Strike with the highest total CE / PE open interest</w:t>
-            </w:r>
-          </w:p>
-        </w:tc>
-      </w:tr>
-      <w:tr>
-        <w:tc>
-          <w:tcPr/>
-          <w:p>
-            <w:pPr>
-              <w:pStyle w:val="Compact"/>
-              <w:jc w:val="left"/>
-            </w:pPr>
-            <w:r>
-              <w:t xml:space="preserve">CE wr / PE wr</w:t>
-            </w:r>
-          </w:p>
-        </w:tc>
-        <w:tc>
-          <w:tcPr/>
-          <w:p>
-            <w:pPr>
-              <w:pStyle w:val="Compact"/>
-              <w:jc w:val="left"/>
-            </w:pPr>
-            <w:r>
-              <w:t xml:space="preserve">Strike where the most OI was ADDED today. Usually more relevant intraday than total OI.</w:t>
-            </w:r>
-          </w:p>
-        </w:tc>
-      </w:tr>
-      <w:tr>
-        <w:tc>
-          <w:tcPr/>
-          <w:p>
-            <w:pPr>
-              <w:pStyle w:val="Compact"/>
-              <w:jc w:val="left"/>
-            </w:pPr>
-            <w:r>
-              <w:t xml:space="preserve">PCR</w:t>
-            </w:r>
-          </w:p>
-        </w:tc>
-        <w:tc>
-          <w:tcPr/>
-          <w:p>
-            <w:pPr>
-              <w:pStyle w:val="Compact"/>
-              <w:jc w:val="left"/>
-            </w:pPr>
-            <w:r>
-              <w:t xml:space="preserve">Put-call ratio of total OI. Above 1.2 leans bullish, below 0.8 bearish. A blunt measure — use it as background, not a trigger.</w:t>
-            </w:r>
-          </w:p>
-        </w:tc>
-      </w:tr>
-      <w:tr>
-        <w:tc>
-          <w:tcPr/>
-          <w:p>
-            <w:pPr>
-              <w:pStyle w:val="Compact"/>
-              <w:jc w:val="left"/>
-            </w:pPr>
-            <w:r>
-              <w:t xml:space="preserve">Buildup</w:t>
-            </w:r>
-          </w:p>
-        </w:tc>
-        <w:tc>
-          <w:tcPr/>
-          <w:p>
-            <w:pPr>
-              <w:pStyle w:val="Compact"/>
-              <w:jc w:val="left"/>
-            </w:pPr>
-            <w:r>
-              <w:t xml:space="preserve">Futures OI change against the day’s price move: long buildup, short buildup, short covering, or long unwinding.</w:t>
-            </w:r>
-          </w:p>
-        </w:tc>
-      </w:tr>
-    </w:tbl>
-    <w:p>
-      <w:pPr>
-        <w:pStyle w:val="BodyText"/>
-      </w:pPr>
-      <w:r>
-        <w:t xml:space="preserve">If your TradingView plan has no NSE F&amp;O OI entitlement,</w:t>
-      </w:r>
-      <w:r>
-        <w:t xml:space="preserve"> </w:t>
-      </w:r>
-      <w:r>
-        <w:rPr>
-          <w:rStyle w:val="VerbatimChar"/>
-        </w:rPr>
-        <w:t xml:space="preserve">oi_chain.py</w:t>
-      </w:r>
-      <w:r>
-        <w:t xml:space="preserve"> </w:t>
-      </w:r>
-      <w:r>
-        <w:t xml:space="preserve">prints the same table from NSE’s public endpoint, and</w:t>
-      </w:r>
-      <w:r>
-        <w:t xml:space="preserve"> </w:t>
-      </w:r>
-      <w:r>
-        <w:rPr>
-          <w:rStyle w:val="VerbatimChar"/>
-        </w:rPr>
-        <w:t xml:space="preserve">oi_desktop.py</w:t>
-      </w:r>
-      <w:r>
-        <w:t xml:space="preserve"> </w:t>
-      </w:r>
-      <w:r>
-        <w:t xml:space="preserve">keeps it on screen.</w:t>
-      </w:r>
-    </w:p>
-    <w:bookmarkEnd w:id="22"/>
-    <w:bookmarkEnd w:id="23"/>
-    <w:bookmarkStart w:id="26" w:name="how-a-signal-is-produced"/>
-    <w:p>
-      <w:pPr>
-        <w:pStyle w:val="Heading2"/>
-      </w:pPr>
-      <w:r>
-        <w:t xml:space="preserve">4. How a signal is produced</w:t>
-      </w:r>
-    </w:p>
-    <w:p>
-      <w:pPr>
-        <w:pStyle w:val="FirstParagraph"/>
-      </w:pPr>
-      <w:r>
-        <w:t xml:space="preserve">Every bar passes through six stages. A setup must survive all of them to become a circle on the chart. The diagnostic table counts how many setups die at each stage, which is what makes the system debuggable.</w:t>
-      </w:r>
-    </w:p>
-    <w:tbl>
-      <w:tblPr>
-        <w:tblStyle w:val="Table"/>
-        <w:tblW w:type="pct" w:w="5000"/>
-        <w:tblLayout w:type="fixed"/>
-        <w:tblLook w:firstRow="1" w:lastRow="0" w:firstColumn="0" w:lastColumn="0" w:noHBand="0" w:noVBand="0" w:val="0020"/>
-      </w:tblPr>
-      <w:tblGrid>
-        <w:gridCol w:w="2640"/>
-        <w:gridCol w:w="2640"/>
-        <w:gridCol w:w="2640"/>
-      </w:tblGrid>
-      <w:tr>
-        <w:trPr>
-          <w:tblHeader w:val="on"/>
-        </w:trPr>
-        <w:tc>
-          <w:tcPr/>
-          <w:p>
-            <w:pPr>
-              <w:pStyle w:val="Compact"/>
-              <w:jc w:val="left"/>
-            </w:pPr>
-            <w:r>
-              <w:rPr>
-                <w:b/>
-                <w:bCs/>
-              </w:rPr>
-              <w:t xml:space="preserve">Stage</w:t>
-            </w:r>
-          </w:p>
-        </w:tc>
-        <w:tc>
-          <w:tcPr/>
-          <w:p>
-            <w:pPr>
-              <w:pStyle w:val="Compact"/>
-              <w:jc w:val="left"/>
-            </w:pPr>
-            <w:r>
-              <w:rPr>
-                <w:b/>
-                <w:bCs/>
-              </w:rPr>
-              <w:t xml:space="preserve">Condition</w:t>
-            </w:r>
-          </w:p>
-        </w:tc>
-        <w:tc>
-          <w:tcPr/>
-          <w:p>
-            <w:pPr>
-              <w:pStyle w:val="Compact"/>
-              <w:jc w:val="left"/>
-            </w:pPr>
-            <w:r>
-              <w:rPr>
-                <w:b/>
-                <w:bCs/>
-              </w:rPr>
-              <w:t xml:space="preserve">Failure shown as</w:t>
-            </w:r>
-          </w:p>
-        </w:tc>
-      </w:tr>
-      <w:tr>
-        <w:tc>
-          <w:tcPr/>
-          <w:p>
-            <w:pPr>
-              <w:pStyle w:val="Compact"/>
-              <w:jc w:val="left"/>
-            </w:pPr>
-            <w:r>
-              <w:t xml:space="preserve">1. Trigger</w:t>
-            </w:r>
-          </w:p>
-        </w:tc>
-        <w:tc>
-          <w:tcPr/>
-          <w:p>
-            <w:pPr>
-              <w:pStyle w:val="Compact"/>
-              <w:jc w:val="left"/>
-            </w:pPr>
-            <w:r>
-              <w:t xml:space="preserve">Any of the four entry sources fires (see below).</w:t>
-            </w:r>
-          </w:p>
-        </w:tc>
-        <w:tc>
-          <w:tcPr/>
-          <w:p>
-            <w:pPr>
-              <w:pStyle w:val="Compact"/>
-              <w:jc w:val="left"/>
-            </w:pPr>
-            <w:r>
-              <w:t xml:space="preserve">No setup — nothing plotted</w:t>
-            </w:r>
-          </w:p>
-        </w:tc>
-      </w:tr>
-      <w:tr>
-        <w:tc>
-          <w:tcPr/>
-          <w:p>
-            <w:pPr>
-              <w:pStyle w:val="Compact"/>
-              <w:jc w:val="left"/>
-            </w:pPr>
-            <w:r>
-              <w:t xml:space="preserve">2. Filter</w:t>
-            </w:r>
-          </w:p>
-        </w:tc>
-        <w:tc>
-          <w:tcPr/>
-          <w:p>
-            <w:pPr>
-              <w:pStyle w:val="Compact"/>
-              <w:jc w:val="left"/>
-            </w:pPr>
-            <w:r>
-              <w:t xml:space="preserve">VWAP mode satisfied, RSI on the correct side, EMA if enabled.</w:t>
-            </w:r>
-          </w:p>
-        </w:tc>
-        <w:tc>
-          <w:tcPr/>
-          <w:p>
-            <w:pPr>
-              <w:pStyle w:val="Compact"/>
-              <w:jc w:val="left"/>
-            </w:pPr>
-            <w:r>
-              <w:t xml:space="preserve">Blocked: filter</w:t>
-            </w:r>
-          </w:p>
-        </w:tc>
-      </w:tr>
-      <w:tr>
-        <w:tc>
-          <w:tcPr/>
-          <w:p>
-            <w:pPr>
-              <w:pStyle w:val="Compact"/>
-              <w:jc w:val="left"/>
-            </w:pPr>
-            <w:r>
-              <w:t xml:space="preserve">3. Risk</w:t>
-            </w:r>
-          </w:p>
-        </w:tc>
-        <w:tc>
-          <w:tcPr/>
-          <w:p>
-            <w:pPr>
-              <w:pStyle w:val="Compact"/>
-              <w:jc w:val="left"/>
-            </w:pPr>
-            <w:r>
-              <w:t xml:space="preserve">Stop distance is at least 20 points and no more than 70. Wider setups are skipped rather than sized badly.</w:t>
-            </w:r>
-          </w:p>
-        </w:tc>
-        <w:tc>
-          <w:tcPr/>
-          <w:p>
-            <w:pPr>
-              <w:pStyle w:val="Compact"/>
-              <w:jc w:val="left"/>
-            </w:pPr>
-            <w:r>
-              <w:t xml:space="preserve">Blocked: risk</w:t>
-            </w:r>
-          </w:p>
-        </w:tc>
-      </w:tr>
-      <w:tr>
-        <w:tc>
-          <w:tcPr/>
-          <w:p>
-            <w:pPr>
-              <w:pStyle w:val="Compact"/>
-              <w:jc w:val="left"/>
-            </w:pPr>
-            <w:r>
-              <w:t xml:space="preserve">4. Room</w:t>
-            </w:r>
-          </w:p>
-        </w:tc>
-        <w:tc>
-          <w:tcPr/>
-          <w:p>
-            <w:pPr>
-              <w:pStyle w:val="Compact"/>
-              <w:jc w:val="left"/>
-            </w:pPr>
-            <w:r>
-              <w:t xml:space="preserve">Structural-target mode only: at least</w:t>
-            </w:r>
-            <w:r>
-              <w:t xml:space="preserve"> </w:t>
-            </w:r>
-            <w:r>
-              <w:t xml:space="preserve">“Min R:R”</w:t>
-            </w:r>
-            <w:r>
-              <w:t xml:space="preserve"> </w:t>
-            </w:r>
-            <w:r>
-              <w:t xml:space="preserve">of clear space to the next tier.</w:t>
-            </w:r>
-          </w:p>
-        </w:tc>
-        <w:tc>
-          <w:tcPr/>
-          <w:p>
-            <w:pPr>
-              <w:pStyle w:val="Compact"/>
-              <w:jc w:val="left"/>
-            </w:pPr>
-            <w:r>
-              <w:t xml:space="preserve">Blocked: no room</w:t>
-            </w:r>
-          </w:p>
-        </w:tc>
-      </w:tr>
-      <w:tr>
-        <w:tc>
-          <w:tcPr/>
-          <w:p>
-            <w:pPr>
-              <w:pStyle w:val="Compact"/>
-              <w:jc w:val="left"/>
-            </w:pPr>
-            <w:r>
-              <w:t xml:space="preserve">5. Regime</w:t>
-            </w:r>
-          </w:p>
-        </w:tc>
-        <w:tc>
-          <w:tcPr/>
-          <w:p>
-            <w:pPr>
-              <w:pStyle w:val="Compact"/>
-              <w:jc w:val="left"/>
-            </w:pPr>
-            <w:r>
-              <w:t xml:space="preserve">Not inside a Wave (5) lockout; not compressed, if you chose to block entries while compressed.</w:t>
-            </w:r>
-          </w:p>
-        </w:tc>
-        <w:tc>
-          <w:tcPr/>
-          <w:p>
-            <w:pPr>
-              <w:pStyle w:val="Compact"/>
-              <w:jc w:val="left"/>
-            </w:pPr>
-            <w:r>
-              <w:t xml:space="preserve">Blocked: W5 / squeeze</w:t>
-            </w:r>
-          </w:p>
-        </w:tc>
-      </w:tr>
-      <w:tr>
-        <w:tc>
-          <w:tcPr/>
-          <w:p>
-            <w:pPr>
-              <w:pStyle w:val="Compact"/>
-              <w:jc w:val="left"/>
-            </w:pPr>
-            <w:r>
-              <w:t xml:space="preserve">6. Gate</w:t>
-            </w:r>
-          </w:p>
-        </w:tc>
-        <w:tc>
-          <w:tcPr/>
-          <w:p>
-            <w:pPr>
-              <w:pStyle w:val="Compact"/>
-              <w:jc w:val="left"/>
-            </w:pPr>
-            <w:r>
-              <w:t xml:space="preserve">Inside the entry window, under the daily trade limit, no open position, past the cooldown.</w:t>
-            </w:r>
-          </w:p>
-        </w:tc>
-        <w:tc>
-          <w:tcPr/>
-          <w:p>
-            <w:pPr>
-              <w:pStyle w:val="Compact"/>
-              <w:jc w:val="left"/>
-            </w:pPr>
-            <w:r>
-              <w:t xml:space="preserve">Blocked: session/limit</w:t>
-            </w:r>
-          </w:p>
-        </w:tc>
-      </w:tr>
-    </w:tbl>
-    <w:p>
-      <w:pPr>
-        <w:pStyle w:val="BodyText"/>
-      </w:pPr>
-      <w:r>
-        <w:t xml:space="preserve">Stages 2 to 6 mark the bar with a small grey ✕ so you can see, on the chart, exactly where a setup existed and was rejected.</w:t>
-      </w:r>
-    </w:p>
-    <w:bookmarkStart w:id="24" w:name="the-four-entry-sources"/>
-    <w:p>
-      <w:pPr>
-        <w:pStyle w:val="Heading3"/>
-      </w:pPr>
-      <w:r>
-        <w:t xml:space="preserve">The four entry sources</w:t>
-      </w:r>
-    </w:p>
-    <w:p>
-      <w:pPr>
-        <w:pStyle w:val="FirstParagraph"/>
-      </w:pPr>
-      <w:r>
-        <w:t xml:space="preserve">Each carries its own stop anchor, and the source is printed on the entry label so you always know which one fired.</w:t>
+        <w:t xml:space="preserve">OI is the number of contracts outstanding at each strike. Rising OI alone does not say who is trading it — the same rise means fresh writing (a wall) if the premium fell, or fresh buying (a punt) if the premium rose. Each leg is read against its own premium move into one of four actions:</w:t>
       </w:r>
     </w:p>
     <w:tbl>
@@ -2869,7 +2276,7 @@
                 <w:b/>
                 <w:bCs/>
               </w:rPr>
-              <w:t xml:space="preserve">Source</w:t>
+              <w:t xml:space="preserve">Action</w:t>
             </w:r>
           </w:p>
         </w:tc>
@@ -2885,7 +2292,7 @@
                 <w:b/>
                 <w:bCs/>
               </w:rPr>
-              <w:t xml:space="preserve">Trigger</w:t>
+              <w:t xml:space="preserve">OI change</w:t>
             </w:r>
           </w:p>
         </w:tc>
@@ -2901,7 +2308,7 @@
                 <w:b/>
                 <w:bCs/>
               </w:rPr>
-              <w:t xml:space="preserve">Stop anchored at</w:t>
+              <w:t xml:space="preserve">Premium change</w:t>
             </w:r>
           </w:p>
         </w:tc>
@@ -2917,12 +2324,228 @@
                 <w:b/>
                 <w:bCs/>
               </w:rPr>
-              <w:t xml:space="preserve">Type</w:t>
-            </w:r>
-          </w:p>
-        </w:tc>
-      </w:tr>
-      <w:tr>
+              <w:t xml:space="preserve">Meaning</w:t>
+            </w:r>
+          </w:p>
+        </w:tc>
+      </w:tr>
+      <w:tr>
+        <w:tc>
+          <w:tcPr/>
+          <w:p>
+            <w:pPr>
+              <w:pStyle w:val="Compact"/>
+              <w:jc w:val="left"/>
+            </w:pPr>
+            <w:r>
+              <w:t xml:space="preserve">Writing</w:t>
+            </w:r>
+          </w:p>
+        </w:tc>
+        <w:tc>
+          <w:tcPr/>
+          <w:p>
+            <w:pPr>
+              <w:pStyle w:val="Compact"/>
+              <w:jc w:val="left"/>
+            </w:pPr>
+            <w:r>
+              <w:t xml:space="preserve">Up</w:t>
+            </w:r>
+          </w:p>
+        </w:tc>
+        <w:tc>
+          <w:tcPr/>
+          <w:p>
+            <w:pPr>
+              <w:pStyle w:val="Compact"/>
+              <w:jc w:val="left"/>
+            </w:pPr>
+            <w:r>
+              <w:t xml:space="preserve">Down</w:t>
+            </w:r>
+          </w:p>
+        </w:tc>
+        <w:tc>
+          <w:tcPr/>
+          <w:p>
+            <w:pPr>
+              <w:pStyle w:val="Compact"/>
+              <w:jc w:val="left"/>
+            </w:pPr>
+            <w:r>
+              <w:t xml:space="preserve">Fresh sellers — builds a wall (call writing = resistance, put writing = support)</w:t>
+            </w:r>
+          </w:p>
+        </w:tc>
+      </w:tr>
+      <w:tr>
+        <w:tc>
+          <w:tcPr/>
+          <w:p>
+            <w:pPr>
+              <w:pStyle w:val="Compact"/>
+              <w:jc w:val="left"/>
+            </w:pPr>
+            <w:r>
+              <w:t xml:space="preserve">Buildup</w:t>
+            </w:r>
+          </w:p>
+        </w:tc>
+        <w:tc>
+          <w:tcPr/>
+          <w:p>
+            <w:pPr>
+              <w:pStyle w:val="Compact"/>
+              <w:jc w:val="left"/>
+            </w:pPr>
+            <w:r>
+              <w:t xml:space="preserve">Up</w:t>
+            </w:r>
+          </w:p>
+        </w:tc>
+        <w:tc>
+          <w:tcPr/>
+          <w:p>
+            <w:pPr>
+              <w:pStyle w:val="Compact"/>
+              <w:jc w:val="left"/>
+            </w:pPr>
+            <w:r>
+              <w:t xml:space="preserve">Up</w:t>
+            </w:r>
+          </w:p>
+        </w:tc>
+        <w:tc>
+          <w:tcPr/>
+          <w:p>
+            <w:pPr>
+              <w:pStyle w:val="Compact"/>
+              <w:jc w:val="left"/>
+            </w:pPr>
+            <w:r>
+              <w:t xml:space="preserve">Fresh buyers taking a directional punt</w:t>
+            </w:r>
+          </w:p>
+        </w:tc>
+      </w:tr>
+      <w:tr>
+        <w:tc>
+          <w:tcPr/>
+          <w:p>
+            <w:pPr>
+              <w:pStyle w:val="Compact"/>
+              <w:jc w:val="left"/>
+            </w:pPr>
+            <w:r>
+              <w:t xml:space="preserve">Covering</w:t>
+            </w:r>
+          </w:p>
+        </w:tc>
+        <w:tc>
+          <w:tcPr/>
+          <w:p>
+            <w:pPr>
+              <w:pStyle w:val="Compact"/>
+              <w:jc w:val="left"/>
+            </w:pPr>
+            <w:r>
+              <w:t xml:space="preserve">Down</w:t>
+            </w:r>
+          </w:p>
+        </w:tc>
+        <w:tc>
+          <w:tcPr/>
+          <w:p>
+            <w:pPr>
+              <w:pStyle w:val="Compact"/>
+              <w:jc w:val="left"/>
+            </w:pPr>
+            <w:r>
+              <w:t xml:space="preserve">Up</w:t>
+            </w:r>
+          </w:p>
+        </w:tc>
+        <w:tc>
+          <w:tcPr/>
+          <w:p>
+            <w:pPr>
+              <w:pStyle w:val="Compact"/>
+              <w:jc w:val="left"/>
+            </w:pPr>
+            <w:r>
+              <w:t xml:space="preserve">Writers buying back — the wall is being removed</w:t>
+            </w:r>
+          </w:p>
+        </w:tc>
+      </w:tr>
+      <w:tr>
+        <w:tc>
+          <w:tcPr/>
+          <w:p>
+            <w:pPr>
+              <w:pStyle w:val="Compact"/>
+              <w:jc w:val="left"/>
+            </w:pPr>
+            <w:r>
+              <w:t xml:space="preserve">Unwinding</w:t>
+            </w:r>
+          </w:p>
+        </w:tc>
+        <w:tc>
+          <w:tcPr/>
+          <w:p>
+            <w:pPr>
+              <w:pStyle w:val="Compact"/>
+              <w:jc w:val="left"/>
+            </w:pPr>
+            <w:r>
+              <w:t xml:space="preserve">Down</w:t>
+            </w:r>
+          </w:p>
+        </w:tc>
+        <w:tc>
+          <w:tcPr/>
+          <w:p>
+            <w:pPr>
+              <w:pStyle w:val="Compact"/>
+              <w:jc w:val="left"/>
+            </w:pPr>
+            <w:r>
+              <w:t xml:space="preserve">Down</w:t>
+            </w:r>
+          </w:p>
+        </w:tc>
+        <w:tc>
+          <w:tcPr/>
+          <w:p>
+            <w:pPr>
+              <w:pStyle w:val="Compact"/>
+              <w:jc w:val="left"/>
+            </w:pPr>
+            <w:r>
+              <w:t xml:space="preserve">Longs closing out</w:t>
+            </w:r>
+          </w:p>
+        </w:tc>
+      </w:tr>
+    </w:tbl>
+    <w:p/>
+    <w:tbl>
+      <w:tblPr>
+        <w:tblStyle w:val="Table"/>
+        <w:tblW w:type="pct" w:w="5000"/>
+        <w:tblLayout w:type="fixed"/>
+        <w:tblLook w:firstRow="1" w:lastRow="0" w:firstColumn="0" w:lastColumn="0" w:noHBand="0" w:noVBand="0" w:val="0020"/>
+      </w:tblPr>
+      <w:tblGrid>
+        <w:gridCol w:w="3960"/>
+        <w:gridCol w:w="3960"/>
+      </w:tblGrid>
+      <w:tr>
+        <w:trPr>
+          <w:tblHeader w:val="on"/>
+        </w:trPr>
         <w:tc>
           <w:tcPr/>
           <w:p>
@@ -2932,50 +2555,13 @@
             </w:pPr>
             <w:r>
               <w:rPr>
-                <w:rStyle w:val="VerbatimChar"/>
+                <w:b/>
+                <w:bCs/>
               </w:rPr>
-              <w:t xml:space="preserve">zone</w:t>
-            </w:r>
-          </w:p>
-        </w:tc>
-        <w:tc>
-          <w:tcPr/>
-          <w:p>
-            <w:pPr>
-              <w:pStyle w:val="Compact"/>
-              <w:jc w:val="left"/>
-            </w:pPr>
-            <w:r>
-              <w:t xml:space="preserve">Price wicks into a zone and closes back out with a candle in the right direction</w:t>
-            </w:r>
-          </w:p>
-        </w:tc>
-        <w:tc>
-          <w:tcPr/>
-          <w:p>
-            <w:pPr>
-              <w:pStyle w:val="Compact"/>
-              <w:jc w:val="left"/>
-            </w:pPr>
-            <w:r>
-              <w:t xml:space="preserve">Far edge of the zone</w:t>
-            </w:r>
-          </w:p>
-        </w:tc>
-        <w:tc>
-          <w:tcPr/>
-          <w:p>
-            <w:pPr>
-              <w:pStyle w:val="Compact"/>
-              <w:jc w:val="left"/>
-            </w:pPr>
-            <w:r>
-              <w:t xml:space="preserve">Reversion</w:t>
-            </w:r>
-          </w:p>
-        </w:tc>
-      </w:tr>
-      <w:tr>
+              <w:t xml:space="preserve">Reading</w:t>
+            </w:r>
+          </w:p>
+        </w:tc>
         <w:tc>
           <w:tcPr/>
           <w:p>
@@ -2985,151 +2571,179 @@
             </w:pPr>
             <w:r>
               <w:rPr>
-                <w:rStyle w:val="VerbatimChar"/>
+                <w:b/>
+                <w:bCs/>
               </w:rPr>
-              <w:t xml:space="preserve">level</w:t>
-            </w:r>
-          </w:p>
-        </w:tc>
-        <w:tc>
-          <w:tcPr/>
-          <w:p>
-            <w:pPr>
-              <w:pStyle w:val="Compact"/>
-              <w:jc w:val="left"/>
-            </w:pPr>
-            <w:r>
-              <w:t xml:space="preserve">Price bounces off an unbroken BankNifty cross-index level</w:t>
-            </w:r>
-          </w:p>
-        </w:tc>
-        <w:tc>
-          <w:tcPr/>
-          <w:p>
-            <w:pPr>
-              <w:pStyle w:val="Compact"/>
-              <w:jc w:val="left"/>
-            </w:pPr>
-            <w:r>
-              <w:t xml:space="preserve">The level</w:t>
-            </w:r>
-          </w:p>
-        </w:tc>
-        <w:tc>
-          <w:tcPr/>
-          <w:p>
-            <w:pPr>
-              <w:pStyle w:val="Compact"/>
-              <w:jc w:val="left"/>
-            </w:pPr>
-            <w:r>
-              <w:t xml:space="preserve">Reversion</w:t>
-            </w:r>
-          </w:p>
-        </w:tc>
-      </w:tr>
-      <w:tr>
-        <w:tc>
-          <w:tcPr/>
-          <w:p>
-            <w:pPr>
-              <w:pStyle w:val="Compact"/>
-              <w:jc w:val="left"/>
-            </w:pPr>
-            <w:r>
-              <w:rPr>
-                <w:rStyle w:val="VerbatimChar"/>
-              </w:rPr>
-              <w:t xml:space="preserve">4-flag</w:t>
-            </w:r>
-          </w:p>
-        </w:tc>
-        <w:tc>
-          <w:tcPr/>
-          <w:p>
-            <w:pPr>
-              <w:pStyle w:val="Compact"/>
-              <w:jc w:val="left"/>
-            </w:pPr>
-            <w:r>
-              <w:t xml:space="preserve">A fourth consecutive same-direction body extends an isolated run</w:t>
-            </w:r>
-          </w:p>
-        </w:tc>
-        <w:tc>
-          <w:tcPr/>
-          <w:p>
-            <w:pPr>
-              <w:pStyle w:val="Compact"/>
-              <w:jc w:val="left"/>
-            </w:pPr>
-            <w:r>
-              <w:t xml:space="preserve">Extreme of the last 4 bars</w:t>
-            </w:r>
-          </w:p>
-        </w:tc>
-        <w:tc>
-          <w:tcPr/>
-          <w:p>
-            <w:pPr>
-              <w:pStyle w:val="Compact"/>
-              <w:jc w:val="left"/>
-            </w:pPr>
-            <w:r>
-              <w:t xml:space="preserve">Continuation</w:t>
-            </w:r>
-          </w:p>
-        </w:tc>
-      </w:tr>
-      <w:tr>
-        <w:tc>
-          <w:tcPr/>
-          <w:p>
-            <w:pPr>
-              <w:pStyle w:val="Compact"/>
-              <w:jc w:val="left"/>
-            </w:pPr>
-            <w:r>
-              <w:rPr>
-                <w:rStyle w:val="VerbatimChar"/>
-              </w:rPr>
-              <w:t xml:space="preserve">absorb</w:t>
-            </w:r>
-          </w:p>
-        </w:tc>
-        <w:tc>
-          <w:tcPr/>
-          <w:p>
-            <w:pPr>
-              <w:pStyle w:val="Compact"/>
-              <w:jc w:val="left"/>
-            </w:pPr>
-            <w:r>
-              <w:t xml:space="preserve">Absorption wick at the day’s base or ceiling, on the right side of VWAP</w:t>
-            </w:r>
-          </w:p>
-        </w:tc>
-        <w:tc>
-          <w:tcPr/>
-          <w:p>
-            <w:pPr>
-              <w:pStyle w:val="Compact"/>
-              <w:jc w:val="left"/>
-            </w:pPr>
-            <w:r>
-              <w:t xml:space="preserve">The bar’s own extreme</w:t>
-            </w:r>
-          </w:p>
-        </w:tc>
-        <w:tc>
-          <w:tcPr/>
-          <w:p>
-            <w:pPr>
-              <w:pStyle w:val="Compact"/>
-              <w:jc w:val="left"/>
-            </w:pPr>
-            <w:r>
-              <w:t xml:space="preserve">Reversion</w:t>
+              <w:t xml:space="preserve">Interpretation</w:t>
+            </w:r>
+          </w:p>
+        </w:tc>
+      </w:tr>
+      <w:tr>
+        <w:tc>
+          <w:tcPr/>
+          <w:p>
+            <w:pPr>
+              <w:pStyle w:val="Compact"/>
+              <w:jc w:val="left"/>
+            </w:pPr>
+            <w:r>
+              <w:t xml:space="preserve">Signal column</w:t>
+            </w:r>
+          </w:p>
+        </w:tc>
+        <w:tc>
+          <w:tcPr/>
+          <w:p>
+            <w:pPr>
+              <w:pStyle w:val="Compact"/>
+              <w:jc w:val="left"/>
+            </w:pPr>
+            <w:r>
+              <w:t xml:space="preserve">Whichever leg (CE or PE) moved the most OI at that strike, tagged with its action, e.g. </w:t>
+            </w:r>
+            <w:r>
+              <w:t xml:space="preserve">“CE writing”</w:t>
+            </w:r>
+            <w:r>
+              <w:t xml:space="preserve"> </w:t>
+            </w:r>
+            <w:r>
+              <w:t xml:space="preserve">or</w:t>
+            </w:r>
+            <w:r>
+              <w:t xml:space="preserve"> </w:t>
+            </w:r>
+            <w:r>
+              <w:t xml:space="preserve">“PE covering”</w:t>
+            </w:r>
+          </w:p>
+        </w:tc>
+      </w:tr>
+      <w:tr>
+        <w:tc>
+          <w:tcPr/>
+          <w:p>
+            <w:pPr>
+              <w:pStyle w:val="Compact"/>
+              <w:jc w:val="left"/>
+            </w:pPr>
+            <w:r>
+              <w:t xml:space="preserve">Res / Sup</w:t>
+            </w:r>
+          </w:p>
+        </w:tc>
+        <w:tc>
+          <w:tcPr/>
+          <w:p>
+            <w:pPr>
+              <w:pStyle w:val="Compact"/>
+              <w:jc w:val="left"/>
+            </w:pPr>
+            <w:r>
+              <w:t xml:space="preserve">Strike with the highest total CE / PE open interest, across the whole chain</w:t>
+            </w:r>
+          </w:p>
+        </w:tc>
+      </w:tr>
+      <w:tr>
+        <w:tc>
+          <w:tcPr/>
+          <w:p>
+            <w:pPr>
+              <w:pStyle w:val="Compact"/>
+              <w:jc w:val="left"/>
+            </w:pPr>
+            <w:r>
+              <w:t xml:space="preserve">PCR</w:t>
+            </w:r>
+          </w:p>
+        </w:tc>
+        <w:tc>
+          <w:tcPr/>
+          <w:p>
+            <w:pPr>
+              <w:pStyle w:val="Compact"/>
+              <w:jc w:val="left"/>
+            </w:pPr>
+            <w:r>
+              <w:t xml:space="preserve">Put-call ratio of total OI. Above 1.2 leans bullish, below 0.8 bearish. A blunt measure — use it as background, not a trigger.</w:t>
+            </w:r>
+          </w:p>
+        </w:tc>
+      </w:tr>
+      <w:tr>
+        <w:tc>
+          <w:tcPr/>
+          <w:p>
+            <w:pPr>
+              <w:pStyle w:val="Compact"/>
+              <w:jc w:val="left"/>
+            </w:pPr>
+            <w:r>
+              <w:t xml:space="preserve">Chain bias</w:t>
+            </w:r>
+          </w:p>
+        </w:tc>
+        <w:tc>
+          <w:tcPr/>
+          <w:p>
+            <w:pPr>
+              <w:pStyle w:val="Compact"/>
+              <w:jc w:val="left"/>
+            </w:pPr>
+            <w:r>
+              <w:t xml:space="preserve">Every leg’s action is signed bullish/bearish and weighted by the OI it moved, then summed across the whole chain — not just total OI change — and cross-checked against PCR:</w:t>
+            </w:r>
+            <w:r>
+              <w:t xml:space="preserve"> </w:t>
+            </w:r>
+            <w:r>
+              <w:t xml:space="preserve">“confirmed”</w:t>
+            </w:r>
+            <w:r>
+              <w:t xml:space="preserve"> </w:t>
+            </w:r>
+            <w:r>
+              <w:t xml:space="preserve">when they agree,</w:t>
+            </w:r>
+            <w:r>
+              <w:t xml:space="preserve"> </w:t>
+            </w:r>
+            <w:r>
+              <w:t xml:space="preserve">“PCR disagrees”</w:t>
+            </w:r>
+            <w:r>
+              <w:t xml:space="preserve"> </w:t>
+            </w:r>
+            <w:r>
+              <w:t xml:space="preserve">when they don’t</w:t>
+            </w:r>
+          </w:p>
+        </w:tc>
+      </w:tr>
+      <w:tr>
+        <w:tc>
+          <w:tcPr/>
+          <w:p>
+            <w:pPr>
+              <w:pStyle w:val="Compact"/>
+              <w:jc w:val="left"/>
+            </w:pPr>
+            <w:r>
+              <w:t xml:space="preserve">Buildup (futures)</w:t>
+            </w:r>
+          </w:p>
+        </w:tc>
+        <w:tc>
+          <w:tcPr/>
+          <w:p>
+            <w:pPr>
+              <w:pStyle w:val="Compact"/>
+              <w:jc w:val="left"/>
+            </w:pPr>
+            <w:r>
+              <w:t xml:space="preserve">Futures OI change against the day’s price move: long buildup, short buildup, short covering, or long unwinding</w:t>
             </w:r>
           </w:p>
         </w:tc>
@@ -3140,133 +2754,88 @@
         <w:pStyle w:val="BodyText"/>
       </w:pPr>
       <w:r>
-        <w:t xml:space="preserve">When more than one fires on the same bar the tightest structural stop wins. Any source can be switched off individually under</w:t>
-      </w:r>
-      <w:r>
-        <w:t xml:space="preserve"> </w:t>
-      </w:r>
-      <w:r>
-        <w:t xml:space="preserve">“Entry sources”</w:t>
-      </w:r>
-      <w:r>
-        <w:t xml:space="preserve">.</w:t>
-      </w:r>
-    </w:p>
-    <w:bookmarkEnd w:id="24"/>
-    <w:bookmarkStart w:id="25" w:name="entry-stop-and-target"/>
-    <w:p>
-      <w:pPr>
-        <w:pStyle w:val="Heading3"/>
-      </w:pPr>
-      <w:r>
-        <w:t xml:space="preserve">Entry, stop and target</w:t>
-      </w:r>
-    </w:p>
-    <w:p>
-      <w:pPr>
-        <w:numPr>
-          <w:ilvl w:val="0"/>
-          <w:numId w:val="1003"/>
-        </w:numPr>
-      </w:pPr>
-      <w:r>
-        <w:t xml:space="preserve">Green circle below the bar = buy ATM CE. Red circle above the bar = buy ATM PE. A label names the strike and the source, for example</w:t>
-      </w:r>
-      <w:r>
-        <w:t xml:space="preserve"> </w:t>
-      </w:r>
-      <w:r>
-        <w:t xml:space="preserve">“BUY 23650 CE zone”</w:t>
-      </w:r>
-      <w:r>
-        <w:t xml:space="preserve">.</w:t>
-      </w:r>
-    </w:p>
-    <w:p>
-      <w:pPr>
-        <w:numPr>
-          <w:ilvl w:val="0"/>
-          <w:numId w:val="1003"/>
-        </w:numPr>
-      </w:pPr>
-      <w:r>
-        <w:t xml:space="preserve">Red line = stop loss, placed beyond the structure that was defended, plus half an ATR, then floored at 20 points and capped at 70.</w:t>
-      </w:r>
-    </w:p>
-    <w:p>
-      <w:pPr>
-        <w:numPr>
-          <w:ilvl w:val="0"/>
-          <w:numId w:val="1003"/>
-        </w:numPr>
-      </w:pPr>
-      <w:r>
-        <w:t xml:space="preserve">Black line = target: twice the risk by default, or the next structural tier in</w:t>
-      </w:r>
-      <w:r>
-        <w:t xml:space="preserve"> </w:t>
-      </w:r>
-      <w:r>
-        <w:t xml:space="preserve">“Structure (gap tiers)”</w:t>
-      </w:r>
-      <w:r>
-        <w:t xml:space="preserve"> </w:t>
-      </w:r>
-      <w:r>
-        <w:t xml:space="preserve">mode.</w:t>
-      </w:r>
-    </w:p>
-    <w:p>
-      <w:pPr>
-        <w:numPr>
-          <w:ilvl w:val="0"/>
-          <w:numId w:val="1003"/>
-        </w:numPr>
-      </w:pPr>
-      <w:r>
-        <w:t xml:space="preserve">The SL and target labels also show the expected premium move, calculated from the ATM delta setting. A 30-point index stop at 0.5 delta shows as</w:t>
-      </w:r>
-      <w:r>
-        <w:t xml:space="preserve"> </w:t>
-      </w:r>
-      <w:r>
-        <w:t xml:space="preserve">“prem −15”</w:t>
-      </w:r>
-      <w:r>
-        <w:t xml:space="preserve">.</w:t>
-      </w:r>
-    </w:p>
-    <w:p>
-      <w:pPr>
-        <w:numPr>
-          <w:ilvl w:val="0"/>
-          <w:numId w:val="1003"/>
-        </w:numPr>
-      </w:pPr>
-      <w:r>
-        <w:t xml:space="preserve">Lines extend bar by bar and freeze when hit, tagged TARGET, STOP or SQ-OFF, so scrolling back shows the real outcome of every past signal.</w:t>
-      </w:r>
-    </w:p>
-    <w:p>
-      <w:pPr>
-        <w:numPr>
-          <w:ilvl w:val="0"/>
-          <w:numId w:val="1003"/>
-        </w:numPr>
-      </w:pPr>
-      <w:r>
-        <w:t xml:space="preserve">A bar that spans both stop and target is treated as a stop. Intrabar order is unknowable on a 3-minute candle, so the script never awards itself the gift.</w:t>
-      </w:r>
-    </w:p>
-    <w:bookmarkEnd w:id="25"/>
-    <w:bookmarkEnd w:id="26"/>
-    <w:bookmarkStart w:id="27" w:name="intraday-rules-built-into-the-script"/>
+        <w:t xml:space="preserve">The optional Shark hunting matrix shows this per-leg action for every strike in the window (</w:t>
+      </w:r>
+      <w:r>
+        <w:rPr>
+          <w:rStyle w:val="VerbatimChar"/>
+        </w:rPr>
+        <w:t xml:space="preserve">--shark</w:t>
+      </w:r>
+      <w:r>
+        <w:t xml:space="preserve"> </w:t>
+      </w:r>
+      <w:r>
+        <w:t xml:space="preserve">on the command line, or the</w:t>
+      </w:r>
+      <w:r>
+        <w:t xml:space="preserve"> </w:t>
+      </w:r>
+      <w:r>
+        <w:t xml:space="preserve">“shark”</w:t>
+      </w:r>
+      <w:r>
+        <w:t xml:space="preserve"> </w:t>
+      </w:r>
+      <w:r>
+        <w:t xml:space="preserve">checkbox in the desktop app), plus a net verdict and a PIN/VAC flag: PIN means both legs are genuinely being written (the strike is pinned), VAC means both are shrinking (the walls are coming off).</w:t>
+      </w:r>
+    </w:p>
+    <w:p>
+      <w:pPr>
+        <w:pStyle w:val="BodyText"/>
+      </w:pPr>
+      <w:r>
+        <w:t xml:space="preserve">If your TradingView plan has no NSE F&amp;O OI entitlement,</w:t>
+      </w:r>
+      <w:r>
+        <w:t xml:space="preserve"> </w:t>
+      </w:r>
+      <w:r>
+        <w:rPr>
+          <w:rStyle w:val="VerbatimChar"/>
+        </w:rPr>
+        <w:t xml:space="preserve">oi_chain.py</w:t>
+      </w:r>
+      <w:r>
+        <w:t xml:space="preserve"> </w:t>
+      </w:r>
+      <w:r>
+        <w:t xml:space="preserve">prints the same table from NSE’s public endpoint.</w:t>
+      </w:r>
+      <w:r>
+        <w:t xml:space="preserve"> </w:t>
+      </w:r>
+      <w:r>
+        <w:rPr>
+          <w:rStyle w:val="VerbatimChar"/>
+        </w:rPr>
+        <w:t xml:space="preserve">oi_desktop.py</w:t>
+      </w:r>
+      <w:r>
+        <w:t xml:space="preserve"> </w:t>
+      </w:r>
+      <w:r>
+        <w:t xml:space="preserve">is the same data as a small always-on-top window instead of a terminal dump: pick the symbol (NIFTY/BANKNIFTY/FINNIFTY/MIDCPNIFTY) and expiry, set how many strikes each side of ATM and the auto-refresh interval, and it polls NSE on its own, pausing automatically once the feed’s own timestamp shows the market closed.</w:t>
+      </w:r>
+    </w:p>
+    <w:bookmarkEnd w:id="22"/>
+    <w:bookmarkEnd w:id="23"/>
+    <w:bookmarkStart w:id="26" w:name="how-a-signal-is-produced"/>
     <w:p>
       <w:pPr>
         <w:pStyle w:val="Heading2"/>
       </w:pPr>
       <w:r>
-        <w:t xml:space="preserve">5. Intraday rules built into the script</w:t>
+        <w:t xml:space="preserve">4. How a signal is produced</w:t>
+      </w:r>
+    </w:p>
+    <w:p>
+      <w:pPr>
+        <w:pStyle w:val="FirstParagraph"/>
+      </w:pPr>
+      <w:r>
+        <w:t xml:space="preserve">Every bar passes through six stages. A setup must survive all of them to become a circle on the chart. The diagnostic table counts how many setups die at each stage, which is what makes the system debuggable.</w:t>
       </w:r>
     </w:p>
     <w:tbl>
@@ -3297,7 +2866,7 @@
                 <w:b/>
                 <w:bCs/>
               </w:rPr>
-              <w:t xml:space="preserve">Rule</w:t>
+              <w:t xml:space="preserve">Stage</w:t>
             </w:r>
           </w:p>
         </w:tc>
@@ -3313,7 +2882,7 @@
                 <w:b/>
                 <w:bCs/>
               </w:rPr>
-              <w:t xml:space="preserve">Default</w:t>
+              <w:t xml:space="preserve">Condition</w:t>
             </w:r>
           </w:p>
         </w:tc>
@@ -3329,333 +2898,267 @@
                 <w:b/>
                 <w:bCs/>
               </w:rPr>
-              <w:t xml:space="preserve">Why</w:t>
-            </w:r>
-          </w:p>
-        </w:tc>
-      </w:tr>
-      <w:tr>
-        <w:tc>
-          <w:tcPr/>
-          <w:p>
-            <w:pPr>
-              <w:pStyle w:val="Compact"/>
-              <w:jc w:val="left"/>
-            </w:pPr>
-            <w:r>
-              <w:t xml:space="preserve">Entry window</w:t>
-            </w:r>
-          </w:p>
-        </w:tc>
-        <w:tc>
-          <w:tcPr/>
-          <w:p>
-            <w:pPr>
-              <w:pStyle w:val="Compact"/>
-              <w:jc w:val="left"/>
-            </w:pPr>
-            <w:r>
-              <w:t xml:space="preserve">09:20 – 15:00</w:t>
-            </w:r>
-          </w:p>
-        </w:tc>
-        <w:tc>
-          <w:tcPr/>
-          <w:p>
-            <w:pPr>
-              <w:pStyle w:val="Compact"/>
-              <w:jc w:val="left"/>
-            </w:pPr>
-            <w:r>
-              <w:t xml:space="preserve">Avoids the opening auction noise and gives a late trade room to work</w:t>
-            </w:r>
-          </w:p>
-        </w:tc>
-      </w:tr>
-      <w:tr>
-        <w:tc>
-          <w:tcPr/>
-          <w:p>
-            <w:pPr>
-              <w:pStyle w:val="Compact"/>
-              <w:jc w:val="left"/>
-            </w:pPr>
-            <w:r>
-              <w:t xml:space="preserve">Expiry-day entry cut-off</w:t>
-            </w:r>
-          </w:p>
-        </w:tc>
-        <w:tc>
-          <w:tcPr/>
-          <w:p>
-            <w:pPr>
-              <w:pStyle w:val="Compact"/>
-              <w:jc w:val="left"/>
-            </w:pPr>
-            <w:r>
-              <w:t xml:space="preserve">13:00</w:t>
-            </w:r>
-          </w:p>
-        </w:tc>
-        <w:tc>
-          <w:tcPr/>
-          <w:p>
-            <w:pPr>
-              <w:pStyle w:val="Compact"/>
-              <w:jc w:val="left"/>
-            </w:pPr>
-            <w:r>
-              <w:t xml:space="preserve">Premium decay and gamma make afternoon expiry entries unsuitable for a 3-minute reversion system</w:t>
-            </w:r>
-          </w:p>
-        </w:tc>
-      </w:tr>
-      <w:tr>
-        <w:tc>
-          <w:tcPr/>
-          <w:p>
-            <w:pPr>
-              <w:pStyle w:val="Compact"/>
-              <w:jc w:val="left"/>
-            </w:pPr>
-            <w:r>
-              <w:t xml:space="preserve">Square-off</w:t>
-            </w:r>
-          </w:p>
-        </w:tc>
-        <w:tc>
-          <w:tcPr/>
-          <w:p>
-            <w:pPr>
-              <w:pStyle w:val="Compact"/>
-              <w:jc w:val="left"/>
-            </w:pPr>
-            <w:r>
-              <w:t xml:space="preserve">15:15 – 15:30</w:t>
-            </w:r>
-          </w:p>
-        </w:tc>
-        <w:tc>
-          <w:tcPr/>
-          <w:p>
-            <w:pPr>
-              <w:pStyle w:val="Compact"/>
-              <w:jc w:val="left"/>
-            </w:pPr>
-            <w:r>
-              <w:t xml:space="preserve">Every position is closed; nothing is carried overnight</w:t>
-            </w:r>
-          </w:p>
-        </w:tc>
-      </w:tr>
-      <w:tr>
-        <w:tc>
-          <w:tcPr/>
-          <w:p>
-            <w:pPr>
-              <w:pStyle w:val="Compact"/>
-              <w:jc w:val="left"/>
-            </w:pPr>
-            <w:r>
-              <w:t xml:space="preserve">Max trades per day</w:t>
-            </w:r>
-          </w:p>
-        </w:tc>
-        <w:tc>
-          <w:tcPr/>
-          <w:p>
-            <w:pPr>
-              <w:pStyle w:val="Compact"/>
-              <w:jc w:val="left"/>
-            </w:pPr>
-            <w:r>
-              <w:t xml:space="preserve">3</w:t>
-            </w:r>
-          </w:p>
-        </w:tc>
-        <w:tc>
-          <w:tcPr/>
-          <w:p>
-            <w:pPr>
-              <w:pStyle w:val="Compact"/>
-              <w:jc w:val="left"/>
-            </w:pPr>
-            <w:r>
-              <w:t xml:space="preserve">Prevents revenge-trading a bad session</w:t>
-            </w:r>
-          </w:p>
-        </w:tc>
-      </w:tr>
-      <w:tr>
-        <w:tc>
-          <w:tcPr/>
-          <w:p>
-            <w:pPr>
-              <w:pStyle w:val="Compact"/>
-              <w:jc w:val="left"/>
-            </w:pPr>
-            <w:r>
-              <w:t xml:space="preserve">Cooldown</w:t>
-            </w:r>
-          </w:p>
-        </w:tc>
-        <w:tc>
-          <w:tcPr/>
-          <w:p>
-            <w:pPr>
-              <w:pStyle w:val="Compact"/>
-              <w:jc w:val="left"/>
-            </w:pPr>
-            <w:r>
-              <w:t xml:space="preserve">6 bars</w:t>
-            </w:r>
-          </w:p>
-        </w:tc>
-        <w:tc>
-          <w:tcPr/>
-          <w:p>
-            <w:pPr>
-              <w:pStyle w:val="Compact"/>
-              <w:jc w:val="left"/>
-            </w:pPr>
-            <w:r>
-              <w:t xml:space="preserve">Stops clustered signals in the same move</w:t>
-            </w:r>
-          </w:p>
-        </w:tc>
-      </w:tr>
-      <w:tr>
-        <w:tc>
-          <w:tcPr/>
-          <w:p>
-            <w:pPr>
-              <w:pStyle w:val="Compact"/>
-              <w:jc w:val="left"/>
-            </w:pPr>
-            <w:r>
-              <w:t xml:space="preserve">One position at a time</w:t>
-            </w:r>
-          </w:p>
-        </w:tc>
-        <w:tc>
-          <w:tcPr/>
-          <w:p>
-            <w:pPr>
-              <w:pStyle w:val="Compact"/>
-              <w:jc w:val="left"/>
-            </w:pPr>
-            <w:r>
-              <w:t xml:space="preserve">Enforced</w:t>
-            </w:r>
-          </w:p>
-        </w:tc>
-        <w:tc>
-          <w:tcPr/>
-          <w:p>
-            <w:pPr>
-              <w:pStyle w:val="Compact"/>
-              <w:jc w:val="left"/>
-            </w:pPr>
-            <w:r>
-              <w:t xml:space="preserve">No pyramiding, no hedging confusion</w:t>
-            </w:r>
-          </w:p>
-        </w:tc>
-      </w:tr>
-      <w:tr>
-        <w:tc>
-          <w:tcPr/>
-          <w:p>
-            <w:pPr>
-              <w:pStyle w:val="Compact"/>
-              <w:jc w:val="left"/>
-            </w:pPr>
-            <w:r>
-              <w:t xml:space="preserve">Wave (5) lockout</w:t>
-            </w:r>
-          </w:p>
-        </w:tc>
-        <w:tc>
-          <w:tcPr/>
-          <w:p>
-            <w:pPr>
-              <w:pStyle w:val="Compact"/>
-              <w:jc w:val="left"/>
-            </w:pPr>
-            <w:r>
-              <w:t xml:space="preserve">8 bars</w:t>
-            </w:r>
-          </w:p>
-        </w:tc>
-        <w:tc>
-          <w:tcPr/>
-          <w:p>
-            <w:pPr>
-              <w:pStyle w:val="Compact"/>
-              <w:jc w:val="left"/>
-            </w:pPr>
-            <w:r>
-              <w:t xml:space="preserve">Stops you buying the top of an exhausted leg</w:t>
-            </w:r>
-          </w:p>
-        </w:tc>
-      </w:tr>
-      <w:tr>
-        <w:tc>
-          <w:tcPr/>
-          <w:p>
-            <w:pPr>
-              <w:pStyle w:val="Compact"/>
-              <w:jc w:val="left"/>
-            </w:pPr>
-            <w:r>
-              <w:t xml:space="preserve">Levels cleared each morning</w:t>
-            </w:r>
-          </w:p>
-        </w:tc>
-        <w:tc>
-          <w:tcPr/>
-          <w:p>
-            <w:pPr>
-              <w:pStyle w:val="Compact"/>
-              <w:jc w:val="left"/>
-            </w:pPr>
-            <w:r>
-              <w:t xml:space="preserve">On</w:t>
-            </w:r>
-          </w:p>
-        </w:tc>
-        <w:tc>
-          <w:tcPr/>
-          <w:p>
-            <w:pPr>
-              <w:pStyle w:val="Compact"/>
-              <w:jc w:val="left"/>
-            </w:pPr>
-            <w:r>
-              <w:t xml:space="preserve">Yesterday’s BankNifty pivots do not leak into today</w:t>
+              <w:t xml:space="preserve">Failure shown as</w:t>
+            </w:r>
+          </w:p>
+        </w:tc>
+      </w:tr>
+      <w:tr>
+        <w:tc>
+          <w:tcPr/>
+          <w:p>
+            <w:pPr>
+              <w:pStyle w:val="Compact"/>
+              <w:jc w:val="left"/>
+            </w:pPr>
+            <w:r>
+              <w:t xml:space="preserve">1. Trigger</w:t>
+            </w:r>
+          </w:p>
+        </w:tc>
+        <w:tc>
+          <w:tcPr/>
+          <w:p>
+            <w:pPr>
+              <w:pStyle w:val="Compact"/>
+              <w:jc w:val="left"/>
+            </w:pPr>
+            <w:r>
+              <w:t xml:space="preserve">Any of the four entry sources fires (see below).</w:t>
+            </w:r>
+          </w:p>
+        </w:tc>
+        <w:tc>
+          <w:tcPr/>
+          <w:p>
+            <w:pPr>
+              <w:pStyle w:val="Compact"/>
+              <w:jc w:val="left"/>
+            </w:pPr>
+            <w:r>
+              <w:t xml:space="preserve">No setup — nothing plotted</w:t>
+            </w:r>
+          </w:p>
+        </w:tc>
+      </w:tr>
+      <w:tr>
+        <w:tc>
+          <w:tcPr/>
+          <w:p>
+            <w:pPr>
+              <w:pStyle w:val="Compact"/>
+              <w:jc w:val="left"/>
+            </w:pPr>
+            <w:r>
+              <w:t xml:space="preserve">2. Filter</w:t>
+            </w:r>
+          </w:p>
+        </w:tc>
+        <w:tc>
+          <w:tcPr/>
+          <w:p>
+            <w:pPr>
+              <w:pStyle w:val="Compact"/>
+              <w:jc w:val="left"/>
+            </w:pPr>
+            <w:r>
+              <w:t xml:space="preserve">VWAP mode satisfied, RSI on the correct side, EMA if enabled.</w:t>
+            </w:r>
+          </w:p>
+        </w:tc>
+        <w:tc>
+          <w:tcPr/>
+          <w:p>
+            <w:pPr>
+              <w:pStyle w:val="Compact"/>
+              <w:jc w:val="left"/>
+            </w:pPr>
+            <w:r>
+              <w:t xml:space="preserve">Blocked: filter</w:t>
+            </w:r>
+          </w:p>
+        </w:tc>
+      </w:tr>
+      <w:tr>
+        <w:tc>
+          <w:tcPr/>
+          <w:p>
+            <w:pPr>
+              <w:pStyle w:val="Compact"/>
+              <w:jc w:val="left"/>
+            </w:pPr>
+            <w:r>
+              <w:t xml:space="preserve">3. Risk</w:t>
+            </w:r>
+          </w:p>
+        </w:tc>
+        <w:tc>
+          <w:tcPr/>
+          <w:p>
+            <w:pPr>
+              <w:pStyle w:val="Compact"/>
+              <w:jc w:val="left"/>
+            </w:pPr>
+            <w:r>
+              <w:t xml:space="preserve">Stop distance is at least 20 points and no more than 70. Wider setups are skipped rather than sized badly.</w:t>
+            </w:r>
+          </w:p>
+        </w:tc>
+        <w:tc>
+          <w:tcPr/>
+          <w:p>
+            <w:pPr>
+              <w:pStyle w:val="Compact"/>
+              <w:jc w:val="left"/>
+            </w:pPr>
+            <w:r>
+              <w:t xml:space="preserve">Blocked: risk</w:t>
+            </w:r>
+          </w:p>
+        </w:tc>
+      </w:tr>
+      <w:tr>
+        <w:tc>
+          <w:tcPr/>
+          <w:p>
+            <w:pPr>
+              <w:pStyle w:val="Compact"/>
+              <w:jc w:val="left"/>
+            </w:pPr>
+            <w:r>
+              <w:t xml:space="preserve">4. Room</w:t>
+            </w:r>
+          </w:p>
+        </w:tc>
+        <w:tc>
+          <w:tcPr/>
+          <w:p>
+            <w:pPr>
+              <w:pStyle w:val="Compact"/>
+              <w:jc w:val="left"/>
+            </w:pPr>
+            <w:r>
+              <w:t xml:space="preserve">Structural-target mode only: at least</w:t>
+            </w:r>
+            <w:r>
+              <w:t xml:space="preserve"> </w:t>
+            </w:r>
+            <w:r>
+              <w:t xml:space="preserve">“Min R:R”</w:t>
+            </w:r>
+            <w:r>
+              <w:t xml:space="preserve"> </w:t>
+            </w:r>
+            <w:r>
+              <w:t xml:space="preserve">of clear space to the next tier.</w:t>
+            </w:r>
+          </w:p>
+        </w:tc>
+        <w:tc>
+          <w:tcPr/>
+          <w:p>
+            <w:pPr>
+              <w:pStyle w:val="Compact"/>
+              <w:jc w:val="left"/>
+            </w:pPr>
+            <w:r>
+              <w:t xml:space="preserve">Blocked: no room</w:t>
+            </w:r>
+          </w:p>
+        </w:tc>
+      </w:tr>
+      <w:tr>
+        <w:tc>
+          <w:tcPr/>
+          <w:p>
+            <w:pPr>
+              <w:pStyle w:val="Compact"/>
+              <w:jc w:val="left"/>
+            </w:pPr>
+            <w:r>
+              <w:t xml:space="preserve">5. Regime</w:t>
+            </w:r>
+          </w:p>
+        </w:tc>
+        <w:tc>
+          <w:tcPr/>
+          <w:p>
+            <w:pPr>
+              <w:pStyle w:val="Compact"/>
+              <w:jc w:val="left"/>
+            </w:pPr>
+            <w:r>
+              <w:t xml:space="preserve">Not inside a Wave (5) lockout; not compressed, if you chose to block entries while compressed.</w:t>
+            </w:r>
+          </w:p>
+        </w:tc>
+        <w:tc>
+          <w:tcPr/>
+          <w:p>
+            <w:pPr>
+              <w:pStyle w:val="Compact"/>
+              <w:jc w:val="left"/>
+            </w:pPr>
+            <w:r>
+              <w:t xml:space="preserve">Blocked: W5 / squeeze</w:t>
+            </w:r>
+          </w:p>
+        </w:tc>
+      </w:tr>
+      <w:tr>
+        <w:tc>
+          <w:tcPr/>
+          <w:p>
+            <w:pPr>
+              <w:pStyle w:val="Compact"/>
+              <w:jc w:val="left"/>
+            </w:pPr>
+            <w:r>
+              <w:t xml:space="preserve">6. Gate</w:t>
+            </w:r>
+          </w:p>
+        </w:tc>
+        <w:tc>
+          <w:tcPr/>
+          <w:p>
+            <w:pPr>
+              <w:pStyle w:val="Compact"/>
+              <w:jc w:val="left"/>
+            </w:pPr>
+            <w:r>
+              <w:t xml:space="preserve">Inside the entry window, under the daily trade limit, no open position, past the cooldown.</w:t>
+            </w:r>
+          </w:p>
+        </w:tc>
+        <w:tc>
+          <w:tcPr/>
+          <w:p>
+            <w:pPr>
+              <w:pStyle w:val="Compact"/>
+              <w:jc w:val="left"/>
+            </w:pPr>
+            <w:r>
+              <w:t xml:space="preserve">Blocked: session/limit</w:t>
             </w:r>
           </w:p>
         </w:tc>
       </w:tr>
     </w:tbl>
-    <w:bookmarkEnd w:id="27"/>
-    <w:bookmarkStart w:id="31" w:name="reading-the-two-tables"/>
-    <w:p>
-      <w:pPr>
-        <w:pStyle w:val="Heading2"/>
-      </w:pPr>
-      <w:r>
-        <w:t xml:space="preserve">6. Reading the two tables</w:t>
-      </w:r>
-    </w:p>
-    <w:bookmarkStart w:id="28" w:name="today-top-right"/>
+    <w:p>
+      <w:pPr>
+        <w:pStyle w:val="BodyText"/>
+      </w:pPr>
+      <w:r>
+        <w:t xml:space="preserve">Stages 2 to 6 mark the bar with a small grey ✕ so you can see, on the chart, exactly where a setup existed and was rejected.</w:t>
+      </w:r>
+    </w:p>
+    <w:bookmarkStart w:id="24" w:name="the-four-entry-sources"/>
     <w:p>
       <w:pPr>
         <w:pStyle w:val="Heading3"/>
       </w:pPr>
       <w:r>
-        <w:t xml:space="preserve">Today (top right)</w:t>
+        <w:t xml:space="preserve">The four entry sources</w:t>
       </w:r>
     </w:p>
     <w:p>
@@ -3663,7 +3166,7 @@
         <w:pStyle w:val="FirstParagraph"/>
       </w:pPr>
       <w:r>
-        <w:t xml:space="preserve">Trades taken versus the daily limit, wins, losses, net index points, an estimated rupee figure using your lot size, and the current ATM strike. On expiry day the ATM cell is flagged in red. Below that:</w:t>
+        <w:t xml:space="preserve">Each carries its own stop anchor, and the source is printed on the entry label so you always know which one fired.</w:t>
       </w:r>
     </w:p>
     <w:tbl>
@@ -3674,8 +3177,10 @@
         <w:tblLook w:firstRow="1" w:lastRow="0" w:firstColumn="0" w:lastColumn="0" w:noHBand="0" w:noVBand="0" w:val="0020"/>
       </w:tblPr>
       <w:tblGrid>
-        <w:gridCol w:w="3960"/>
-        <w:gridCol w:w="3960"/>
+        <w:gridCol w:w="1980"/>
+        <w:gridCol w:w="1980"/>
+        <w:gridCol w:w="1980"/>
+        <w:gridCol w:w="1980"/>
       </w:tblGrid>
       <w:tr>
         <w:trPr>
@@ -3693,7 +3198,7 @@
                 <w:b/>
                 <w:bCs/>
               </w:rPr>
-              <w:t xml:space="preserve">Row</w:t>
+              <w:t xml:space="preserve">Source</w:t>
             </w:r>
           </w:p>
         </w:tc>
@@ -3709,100 +3214,251 @@
                 <w:b/>
                 <w:bCs/>
               </w:rPr>
-              <w:t xml:space="preserve">What it tells you</w:t>
-            </w:r>
-          </w:p>
-        </w:tc>
-      </w:tr>
-      <w:tr>
-        <w:tc>
-          <w:tcPr/>
-          <w:p>
-            <w:pPr>
-              <w:pStyle w:val="Compact"/>
-              <w:jc w:val="left"/>
-            </w:pPr>
-            <w:r>
-              <w:t xml:space="preserve">VIX</w:t>
-            </w:r>
-          </w:p>
-        </w:tc>
-        <w:tc>
-          <w:tcPr/>
-          <w:p>
-            <w:pPr>
-              <w:pStyle w:val="Compact"/>
-              <w:jc w:val="left"/>
-            </w:pPr>
-            <w:r>
-              <w:t xml:space="preserve">India VIX, coloured green / orange / red by regime</w:t>
-            </w:r>
-          </w:p>
-        </w:tc>
-      </w:tr>
-      <w:tr>
-        <w:tc>
-          <w:tcPr/>
-          <w:p>
-            <w:pPr>
-              <w:pStyle w:val="Compact"/>
-              <w:jc w:val="left"/>
-            </w:pPr>
-            <w:r>
-              <w:t xml:space="preserve">Regime</w:t>
-            </w:r>
-          </w:p>
-        </w:tc>
-        <w:tc>
-          <w:tcPr/>
-          <w:p>
-            <w:pPr>
-              <w:pStyle w:val="Compact"/>
-              <w:jc w:val="left"/>
-            </w:pPr>
-            <w:r>
-              <w:t xml:space="preserve">Regime name and the strike selection it implies</w:t>
-            </w:r>
-          </w:p>
-        </w:tc>
-      </w:tr>
-      <w:tr>
-        <w:tc>
-          <w:tcPr/>
-          <w:p>
-            <w:pPr>
-              <w:pStyle w:val="Compact"/>
-              <w:jc w:val="left"/>
-            </w:pPr>
-            <w:r>
-              <w:t xml:space="preserve">Phase</w:t>
-            </w:r>
-          </w:p>
-        </w:tc>
-        <w:tc>
-          <w:tcPr/>
-          <w:p>
-            <w:pPr>
-              <w:pStyle w:val="Compact"/>
-              <w:jc w:val="left"/>
-            </w:pPr>
-            <w:r>
-              <w:t xml:space="preserve">The current CAMDC phase.</w:t>
-            </w:r>
-            <w:r>
-              <w:t xml:space="preserve"> </w:t>
-            </w:r>
+              <w:t xml:space="preserve">Trigger</w:t>
+            </w:r>
+          </w:p>
+        </w:tc>
+        <w:tc>
+          <w:tcPr/>
+          <w:p>
+            <w:pPr>
+              <w:pStyle w:val="Compact"/>
+              <w:jc w:val="left"/>
+            </w:pPr>
+            <w:r>
+              <w:rPr>
+                <w:b/>
+                <w:bCs/>
+              </w:rPr>
+              <w:t xml:space="preserve">Stop anchored at</w:t>
+            </w:r>
+          </w:p>
+        </w:tc>
+        <w:tc>
+          <w:tcPr/>
+          <w:p>
+            <w:pPr>
+              <w:pStyle w:val="Compact"/>
+              <w:jc w:val="left"/>
+            </w:pPr>
+            <w:r>
+              <w:rPr>
+                <w:b/>
+                <w:bCs/>
+              </w:rPr>
+              <w:t xml:space="preserve">Type</w:t>
+            </w:r>
+          </w:p>
+        </w:tc>
+      </w:tr>
+      <w:tr>
+        <w:tc>
+          <w:tcPr/>
+          <w:p>
+            <w:pPr>
+              <w:pStyle w:val="Compact"/>
+              <w:jc w:val="left"/>
+            </w:pPr>
             <w:r>
               <w:rPr>
                 <w:rStyle w:val="VerbatimChar"/>
               </w:rPr>
-              <w:t xml:space="preserve">(no vol)</w:t>
-            </w:r>
-            <w:r>
-              <w:t xml:space="preserve"> </w:t>
-            </w:r>
-            <w:r>
-              <w:t xml:space="preserve">means the feed has no volume and the engine is running price-only.</w:t>
+              <w:t xml:space="preserve">zone</w:t>
+            </w:r>
+          </w:p>
+        </w:tc>
+        <w:tc>
+          <w:tcPr/>
+          <w:p>
+            <w:pPr>
+              <w:pStyle w:val="Compact"/>
+              <w:jc w:val="left"/>
+            </w:pPr>
+            <w:r>
+              <w:t xml:space="preserve">Price wicks into a zone and closes back out with a candle in the right direction</w:t>
+            </w:r>
+          </w:p>
+        </w:tc>
+        <w:tc>
+          <w:tcPr/>
+          <w:p>
+            <w:pPr>
+              <w:pStyle w:val="Compact"/>
+              <w:jc w:val="left"/>
+            </w:pPr>
+            <w:r>
+              <w:t xml:space="preserve">Far edge of the zone</w:t>
+            </w:r>
+          </w:p>
+        </w:tc>
+        <w:tc>
+          <w:tcPr/>
+          <w:p>
+            <w:pPr>
+              <w:pStyle w:val="Compact"/>
+              <w:jc w:val="left"/>
+            </w:pPr>
+            <w:r>
+              <w:t xml:space="preserve">Reversion</w:t>
+            </w:r>
+          </w:p>
+        </w:tc>
+      </w:tr>
+      <w:tr>
+        <w:tc>
+          <w:tcPr/>
+          <w:p>
+            <w:pPr>
+              <w:pStyle w:val="Compact"/>
+              <w:jc w:val="left"/>
+            </w:pPr>
+            <w:r>
+              <w:rPr>
+                <w:rStyle w:val="VerbatimChar"/>
+              </w:rPr>
+              <w:t xml:space="preserve">level</w:t>
+            </w:r>
+          </w:p>
+        </w:tc>
+        <w:tc>
+          <w:tcPr/>
+          <w:p>
+            <w:pPr>
+              <w:pStyle w:val="Compact"/>
+              <w:jc w:val="left"/>
+            </w:pPr>
+            <w:r>
+              <w:t xml:space="preserve">Price bounces off an unbroken BankNifty cross-index level</w:t>
+            </w:r>
+          </w:p>
+        </w:tc>
+        <w:tc>
+          <w:tcPr/>
+          <w:p>
+            <w:pPr>
+              <w:pStyle w:val="Compact"/>
+              <w:jc w:val="left"/>
+            </w:pPr>
+            <w:r>
+              <w:t xml:space="preserve">The level</w:t>
+            </w:r>
+          </w:p>
+        </w:tc>
+        <w:tc>
+          <w:tcPr/>
+          <w:p>
+            <w:pPr>
+              <w:pStyle w:val="Compact"/>
+              <w:jc w:val="left"/>
+            </w:pPr>
+            <w:r>
+              <w:t xml:space="preserve">Reversion</w:t>
+            </w:r>
+          </w:p>
+        </w:tc>
+      </w:tr>
+      <w:tr>
+        <w:tc>
+          <w:tcPr/>
+          <w:p>
+            <w:pPr>
+              <w:pStyle w:val="Compact"/>
+              <w:jc w:val="left"/>
+            </w:pPr>
+            <w:r>
+              <w:rPr>
+                <w:rStyle w:val="VerbatimChar"/>
+              </w:rPr>
+              <w:t xml:space="preserve">4-flag</w:t>
+            </w:r>
+          </w:p>
+        </w:tc>
+        <w:tc>
+          <w:tcPr/>
+          <w:p>
+            <w:pPr>
+              <w:pStyle w:val="Compact"/>
+              <w:jc w:val="left"/>
+            </w:pPr>
+            <w:r>
+              <w:t xml:space="preserve">A fourth consecutive same-direction body extends an isolated run</w:t>
+            </w:r>
+          </w:p>
+        </w:tc>
+        <w:tc>
+          <w:tcPr/>
+          <w:p>
+            <w:pPr>
+              <w:pStyle w:val="Compact"/>
+              <w:jc w:val="left"/>
+            </w:pPr>
+            <w:r>
+              <w:t xml:space="preserve">Extreme of the last 4 bars</w:t>
+            </w:r>
+          </w:p>
+        </w:tc>
+        <w:tc>
+          <w:tcPr/>
+          <w:p>
+            <w:pPr>
+              <w:pStyle w:val="Compact"/>
+              <w:jc w:val="left"/>
+            </w:pPr>
+            <w:r>
+              <w:t xml:space="preserve">Continuation</w:t>
+            </w:r>
+          </w:p>
+        </w:tc>
+      </w:tr>
+      <w:tr>
+        <w:tc>
+          <w:tcPr/>
+          <w:p>
+            <w:pPr>
+              <w:pStyle w:val="Compact"/>
+              <w:jc w:val="left"/>
+            </w:pPr>
+            <w:r>
+              <w:rPr>
+                <w:rStyle w:val="VerbatimChar"/>
+              </w:rPr>
+              <w:t xml:space="preserve">absorb</w:t>
+            </w:r>
+          </w:p>
+        </w:tc>
+        <w:tc>
+          <w:tcPr/>
+          <w:p>
+            <w:pPr>
+              <w:pStyle w:val="Compact"/>
+              <w:jc w:val="left"/>
+            </w:pPr>
+            <w:r>
+              <w:t xml:space="preserve">Absorption wick at the day’s base or ceiling, on the right side of VWAP</w:t>
+            </w:r>
+          </w:p>
+        </w:tc>
+        <w:tc>
+          <w:tcPr/>
+          <w:p>
+            <w:pPr>
+              <w:pStyle w:val="Compact"/>
+              <w:jc w:val="left"/>
+            </w:pPr>
+            <w:r>
+              <w:t xml:space="preserve">The bar’s own extreme</w:t>
+            </w:r>
+          </w:p>
+        </w:tc>
+        <w:tc>
+          <w:tcPr/>
+          <w:p>
+            <w:pPr>
+              <w:pStyle w:val="Compact"/>
+              <w:jc w:val="left"/>
+            </w:pPr>
+            <w:r>
+              <w:t xml:space="preserve">Reversion</w:t>
             </w:r>
           </w:p>
         </w:tc>
@@ -3813,89 +3469,133 @@
         <w:pStyle w:val="BodyText"/>
       </w:pPr>
       <w:r>
-        <w:t xml:space="preserve">The Phase row is the fastest read on the chart.</w:t>
-      </w:r>
-      <w:r>
-        <w:t xml:space="preserve"> </w:t>
-      </w:r>
-      <w:r>
-        <w:rPr>
-          <w:b/>
-          <w:bCs/>
-        </w:rPr>
-        <w:t xml:space="preserve">1 Compression</w:t>
-      </w:r>
-      <w:r>
-        <w:t xml:space="preserve"> </w:t>
-      </w:r>
-      <w:r>
-        <w:t xml:space="preserve">and</w:t>
-      </w:r>
-      <w:r>
-        <w:t xml:space="preserve"> </w:t>
-      </w:r>
-      <w:r>
-        <w:rPr>
-          <w:b/>
-          <w:bCs/>
-        </w:rPr>
-        <w:t xml:space="preserve">2 Accumulation</w:t>
-      </w:r>
-      <w:r>
-        <w:t xml:space="preserve"> </w:t>
-      </w:r>
-      <w:r>
-        <w:t xml:space="preserve">are the phases where reversion entries work;</w:t>
-      </w:r>
-      <w:r>
-        <w:t xml:space="preserve"> </w:t>
-      </w:r>
-      <w:r>
-        <w:rPr>
-          <w:b/>
-          <w:bCs/>
-        </w:rPr>
-        <w:t xml:space="preserve">4 Distribution</w:t>
-      </w:r>
-      <w:r>
-        <w:t xml:space="preserve"> </w:t>
-      </w:r>
-      <w:r>
-        <w:t xml:space="preserve">is where the 4-flag continuation entries live;</w:t>
-      </w:r>
-      <w:r>
-        <w:t xml:space="preserve"> </w:t>
-      </w:r>
-      <w:r>
-        <w:rPr>
-          <w:b/>
-          <w:bCs/>
-        </w:rPr>
-        <w:t xml:space="preserve">3 Manipulation</w:t>
-      </w:r>
-      <w:r>
-        <w:t xml:space="preserve"> </w:t>
-      </w:r>
-      <w:r>
-        <w:t xml:space="preserve">is where you get stopped out for no reason.</w:t>
-      </w:r>
-    </w:p>
-    <w:bookmarkEnd w:id="28"/>
-    <w:bookmarkStart w:id="29" w:name="diag-bottom-right"/>
+        <w:t xml:space="preserve">When more than one fires on the same bar the tightest structural stop wins. Any source can be switched off individually under</w:t>
+      </w:r>
+      <w:r>
+        <w:t xml:space="preserve"> </w:t>
+      </w:r>
+      <w:r>
+        <w:t xml:space="preserve">“Entry sources”</w:t>
+      </w:r>
+      <w:r>
+        <w:t xml:space="preserve">.</w:t>
+      </w:r>
+    </w:p>
+    <w:bookmarkEnd w:id="24"/>
+    <w:bookmarkStart w:id="25" w:name="entry-stop-and-target"/>
     <w:p>
       <w:pPr>
         <w:pStyle w:val="Heading3"/>
       </w:pPr>
       <w:r>
-        <w:t xml:space="preserve">DIAG (bottom right)</w:t>
-      </w:r>
-    </w:p>
-    <w:p>
-      <w:pPr>
-        <w:pStyle w:val="FirstParagraph"/>
-      </w:pPr>
-      <w:r>
-        <w:t xml:space="preserve">The troubleshooting panel. Read it top to bottom when a day produced no signals.</w:t>
+        <w:t xml:space="preserve">Entry, stop and target</w:t>
+      </w:r>
+    </w:p>
+    <w:p>
+      <w:pPr>
+        <w:numPr>
+          <w:ilvl w:val="0"/>
+          <w:numId w:val="1003"/>
+        </w:numPr>
+      </w:pPr>
+      <w:r>
+        <w:t xml:space="preserve">Green circle below the bar = buy ATM CE. Red circle above the bar = buy ATM PE. A label names the strike and the source, for example</w:t>
+      </w:r>
+      <w:r>
+        <w:t xml:space="preserve"> </w:t>
+      </w:r>
+      <w:r>
+        <w:t xml:space="preserve">“BUY 23650 CE zone”</w:t>
+      </w:r>
+      <w:r>
+        <w:t xml:space="preserve">.</w:t>
+      </w:r>
+    </w:p>
+    <w:p>
+      <w:pPr>
+        <w:numPr>
+          <w:ilvl w:val="0"/>
+          <w:numId w:val="1003"/>
+        </w:numPr>
+      </w:pPr>
+      <w:r>
+        <w:t xml:space="preserve">Red line = stop loss, placed beyond the structure that was defended, plus half an ATR, then floored at 20 points and capped at 70.</w:t>
+      </w:r>
+    </w:p>
+    <w:p>
+      <w:pPr>
+        <w:numPr>
+          <w:ilvl w:val="0"/>
+          <w:numId w:val="1003"/>
+        </w:numPr>
+      </w:pPr>
+      <w:r>
+        <w:t xml:space="preserve">Black line = target: twice the risk by default, or the next structural tier in</w:t>
+      </w:r>
+      <w:r>
+        <w:t xml:space="preserve"> </w:t>
+      </w:r>
+      <w:r>
+        <w:t xml:space="preserve">“Structure (gap tiers)”</w:t>
+      </w:r>
+      <w:r>
+        <w:t xml:space="preserve"> </w:t>
+      </w:r>
+      <w:r>
+        <w:t xml:space="preserve">mode.</w:t>
+      </w:r>
+    </w:p>
+    <w:p>
+      <w:pPr>
+        <w:numPr>
+          <w:ilvl w:val="0"/>
+          <w:numId w:val="1003"/>
+        </w:numPr>
+      </w:pPr>
+      <w:r>
+        <w:t xml:space="preserve">The SL and target labels also show the expected premium move, calculated from the ATM delta setting. A 30-point index stop at 0.5 delta shows as</w:t>
+      </w:r>
+      <w:r>
+        <w:t xml:space="preserve"> </w:t>
+      </w:r>
+      <w:r>
+        <w:t xml:space="preserve">“prem −15”</w:t>
+      </w:r>
+      <w:r>
+        <w:t xml:space="preserve">.</w:t>
+      </w:r>
+    </w:p>
+    <w:p>
+      <w:pPr>
+        <w:numPr>
+          <w:ilvl w:val="0"/>
+          <w:numId w:val="1003"/>
+        </w:numPr>
+      </w:pPr>
+      <w:r>
+        <w:t xml:space="preserve">Lines extend bar by bar and freeze when hit, tagged TARGET, STOP or SQ-OFF, so scrolling back shows the real outcome of every past signal.</w:t>
+      </w:r>
+    </w:p>
+    <w:p>
+      <w:pPr>
+        <w:numPr>
+          <w:ilvl w:val="0"/>
+          <w:numId w:val="1003"/>
+        </w:numPr>
+      </w:pPr>
+      <w:r>
+        <w:t xml:space="preserve">A bar that spans both stop and target is treated as a stop. Intrabar order is unknowable on a 3-minute candle, so the script never awards itself the gift.</w:t>
+      </w:r>
+    </w:p>
+    <w:bookmarkEnd w:id="25"/>
+    <w:bookmarkEnd w:id="26"/>
+    <w:bookmarkStart w:id="27" w:name="intraday-rules-built-into-the-script"/>
+    <w:p>
+      <w:pPr>
+        <w:pStyle w:val="Heading2"/>
+      </w:pPr>
+      <w:r>
+        <w:t xml:space="preserve">5. Intraday rules built into the script</w:t>
       </w:r>
     </w:p>
     <w:tbl>
@@ -3926,7 +3626,7 @@
                 <w:b/>
                 <w:bCs/>
               </w:rPr>
-              <w:t xml:space="preserve">Row</w:t>
+              <w:t xml:space="preserve">Rule</w:t>
             </w:r>
           </w:p>
         </w:tc>
@@ -3942,7 +3642,7 @@
                 <w:b/>
                 <w:bCs/>
               </w:rPr>
-              <w:t xml:space="preserve">What it tells you</w:t>
+              <w:t xml:space="preserve">Default</w:t>
             </w:r>
           </w:p>
         </w:tc>
@@ -3958,424 +3658,333 @@
                 <w:b/>
                 <w:bCs/>
               </w:rPr>
-              <w:t xml:space="preserve">Action if it looks wrong</w:t>
-            </w:r>
-          </w:p>
-        </w:tc>
-      </w:tr>
-      <w:tr>
-        <w:tc>
-          <w:tcPr/>
-          <w:p>
-            <w:pPr>
-              <w:pStyle w:val="Compact"/>
-              <w:jc w:val="left"/>
-            </w:pPr>
-            <w:r>
-              <w:t xml:space="preserve">Zone touched</w:t>
-            </w:r>
-          </w:p>
-        </w:tc>
-        <w:tc>
-          <w:tcPr/>
-          <w:p>
-            <w:pPr>
-              <w:pStyle w:val="Compact"/>
-              <w:jc w:val="left"/>
-            </w:pPr>
-            <w:r>
-              <w:t xml:space="preserve">How many bars entered a zone today</w:t>
-            </w:r>
-          </w:p>
-        </w:tc>
-        <w:tc>
-          <w:tcPr/>
-          <w:p>
-            <w:pPr>
-              <w:pStyle w:val="Compact"/>
-              <w:jc w:val="left"/>
-            </w:pPr>
-            <w:r>
-              <w:t xml:space="preserve">Zero all day means the zone is out of play — check the next row</w:t>
-            </w:r>
-          </w:p>
-        </w:tc>
-      </w:tr>
-      <w:tr>
-        <w:tc>
-          <w:tcPr/>
-          <w:p>
-            <w:pPr>
-              <w:pStyle w:val="Compact"/>
-              <w:jc w:val="left"/>
-            </w:pPr>
-            <w:r>
-              <w:t xml:space="preserve">Zone dist (ATR)</w:t>
-            </w:r>
-          </w:p>
-        </w:tc>
-        <w:tc>
-          <w:tcPr/>
-          <w:p>
-            <w:pPr>
-              <w:pStyle w:val="Compact"/>
-              <w:jc w:val="left"/>
-            </w:pPr>
-            <w:r>
-              <w:t xml:space="preserve">How far price is from each zone, in ATR. Turns red beyond 4.</w:t>
-            </w:r>
-          </w:p>
-        </w:tc>
-        <w:tc>
-          <w:tcPr/>
-          <w:p>
-            <w:pPr>
-              <w:pStyle w:val="Compact"/>
-              <w:jc w:val="left"/>
-            </w:pPr>
-            <w:r>
-              <w:t xml:space="preserve">Red means a stranded zone. Switch to</w:t>
-            </w:r>
-            <w:r>
-              <w:t xml:space="preserve"> </w:t>
-            </w:r>
-            <w:r>
-              <w:t xml:space="preserve">“Auto (near price)”</w:t>
-            </w:r>
-            <w:r>
-              <w:t xml:space="preserve"> </w:t>
-            </w:r>
-            <w:r>
-              <w:t xml:space="preserve">mode.</w:t>
-            </w:r>
-          </w:p>
-        </w:tc>
-      </w:tr>
-      <w:tr>
-        <w:tc>
-          <w:tcPr/>
-          <w:p>
-            <w:pPr>
-              <w:pStyle w:val="Compact"/>
-              <w:jc w:val="left"/>
-            </w:pPr>
-            <w:r>
-              <w:t xml:space="preserve">Setups found</w:t>
-            </w:r>
-          </w:p>
-        </w:tc>
-        <w:tc>
-          <w:tcPr/>
-          <w:p>
-            <w:pPr>
-              <w:pStyle w:val="Compact"/>
-              <w:jc w:val="left"/>
-            </w:pPr>
-            <w:r>
-              <w:t xml:space="preserve">Triggers that fired before filtering</w:t>
-            </w:r>
-          </w:p>
-        </w:tc>
-        <w:tc>
-          <w:tcPr/>
-          <w:p>
-            <w:pPr>
-              <w:pStyle w:val="Compact"/>
-              <w:jc w:val="left"/>
-            </w:pPr>
-            <w:r>
-              <w:t xml:space="preserve">Zero with touches above means the rejection test is too strict — set rejection to Loose</w:t>
-            </w:r>
-          </w:p>
-        </w:tc>
-      </w:tr>
-      <w:tr>
-        <w:tc>
-          <w:tcPr/>
-          <w:p>
-            <w:pPr>
-              <w:pStyle w:val="Compact"/>
-              <w:jc w:val="left"/>
-            </w:pPr>
-            <w:r>
-              <w:t xml:space="preserve">Blocked: filter</w:t>
-            </w:r>
-          </w:p>
-        </w:tc>
-        <w:tc>
-          <w:tcPr/>
-          <w:p>
-            <w:pPr>
-              <w:pStyle w:val="Compact"/>
-              <w:jc w:val="left"/>
-            </w:pPr>
-            <w:r>
-              <w:t xml:space="preserve">Setups killed by VWAP / RSI / EMA</w:t>
-            </w:r>
-          </w:p>
-        </w:tc>
-        <w:tc>
-          <w:tcPr/>
-          <w:p>
-            <w:pPr>
-              <w:pStyle w:val="Compact"/>
-              <w:jc w:val="left"/>
-            </w:pPr>
-            <w:r>
-              <w:t xml:space="preserve">High count on a trend day is usually correct behaviour, not a fault</w:t>
-            </w:r>
-          </w:p>
-        </w:tc>
-      </w:tr>
-      <w:tr>
-        <w:tc>
-          <w:tcPr/>
-          <w:p>
-            <w:pPr>
-              <w:pStyle w:val="Compact"/>
-              <w:jc w:val="left"/>
-            </w:pPr>
-            <w:r>
-              <w:t xml:space="preserve">Blocked: risk</w:t>
-            </w:r>
-          </w:p>
-        </w:tc>
-        <w:tc>
-          <w:tcPr/>
-          <w:p>
-            <w:pPr>
-              <w:pStyle w:val="Compact"/>
-              <w:jc w:val="left"/>
-            </w:pPr>
-            <w:r>
-              <w:t xml:space="preserve">Setups needing a stop wider than 70 points</w:t>
-            </w:r>
-          </w:p>
-        </w:tc>
-        <w:tc>
-          <w:tcPr/>
-          <w:p>
-            <w:pPr>
-              <w:pStyle w:val="Compact"/>
-              <w:jc w:val="left"/>
-            </w:pPr>
-            <w:r>
-              <w:t xml:space="preserve">Raise the maximum stop distance if this is persistently high</w:t>
-            </w:r>
-          </w:p>
-        </w:tc>
-      </w:tr>
-      <w:tr>
-        <w:tc>
-          <w:tcPr/>
-          <w:p>
-            <w:pPr>
-              <w:pStyle w:val="Compact"/>
-              <w:jc w:val="left"/>
-            </w:pPr>
-            <w:r>
-              <w:t xml:space="preserve">Blocked: no room</w:t>
-            </w:r>
-          </w:p>
-        </w:tc>
-        <w:tc>
-          <w:tcPr/>
-          <w:p>
-            <w:pPr>
-              <w:pStyle w:val="Compact"/>
-              <w:jc w:val="left"/>
-            </w:pPr>
-            <w:r>
-              <w:t xml:space="preserve">Structural target was too close to be worth the risk</w:t>
-            </w:r>
-          </w:p>
-        </w:tc>
-        <w:tc>
-          <w:tcPr/>
-          <w:p>
-            <w:pPr>
-              <w:pStyle w:val="Compact"/>
-              <w:jc w:val="left"/>
-            </w:pPr>
-            <w:r>
-              <w:t xml:space="preserve">Only appears in</w:t>
-            </w:r>
-            <w:r>
-              <w:t xml:space="preserve"> </w:t>
-            </w:r>
-            <w:r>
-              <w:t xml:space="preserve">“Structure (gap tiers)”</w:t>
-            </w:r>
-            <w:r>
-              <w:t xml:space="preserve"> </w:t>
-            </w:r>
-            <w:r>
-              <w:t xml:space="preserve">mode. Lower Min R:R, or switch to Fixed R:R.</w:t>
-            </w:r>
-          </w:p>
-        </w:tc>
-      </w:tr>
-      <w:tr>
-        <w:tc>
-          <w:tcPr/>
-          <w:p>
-            <w:pPr>
-              <w:pStyle w:val="Compact"/>
-              <w:jc w:val="left"/>
-            </w:pPr>
-            <w:r>
-              <w:t xml:space="preserve">Blocked: W5 / squeeze</w:t>
-            </w:r>
-          </w:p>
-        </w:tc>
-        <w:tc>
-          <w:tcPr/>
-          <w:p>
-            <w:pPr>
-              <w:pStyle w:val="Compact"/>
-              <w:jc w:val="left"/>
-            </w:pPr>
-            <w:r>
-              <w:t xml:space="preserve">Setups vetoed by a Wave (5) lockout or by compression</w:t>
-            </w:r>
-          </w:p>
-        </w:tc>
-        <w:tc>
-          <w:tcPr/>
-          <w:p>
-            <w:pPr>
-              <w:pStyle w:val="Compact"/>
-              <w:jc w:val="left"/>
-            </w:pPr>
-            <w:r>
-              <w:t xml:space="preserve">If this is high on days you would have won, shorten the lockout or lengthen the wave lookback</w:t>
-            </w:r>
-          </w:p>
-        </w:tc>
-      </w:tr>
-      <w:tr>
-        <w:tc>
-          <w:tcPr/>
-          <w:p>
-            <w:pPr>
-              <w:pStyle w:val="Compact"/>
-              <w:jc w:val="left"/>
-            </w:pPr>
-            <w:r>
-              <w:t xml:space="preserve">Blocked: session/limit</w:t>
-            </w:r>
-          </w:p>
-        </w:tc>
-        <w:tc>
-          <w:tcPr/>
-          <w:p>
-            <w:pPr>
-              <w:pStyle w:val="Compact"/>
-              <w:jc w:val="left"/>
-            </w:pPr>
-            <w:r>
-              <w:t xml:space="preserve">Outside the window, or over the trade limit, or in cooldown</w:t>
-            </w:r>
-          </w:p>
-        </w:tc>
-        <w:tc>
-          <w:tcPr/>
-          <w:p>
-            <w:pPr>
-              <w:pStyle w:val="Compact"/>
-              <w:jc w:val="left"/>
-            </w:pPr>
-            <w:r>
-              <w:t xml:space="preserve">Widen the entry window if good setups appear late</w:t>
-            </w:r>
-          </w:p>
-        </w:tc>
-      </w:tr>
-      <w:tr>
-        <w:tc>
-          <w:tcPr/>
-          <w:p>
-            <w:pPr>
-              <w:pStyle w:val="Compact"/>
-              <w:jc w:val="left"/>
-            </w:pPr>
-            <w:r>
-              <w:t xml:space="preserve">SIGNALS</w:t>
-            </w:r>
-          </w:p>
-        </w:tc>
-        <w:tc>
-          <w:tcPr/>
-          <w:p>
-            <w:pPr>
-              <w:pStyle w:val="Compact"/>
-              <w:jc w:val="left"/>
-            </w:pPr>
-            <w:r>
-              <w:t xml:space="preserve">What actually fired</w:t>
-            </w:r>
-          </w:p>
-        </w:tc>
-        <w:tc>
-          <w:tcPr/>
-          <w:p>
-            <w:pPr>
-              <w:pStyle w:val="Compact"/>
-              <w:jc w:val="left"/>
-            </w:pPr>
-            <w:r>
-              <w:t xml:space="preserve">—</w:t>
-            </w:r>
-          </w:p>
-        </w:tc>
-      </w:tr>
-      <w:tr>
-        <w:tc>
-          <w:tcPr/>
-          <w:p>
-            <w:pPr>
-              <w:pStyle w:val="Compact"/>
-              <w:jc w:val="left"/>
-            </w:pPr>
-            <w:r>
-              <w:t xml:space="preserve">Zone / VWAP / RSI</w:t>
-            </w:r>
-          </w:p>
-        </w:tc>
-        <w:tc>
-          <w:tcPr/>
-          <w:p>
-            <w:pPr>
-              <w:pStyle w:val="Compact"/>
-              <w:jc w:val="left"/>
-            </w:pPr>
-            <w:r>
-              <w:t xml:space="preserve">Live values: the demand zone band, then VWAP and RSI</w:t>
-            </w:r>
-          </w:p>
-        </w:tc>
-        <w:tc>
-          <w:tcPr/>
-          <w:p>
-            <w:pPr>
-              <w:pStyle w:val="Compact"/>
-              <w:jc w:val="left"/>
-            </w:pPr>
-            <w:r>
-              <w:t xml:space="preserve">A sanity check that the filters are seeing what you are</w:t>
+              <w:t xml:space="preserve">Why</w:t>
+            </w:r>
+          </w:p>
+        </w:tc>
+      </w:tr>
+      <w:tr>
+        <w:tc>
+          <w:tcPr/>
+          <w:p>
+            <w:pPr>
+              <w:pStyle w:val="Compact"/>
+              <w:jc w:val="left"/>
+            </w:pPr>
+            <w:r>
+              <w:t xml:space="preserve">Entry window</w:t>
+            </w:r>
+          </w:p>
+        </w:tc>
+        <w:tc>
+          <w:tcPr/>
+          <w:p>
+            <w:pPr>
+              <w:pStyle w:val="Compact"/>
+              <w:jc w:val="left"/>
+            </w:pPr>
+            <w:r>
+              <w:t xml:space="preserve">09:20 – 15:00</w:t>
+            </w:r>
+          </w:p>
+        </w:tc>
+        <w:tc>
+          <w:tcPr/>
+          <w:p>
+            <w:pPr>
+              <w:pStyle w:val="Compact"/>
+              <w:jc w:val="left"/>
+            </w:pPr>
+            <w:r>
+              <w:t xml:space="preserve">Avoids the opening auction noise and gives a late trade room to work</w:t>
+            </w:r>
+          </w:p>
+        </w:tc>
+      </w:tr>
+      <w:tr>
+        <w:tc>
+          <w:tcPr/>
+          <w:p>
+            <w:pPr>
+              <w:pStyle w:val="Compact"/>
+              <w:jc w:val="left"/>
+            </w:pPr>
+            <w:r>
+              <w:t xml:space="preserve">Expiry-day entry cut-off</w:t>
+            </w:r>
+          </w:p>
+        </w:tc>
+        <w:tc>
+          <w:tcPr/>
+          <w:p>
+            <w:pPr>
+              <w:pStyle w:val="Compact"/>
+              <w:jc w:val="left"/>
+            </w:pPr>
+            <w:r>
+              <w:t xml:space="preserve">13:00</w:t>
+            </w:r>
+          </w:p>
+        </w:tc>
+        <w:tc>
+          <w:tcPr/>
+          <w:p>
+            <w:pPr>
+              <w:pStyle w:val="Compact"/>
+              <w:jc w:val="left"/>
+            </w:pPr>
+            <w:r>
+              <w:t xml:space="preserve">Premium decay and gamma make afternoon expiry entries unsuitable for a 3-minute reversion system</w:t>
+            </w:r>
+          </w:p>
+        </w:tc>
+      </w:tr>
+      <w:tr>
+        <w:tc>
+          <w:tcPr/>
+          <w:p>
+            <w:pPr>
+              <w:pStyle w:val="Compact"/>
+              <w:jc w:val="left"/>
+            </w:pPr>
+            <w:r>
+              <w:t xml:space="preserve">Square-off</w:t>
+            </w:r>
+          </w:p>
+        </w:tc>
+        <w:tc>
+          <w:tcPr/>
+          <w:p>
+            <w:pPr>
+              <w:pStyle w:val="Compact"/>
+              <w:jc w:val="left"/>
+            </w:pPr>
+            <w:r>
+              <w:t xml:space="preserve">15:15 – 15:30</w:t>
+            </w:r>
+          </w:p>
+        </w:tc>
+        <w:tc>
+          <w:tcPr/>
+          <w:p>
+            <w:pPr>
+              <w:pStyle w:val="Compact"/>
+              <w:jc w:val="left"/>
+            </w:pPr>
+            <w:r>
+              <w:t xml:space="preserve">Every position is closed; nothing is carried overnight</w:t>
+            </w:r>
+          </w:p>
+        </w:tc>
+      </w:tr>
+      <w:tr>
+        <w:tc>
+          <w:tcPr/>
+          <w:p>
+            <w:pPr>
+              <w:pStyle w:val="Compact"/>
+              <w:jc w:val="left"/>
+            </w:pPr>
+            <w:r>
+              <w:t xml:space="preserve">Max trades per day</w:t>
+            </w:r>
+          </w:p>
+        </w:tc>
+        <w:tc>
+          <w:tcPr/>
+          <w:p>
+            <w:pPr>
+              <w:pStyle w:val="Compact"/>
+              <w:jc w:val="left"/>
+            </w:pPr>
+            <w:r>
+              <w:t xml:space="preserve">3</w:t>
+            </w:r>
+          </w:p>
+        </w:tc>
+        <w:tc>
+          <w:tcPr/>
+          <w:p>
+            <w:pPr>
+              <w:pStyle w:val="Compact"/>
+              <w:jc w:val="left"/>
+            </w:pPr>
+            <w:r>
+              <w:t xml:space="preserve">Prevents revenge-trading a bad session</w:t>
+            </w:r>
+          </w:p>
+        </w:tc>
+      </w:tr>
+      <w:tr>
+        <w:tc>
+          <w:tcPr/>
+          <w:p>
+            <w:pPr>
+              <w:pStyle w:val="Compact"/>
+              <w:jc w:val="left"/>
+            </w:pPr>
+            <w:r>
+              <w:t xml:space="preserve">Cooldown</w:t>
+            </w:r>
+          </w:p>
+        </w:tc>
+        <w:tc>
+          <w:tcPr/>
+          <w:p>
+            <w:pPr>
+              <w:pStyle w:val="Compact"/>
+              <w:jc w:val="left"/>
+            </w:pPr>
+            <w:r>
+              <w:t xml:space="preserve">6 bars</w:t>
+            </w:r>
+          </w:p>
+        </w:tc>
+        <w:tc>
+          <w:tcPr/>
+          <w:p>
+            <w:pPr>
+              <w:pStyle w:val="Compact"/>
+              <w:jc w:val="left"/>
+            </w:pPr>
+            <w:r>
+              <w:t xml:space="preserve">Stops clustered signals in the same move</w:t>
+            </w:r>
+          </w:p>
+        </w:tc>
+      </w:tr>
+      <w:tr>
+        <w:tc>
+          <w:tcPr/>
+          <w:p>
+            <w:pPr>
+              <w:pStyle w:val="Compact"/>
+              <w:jc w:val="left"/>
+            </w:pPr>
+            <w:r>
+              <w:t xml:space="preserve">One position at a time</w:t>
+            </w:r>
+          </w:p>
+        </w:tc>
+        <w:tc>
+          <w:tcPr/>
+          <w:p>
+            <w:pPr>
+              <w:pStyle w:val="Compact"/>
+              <w:jc w:val="left"/>
+            </w:pPr>
+            <w:r>
+              <w:t xml:space="preserve">Enforced</w:t>
+            </w:r>
+          </w:p>
+        </w:tc>
+        <w:tc>
+          <w:tcPr/>
+          <w:p>
+            <w:pPr>
+              <w:pStyle w:val="Compact"/>
+              <w:jc w:val="left"/>
+            </w:pPr>
+            <w:r>
+              <w:t xml:space="preserve">No pyramiding, no hedging confusion</w:t>
+            </w:r>
+          </w:p>
+        </w:tc>
+      </w:tr>
+      <w:tr>
+        <w:tc>
+          <w:tcPr/>
+          <w:p>
+            <w:pPr>
+              <w:pStyle w:val="Compact"/>
+              <w:jc w:val="left"/>
+            </w:pPr>
+            <w:r>
+              <w:t xml:space="preserve">Wave (5) lockout</w:t>
+            </w:r>
+          </w:p>
+        </w:tc>
+        <w:tc>
+          <w:tcPr/>
+          <w:p>
+            <w:pPr>
+              <w:pStyle w:val="Compact"/>
+              <w:jc w:val="left"/>
+            </w:pPr>
+            <w:r>
+              <w:t xml:space="preserve">8 bars</w:t>
+            </w:r>
+          </w:p>
+        </w:tc>
+        <w:tc>
+          <w:tcPr/>
+          <w:p>
+            <w:pPr>
+              <w:pStyle w:val="Compact"/>
+              <w:jc w:val="left"/>
+            </w:pPr>
+            <w:r>
+              <w:t xml:space="preserve">Stops you buying the top of an exhausted leg</w:t>
+            </w:r>
+          </w:p>
+        </w:tc>
+      </w:tr>
+      <w:tr>
+        <w:tc>
+          <w:tcPr/>
+          <w:p>
+            <w:pPr>
+              <w:pStyle w:val="Compact"/>
+              <w:jc w:val="left"/>
+            </w:pPr>
+            <w:r>
+              <w:t xml:space="preserve">Levels cleared each morning</w:t>
+            </w:r>
+          </w:p>
+        </w:tc>
+        <w:tc>
+          <w:tcPr/>
+          <w:p>
+            <w:pPr>
+              <w:pStyle w:val="Compact"/>
+              <w:jc w:val="left"/>
+            </w:pPr>
+            <w:r>
+              <w:t xml:space="preserve">On</w:t>
+            </w:r>
+          </w:p>
+        </w:tc>
+        <w:tc>
+          <w:tcPr/>
+          <w:p>
+            <w:pPr>
+              <w:pStyle w:val="Compact"/>
+              <w:jc w:val="left"/>
+            </w:pPr>
+            <w:r>
+              <w:t xml:space="preserve">Yesterday’s BankNifty pivots do not leak into today</w:t>
             </w:r>
           </w:p>
         </w:tc>
       </w:tr>
     </w:tbl>
-    <w:bookmarkEnd w:id="29"/>
-    <w:bookmarkStart w:id="30" w:name="option-chain-top-left-companion-script"/>
+    <w:bookmarkEnd w:id="27"/>
+    <w:bookmarkStart w:id="31" w:name="reading-the-two-tables"/>
+    <w:p>
+      <w:pPr>
+        <w:pStyle w:val="Heading2"/>
+      </w:pPr>
+      <w:r>
+        <w:t xml:space="preserve">6. Reading the two tables</w:t>
+      </w:r>
+    </w:p>
+    <w:bookmarkStart w:id="28" w:name="today-top-right"/>
     <w:p>
       <w:pPr>
         <w:pStyle w:val="Heading3"/>
       </w:pPr>
       <w:r>
-        <w:t xml:space="preserve">Option chain (top left, companion script)</w:t>
+        <w:t xml:space="preserve">Today (top right)</w:t>
       </w:r>
     </w:p>
     <w:p>
@@ -4383,26 +3992,7 @@
         <w:pStyle w:val="FirstParagraph"/>
       </w:pPr>
       <w:r>
-        <w:t xml:space="preserve">One row per strike around ATM with CE OI, CE change, PE OI and PE change. The ATM row is highlighted and marked with an arrow; the highest-OI CE and PE cells are shaded. Summary rows give totals, PCR, the support and resistance strikes, where today’s writing is concentrated, the overall bias, and the futures buildup. The last row shows live ATM CE and PE premiums with the rupee cost of one lot.</w:t>
-      </w:r>
-    </w:p>
-    <w:bookmarkEnd w:id="30"/>
-    <w:bookmarkEnd w:id="31"/>
-    <w:bookmarkStart w:id="32" w:name="alerts"/>
-    <w:p>
-      <w:pPr>
-        <w:pStyle w:val="Heading2"/>
-      </w:pPr>
-      <w:r>
-        <w:t xml:space="preserve">7. Alerts</w:t>
-      </w:r>
-    </w:p>
-    <w:p>
-      <w:pPr>
-        <w:pStyle w:val="FirstParagraph"/>
-      </w:pPr>
-      <w:r>
-        <w:t xml:space="preserve">Nine alert conditions are exposed. The first three are the ones to actually set:</w:t>
+        <w:t xml:space="preserve">Trades taken versus the daily limit, wins, losses, net index points, an estimated rupee figure using your lot size, and the current ATM strike. On expiry day the ATM cell is flagged in red. Below that:</w:t>
       </w:r>
     </w:p>
     <w:tbl>
@@ -4432,7 +4022,7 @@
                 <w:b/>
                 <w:bCs/>
               </w:rPr>
-              <w:t xml:space="preserve">Alert</w:t>
+              <w:t xml:space="preserve">Row</w:t>
             </w:r>
           </w:p>
         </w:tc>
@@ -4448,317 +4038,700 @@
                 <w:b/>
                 <w:bCs/>
               </w:rPr>
-              <w:t xml:space="preserve">Fires when</w:t>
-            </w:r>
-          </w:p>
-        </w:tc>
-      </w:tr>
-      <w:tr>
-        <w:tc>
-          <w:tcPr/>
-          <w:p>
-            <w:pPr>
-              <w:pStyle w:val="Compact"/>
-              <w:jc w:val="left"/>
-            </w:pPr>
-            <w:r>
-              <w:t xml:space="preserve">SD-X Buy CE / Buy PE</w:t>
-            </w:r>
-          </w:p>
-        </w:tc>
-        <w:tc>
-          <w:tcPr/>
-          <w:p>
-            <w:pPr>
-              <w:pStyle w:val="Compact"/>
-              <w:jc w:val="left"/>
-            </w:pPr>
-            <w:r>
-              <w:t xml:space="preserve">A signal circle prints</w:t>
-            </w:r>
-          </w:p>
-        </w:tc>
-      </w:tr>
-      <w:tr>
-        <w:tc>
-          <w:tcPr/>
-          <w:p>
-            <w:pPr>
-              <w:pStyle w:val="Compact"/>
-              <w:jc w:val="left"/>
-            </w:pPr>
-            <w:r>
-              <w:t xml:space="preserve">SD-X Square off</w:t>
-            </w:r>
-          </w:p>
-        </w:tc>
-        <w:tc>
-          <w:tcPr/>
-          <w:p>
-            <w:pPr>
-              <w:pStyle w:val="Compact"/>
-              <w:jc w:val="left"/>
-            </w:pPr>
-            <w:r>
-              <w:t xml:space="preserve">An open position reaches the square-off window</w:t>
-            </w:r>
-          </w:p>
-        </w:tc>
-      </w:tr>
-      <w:tr>
-        <w:tc>
-          <w:tcPr/>
-          <w:p>
-            <w:pPr>
-              <w:pStyle w:val="Compact"/>
-              <w:jc w:val="left"/>
-            </w:pPr>
-            <w:r>
-              <w:t xml:space="preserve">SD-X Wave 5 top / bottom</w:t>
-            </w:r>
-          </w:p>
-        </w:tc>
-        <w:tc>
-          <w:tcPr/>
-          <w:p>
-            <w:pPr>
-              <w:pStyle w:val="Compact"/>
-              <w:jc w:val="left"/>
-            </w:pPr>
-            <w:r>
-              <w:t xml:space="preserve">Exhaustion — stop chasing that side</w:t>
-            </w:r>
-          </w:p>
-        </w:tc>
-      </w:tr>
-      <w:tr>
-        <w:tc>
-          <w:tcPr/>
-          <w:p>
-            <w:pPr>
-              <w:pStyle w:val="Compact"/>
-              <w:jc w:val="left"/>
-            </w:pPr>
-            <w:r>
-              <w:t xml:space="preserve">SD-X Whale 4-flag long / short</w:t>
-            </w:r>
-          </w:p>
-        </w:tc>
-        <w:tc>
-          <w:tcPr/>
-          <w:p>
-            <w:pPr>
-              <w:pStyle w:val="Compact"/>
-              <w:jc w:val="left"/>
-            </w:pPr>
-            <w:r>
-              <w:t xml:space="preserve">A continuation run extends</w:t>
-            </w:r>
-          </w:p>
-        </w:tc>
-      </w:tr>
-      <w:tr>
-        <w:tc>
-          <w:tcPr/>
-          <w:p>
-            <w:pPr>
-              <w:pStyle w:val="Compact"/>
-              <w:jc w:val="left"/>
-            </w:pPr>
-            <w:r>
-              <w:t xml:space="preserve">SD-X Absorption at base / ceiling</w:t>
-            </w:r>
-          </w:p>
-        </w:tc>
-        <w:tc>
-          <w:tcPr/>
-          <w:p>
-            <w:pPr>
-              <w:pStyle w:val="Compact"/>
-              <w:jc w:val="left"/>
-            </w:pPr>
-            <w:r>
-              <w:t xml:space="preserve">An absorption wick holds the day’s edge</w:t>
+              <w:t xml:space="preserve">What it tells you</w:t>
+            </w:r>
+          </w:p>
+        </w:tc>
+      </w:tr>
+      <w:tr>
+        <w:tc>
+          <w:tcPr/>
+          <w:p>
+            <w:pPr>
+              <w:pStyle w:val="Compact"/>
+              <w:jc w:val="left"/>
+            </w:pPr>
+            <w:r>
+              <w:t xml:space="preserve">VIX</w:t>
+            </w:r>
+          </w:p>
+        </w:tc>
+        <w:tc>
+          <w:tcPr/>
+          <w:p>
+            <w:pPr>
+              <w:pStyle w:val="Compact"/>
+              <w:jc w:val="left"/>
+            </w:pPr>
+            <w:r>
+              <w:t xml:space="preserve">India VIX, coloured green / orange / red by regime</w:t>
+            </w:r>
+          </w:p>
+        </w:tc>
+      </w:tr>
+      <w:tr>
+        <w:tc>
+          <w:tcPr/>
+          <w:p>
+            <w:pPr>
+              <w:pStyle w:val="Compact"/>
+              <w:jc w:val="left"/>
+            </w:pPr>
+            <w:r>
+              <w:t xml:space="preserve">Regime</w:t>
+            </w:r>
+          </w:p>
+        </w:tc>
+        <w:tc>
+          <w:tcPr/>
+          <w:p>
+            <w:pPr>
+              <w:pStyle w:val="Compact"/>
+              <w:jc w:val="left"/>
+            </w:pPr>
+            <w:r>
+              <w:t xml:space="preserve">Regime name and the strike selection it implies</w:t>
+            </w:r>
+          </w:p>
+        </w:tc>
+      </w:tr>
+      <w:tr>
+        <w:tc>
+          <w:tcPr/>
+          <w:p>
+            <w:pPr>
+              <w:pStyle w:val="Compact"/>
+              <w:jc w:val="left"/>
+            </w:pPr>
+            <w:r>
+              <w:t xml:space="preserve">Phase</w:t>
+            </w:r>
+          </w:p>
+        </w:tc>
+        <w:tc>
+          <w:tcPr/>
+          <w:p>
+            <w:pPr>
+              <w:pStyle w:val="Compact"/>
+              <w:jc w:val="left"/>
+            </w:pPr>
+            <w:r>
+              <w:t xml:space="preserve">The current CAMDC phase.</w:t>
+            </w:r>
+            <w:r>
+              <w:t xml:space="preserve"> </w:t>
+            </w:r>
+            <w:r>
+              <w:rPr>
+                <w:rStyle w:val="VerbatimChar"/>
+              </w:rPr>
+              <w:t xml:space="preserve">(no vol)</w:t>
+            </w:r>
+            <w:r>
+              <w:t xml:space="preserve"> </w:t>
+            </w:r>
+            <w:r>
+              <w:t xml:space="preserve">means the feed has no volume and the engine is running price-only.</w:t>
             </w:r>
           </w:p>
         </w:tc>
       </w:tr>
     </w:tbl>
-    <w:bookmarkEnd w:id="32"/>
-    <w:bookmarkStart w:id="33" w:name="daily-workflow"/>
+    <w:p>
+      <w:pPr>
+        <w:pStyle w:val="BodyText"/>
+      </w:pPr>
+      <w:r>
+        <w:t xml:space="preserve">The Phase row is the fastest read on the chart.</w:t>
+      </w:r>
+      <w:r>
+        <w:t xml:space="preserve"> </w:t>
+      </w:r>
+      <w:r>
+        <w:rPr>
+          <w:b/>
+          <w:bCs/>
+        </w:rPr>
+        <w:t xml:space="preserve">1 Compression</w:t>
+      </w:r>
+      <w:r>
+        <w:t xml:space="preserve"> </w:t>
+      </w:r>
+      <w:r>
+        <w:t xml:space="preserve">and</w:t>
+      </w:r>
+      <w:r>
+        <w:t xml:space="preserve"> </w:t>
+      </w:r>
+      <w:r>
+        <w:rPr>
+          <w:b/>
+          <w:bCs/>
+        </w:rPr>
+        <w:t xml:space="preserve">2 Accumulation</w:t>
+      </w:r>
+      <w:r>
+        <w:t xml:space="preserve"> </w:t>
+      </w:r>
+      <w:r>
+        <w:t xml:space="preserve">are the phases where reversion entries work;</w:t>
+      </w:r>
+      <w:r>
+        <w:t xml:space="preserve"> </w:t>
+      </w:r>
+      <w:r>
+        <w:rPr>
+          <w:b/>
+          <w:bCs/>
+        </w:rPr>
+        <w:t xml:space="preserve">4 Distribution</w:t>
+      </w:r>
+      <w:r>
+        <w:t xml:space="preserve"> </w:t>
+      </w:r>
+      <w:r>
+        <w:t xml:space="preserve">is where the 4-flag continuation entries live;</w:t>
+      </w:r>
+      <w:r>
+        <w:t xml:space="preserve"> </w:t>
+      </w:r>
+      <w:r>
+        <w:rPr>
+          <w:b/>
+          <w:bCs/>
+        </w:rPr>
+        <w:t xml:space="preserve">3 Manipulation</w:t>
+      </w:r>
+      <w:r>
+        <w:t xml:space="preserve"> </w:t>
+      </w:r>
+      <w:r>
+        <w:t xml:space="preserve">is where you get stopped out for no reason.</w:t>
+      </w:r>
+    </w:p>
+    <w:bookmarkEnd w:id="28"/>
+    <w:bookmarkStart w:id="29" w:name="diag-bottom-right"/>
+    <w:p>
+      <w:pPr>
+        <w:pStyle w:val="Heading3"/>
+      </w:pPr>
+      <w:r>
+        <w:t xml:space="preserve">DIAG (bottom right)</w:t>
+      </w:r>
+    </w:p>
+    <w:p>
+      <w:pPr>
+        <w:pStyle w:val="FirstParagraph"/>
+      </w:pPr>
+      <w:r>
+        <w:t xml:space="preserve">The troubleshooting panel. Read it top to bottom when a day produced no signals.</w:t>
+      </w:r>
+    </w:p>
+    <w:tbl>
+      <w:tblPr>
+        <w:tblStyle w:val="Table"/>
+        <w:tblW w:type="pct" w:w="5000"/>
+        <w:tblLayout w:type="fixed"/>
+        <w:tblLook w:firstRow="1" w:lastRow="0" w:firstColumn="0" w:lastColumn="0" w:noHBand="0" w:noVBand="0" w:val="0020"/>
+      </w:tblPr>
+      <w:tblGrid>
+        <w:gridCol w:w="2640"/>
+        <w:gridCol w:w="2640"/>
+        <w:gridCol w:w="2640"/>
+      </w:tblGrid>
+      <w:tr>
+        <w:trPr>
+          <w:tblHeader w:val="on"/>
+        </w:trPr>
+        <w:tc>
+          <w:tcPr/>
+          <w:p>
+            <w:pPr>
+              <w:pStyle w:val="Compact"/>
+              <w:jc w:val="left"/>
+            </w:pPr>
+            <w:r>
+              <w:rPr>
+                <w:b/>
+                <w:bCs/>
+              </w:rPr>
+              <w:t xml:space="preserve">Row</w:t>
+            </w:r>
+          </w:p>
+        </w:tc>
+        <w:tc>
+          <w:tcPr/>
+          <w:p>
+            <w:pPr>
+              <w:pStyle w:val="Compact"/>
+              <w:jc w:val="left"/>
+            </w:pPr>
+            <w:r>
+              <w:rPr>
+                <w:b/>
+                <w:bCs/>
+              </w:rPr>
+              <w:t xml:space="preserve">What it tells you</w:t>
+            </w:r>
+          </w:p>
+        </w:tc>
+        <w:tc>
+          <w:tcPr/>
+          <w:p>
+            <w:pPr>
+              <w:pStyle w:val="Compact"/>
+              <w:jc w:val="left"/>
+            </w:pPr>
+            <w:r>
+              <w:rPr>
+                <w:b/>
+                <w:bCs/>
+              </w:rPr>
+              <w:t xml:space="preserve">Action if it looks wrong</w:t>
+            </w:r>
+          </w:p>
+        </w:tc>
+      </w:tr>
+      <w:tr>
+        <w:tc>
+          <w:tcPr/>
+          <w:p>
+            <w:pPr>
+              <w:pStyle w:val="Compact"/>
+              <w:jc w:val="left"/>
+            </w:pPr>
+            <w:r>
+              <w:t xml:space="preserve">Zone touched</w:t>
+            </w:r>
+          </w:p>
+        </w:tc>
+        <w:tc>
+          <w:tcPr/>
+          <w:p>
+            <w:pPr>
+              <w:pStyle w:val="Compact"/>
+              <w:jc w:val="left"/>
+            </w:pPr>
+            <w:r>
+              <w:t xml:space="preserve">How many bars entered a zone today</w:t>
+            </w:r>
+          </w:p>
+        </w:tc>
+        <w:tc>
+          <w:tcPr/>
+          <w:p>
+            <w:pPr>
+              <w:pStyle w:val="Compact"/>
+              <w:jc w:val="left"/>
+            </w:pPr>
+            <w:r>
+              <w:t xml:space="preserve">Zero all day means the zone is out of play — check the next row</w:t>
+            </w:r>
+          </w:p>
+        </w:tc>
+      </w:tr>
+      <w:tr>
+        <w:tc>
+          <w:tcPr/>
+          <w:p>
+            <w:pPr>
+              <w:pStyle w:val="Compact"/>
+              <w:jc w:val="left"/>
+            </w:pPr>
+            <w:r>
+              <w:t xml:space="preserve">Zone dist (ATR)</w:t>
+            </w:r>
+          </w:p>
+        </w:tc>
+        <w:tc>
+          <w:tcPr/>
+          <w:p>
+            <w:pPr>
+              <w:pStyle w:val="Compact"/>
+              <w:jc w:val="left"/>
+            </w:pPr>
+            <w:r>
+              <w:t xml:space="preserve">How far price is from each zone, in ATR. Turns red beyond 4.</w:t>
+            </w:r>
+          </w:p>
+        </w:tc>
+        <w:tc>
+          <w:tcPr/>
+          <w:p>
+            <w:pPr>
+              <w:pStyle w:val="Compact"/>
+              <w:jc w:val="left"/>
+            </w:pPr>
+            <w:r>
+              <w:t xml:space="preserve">Red means a stranded zone. Switch to</w:t>
+            </w:r>
+            <w:r>
+              <w:t xml:space="preserve"> </w:t>
+            </w:r>
+            <w:r>
+              <w:t xml:space="preserve">“Auto (near price)”</w:t>
+            </w:r>
+            <w:r>
+              <w:t xml:space="preserve"> </w:t>
+            </w:r>
+            <w:r>
+              <w:t xml:space="preserve">mode.</w:t>
+            </w:r>
+          </w:p>
+        </w:tc>
+      </w:tr>
+      <w:tr>
+        <w:tc>
+          <w:tcPr/>
+          <w:p>
+            <w:pPr>
+              <w:pStyle w:val="Compact"/>
+              <w:jc w:val="left"/>
+            </w:pPr>
+            <w:r>
+              <w:t xml:space="preserve">Setups found</w:t>
+            </w:r>
+          </w:p>
+        </w:tc>
+        <w:tc>
+          <w:tcPr/>
+          <w:p>
+            <w:pPr>
+              <w:pStyle w:val="Compact"/>
+              <w:jc w:val="left"/>
+            </w:pPr>
+            <w:r>
+              <w:t xml:space="preserve">Triggers that fired before filtering</w:t>
+            </w:r>
+          </w:p>
+        </w:tc>
+        <w:tc>
+          <w:tcPr/>
+          <w:p>
+            <w:pPr>
+              <w:pStyle w:val="Compact"/>
+              <w:jc w:val="left"/>
+            </w:pPr>
+            <w:r>
+              <w:t xml:space="preserve">Zero with touches above means the rejection test is too strict — set rejection to Loose</w:t>
+            </w:r>
+          </w:p>
+        </w:tc>
+      </w:tr>
+      <w:tr>
+        <w:tc>
+          <w:tcPr/>
+          <w:p>
+            <w:pPr>
+              <w:pStyle w:val="Compact"/>
+              <w:jc w:val="left"/>
+            </w:pPr>
+            <w:r>
+              <w:t xml:space="preserve">Blocked: filter</w:t>
+            </w:r>
+          </w:p>
+        </w:tc>
+        <w:tc>
+          <w:tcPr/>
+          <w:p>
+            <w:pPr>
+              <w:pStyle w:val="Compact"/>
+              <w:jc w:val="left"/>
+            </w:pPr>
+            <w:r>
+              <w:t xml:space="preserve">Setups killed by VWAP / RSI / EMA</w:t>
+            </w:r>
+          </w:p>
+        </w:tc>
+        <w:tc>
+          <w:tcPr/>
+          <w:p>
+            <w:pPr>
+              <w:pStyle w:val="Compact"/>
+              <w:jc w:val="left"/>
+            </w:pPr>
+            <w:r>
+              <w:t xml:space="preserve">High count on a trend day is usually correct behaviour, not a fault</w:t>
+            </w:r>
+          </w:p>
+        </w:tc>
+      </w:tr>
+      <w:tr>
+        <w:tc>
+          <w:tcPr/>
+          <w:p>
+            <w:pPr>
+              <w:pStyle w:val="Compact"/>
+              <w:jc w:val="left"/>
+            </w:pPr>
+            <w:r>
+              <w:t xml:space="preserve">Blocked: risk</w:t>
+            </w:r>
+          </w:p>
+        </w:tc>
+        <w:tc>
+          <w:tcPr/>
+          <w:p>
+            <w:pPr>
+              <w:pStyle w:val="Compact"/>
+              <w:jc w:val="left"/>
+            </w:pPr>
+            <w:r>
+              <w:t xml:space="preserve">Setups needing a stop wider than 70 points</w:t>
+            </w:r>
+          </w:p>
+        </w:tc>
+        <w:tc>
+          <w:tcPr/>
+          <w:p>
+            <w:pPr>
+              <w:pStyle w:val="Compact"/>
+              <w:jc w:val="left"/>
+            </w:pPr>
+            <w:r>
+              <w:t xml:space="preserve">Raise the maximum stop distance if this is persistently high</w:t>
+            </w:r>
+          </w:p>
+        </w:tc>
+      </w:tr>
+      <w:tr>
+        <w:tc>
+          <w:tcPr/>
+          <w:p>
+            <w:pPr>
+              <w:pStyle w:val="Compact"/>
+              <w:jc w:val="left"/>
+            </w:pPr>
+            <w:r>
+              <w:t xml:space="preserve">Blocked: no room</w:t>
+            </w:r>
+          </w:p>
+        </w:tc>
+        <w:tc>
+          <w:tcPr/>
+          <w:p>
+            <w:pPr>
+              <w:pStyle w:val="Compact"/>
+              <w:jc w:val="left"/>
+            </w:pPr>
+            <w:r>
+              <w:t xml:space="preserve">Structural target was too close to be worth the risk</w:t>
+            </w:r>
+          </w:p>
+        </w:tc>
+        <w:tc>
+          <w:tcPr/>
+          <w:p>
+            <w:pPr>
+              <w:pStyle w:val="Compact"/>
+              <w:jc w:val="left"/>
+            </w:pPr>
+            <w:r>
+              <w:t xml:space="preserve">Only appears in</w:t>
+            </w:r>
+            <w:r>
+              <w:t xml:space="preserve"> </w:t>
+            </w:r>
+            <w:r>
+              <w:t xml:space="preserve">“Structure (gap tiers)”</w:t>
+            </w:r>
+            <w:r>
+              <w:t xml:space="preserve"> </w:t>
+            </w:r>
+            <w:r>
+              <w:t xml:space="preserve">mode. Lower Min R:R, or switch to Fixed R:R.</w:t>
+            </w:r>
+          </w:p>
+        </w:tc>
+      </w:tr>
+      <w:tr>
+        <w:tc>
+          <w:tcPr/>
+          <w:p>
+            <w:pPr>
+              <w:pStyle w:val="Compact"/>
+              <w:jc w:val="left"/>
+            </w:pPr>
+            <w:r>
+              <w:t xml:space="preserve">Blocked: W5 / squeeze</w:t>
+            </w:r>
+          </w:p>
+        </w:tc>
+        <w:tc>
+          <w:tcPr/>
+          <w:p>
+            <w:pPr>
+              <w:pStyle w:val="Compact"/>
+              <w:jc w:val="left"/>
+            </w:pPr>
+            <w:r>
+              <w:t xml:space="preserve">Setups vetoed by a Wave (5) lockout or by compression</w:t>
+            </w:r>
+          </w:p>
+        </w:tc>
+        <w:tc>
+          <w:tcPr/>
+          <w:p>
+            <w:pPr>
+              <w:pStyle w:val="Compact"/>
+              <w:jc w:val="left"/>
+            </w:pPr>
+            <w:r>
+              <w:t xml:space="preserve">If this is high on days you would have won, shorten the lockout or lengthen the wave lookback</w:t>
+            </w:r>
+          </w:p>
+        </w:tc>
+      </w:tr>
+      <w:tr>
+        <w:tc>
+          <w:tcPr/>
+          <w:p>
+            <w:pPr>
+              <w:pStyle w:val="Compact"/>
+              <w:jc w:val="left"/>
+            </w:pPr>
+            <w:r>
+              <w:t xml:space="preserve">Blocked: session/limit</w:t>
+            </w:r>
+          </w:p>
+        </w:tc>
+        <w:tc>
+          <w:tcPr/>
+          <w:p>
+            <w:pPr>
+              <w:pStyle w:val="Compact"/>
+              <w:jc w:val="left"/>
+            </w:pPr>
+            <w:r>
+              <w:t xml:space="preserve">Outside the window, or over the trade limit, or in cooldown</w:t>
+            </w:r>
+          </w:p>
+        </w:tc>
+        <w:tc>
+          <w:tcPr/>
+          <w:p>
+            <w:pPr>
+              <w:pStyle w:val="Compact"/>
+              <w:jc w:val="left"/>
+            </w:pPr>
+            <w:r>
+              <w:t xml:space="preserve">Widen the entry window if good setups appear late</w:t>
+            </w:r>
+          </w:p>
+        </w:tc>
+      </w:tr>
+      <w:tr>
+        <w:tc>
+          <w:tcPr/>
+          <w:p>
+            <w:pPr>
+              <w:pStyle w:val="Compact"/>
+              <w:jc w:val="left"/>
+            </w:pPr>
+            <w:r>
+              <w:t xml:space="preserve">SIGNALS</w:t>
+            </w:r>
+          </w:p>
+        </w:tc>
+        <w:tc>
+          <w:tcPr/>
+          <w:p>
+            <w:pPr>
+              <w:pStyle w:val="Compact"/>
+              <w:jc w:val="left"/>
+            </w:pPr>
+            <w:r>
+              <w:t xml:space="preserve">What actually fired</w:t>
+            </w:r>
+          </w:p>
+        </w:tc>
+        <w:tc>
+          <w:tcPr/>
+          <w:p>
+            <w:pPr>
+              <w:pStyle w:val="Compact"/>
+              <w:jc w:val="left"/>
+            </w:pPr>
+            <w:r>
+              <w:t xml:space="preserve">—</w:t>
+            </w:r>
+          </w:p>
+        </w:tc>
+      </w:tr>
+      <w:tr>
+        <w:tc>
+          <w:tcPr/>
+          <w:p>
+            <w:pPr>
+              <w:pStyle w:val="Compact"/>
+              <w:jc w:val="left"/>
+            </w:pPr>
+            <w:r>
+              <w:t xml:space="preserve">Zone / VWAP / RSI</w:t>
+            </w:r>
+          </w:p>
+        </w:tc>
+        <w:tc>
+          <w:tcPr/>
+          <w:p>
+            <w:pPr>
+              <w:pStyle w:val="Compact"/>
+              <w:jc w:val="left"/>
+            </w:pPr>
+            <w:r>
+              <w:t xml:space="preserve">Live values: the demand zone band, then VWAP and RSI</w:t>
+            </w:r>
+          </w:p>
+        </w:tc>
+        <w:tc>
+          <w:tcPr/>
+          <w:p>
+            <w:pPr>
+              <w:pStyle w:val="Compact"/>
+              <w:jc w:val="left"/>
+            </w:pPr>
+            <w:r>
+              <w:t xml:space="preserve">A sanity check that the filters are seeing what you are</w:t>
+            </w:r>
+          </w:p>
+        </w:tc>
+      </w:tr>
+    </w:tbl>
+    <w:bookmarkEnd w:id="29"/>
+    <w:bookmarkStart w:id="30" w:name="option-chain-top-left-companion-script"/>
+    <w:p>
+      <w:pPr>
+        <w:pStyle w:val="Heading3"/>
+      </w:pPr>
+      <w:r>
+        <w:t xml:space="preserve">Option chain (top left, companion script)</w:t>
+      </w:r>
+    </w:p>
+    <w:p>
+      <w:pPr>
+        <w:pStyle w:val="FirstParagraph"/>
+      </w:pPr>
+      <w:r>
+        <w:t xml:space="preserve">One row per strike around ATM with CE OI, CE change, PE OI and PE change. The ATM row is highlighted and marked with an arrow; the highest-OI CE and PE cells are shaded. Summary rows give totals, PCR, the support and resistance strikes, where today’s writing is concentrated, the overall bias, and the futures buildup. The last row shows live ATM CE and PE premiums with the rupee cost of one lot.</w:t>
+      </w:r>
+    </w:p>
+    <w:bookmarkEnd w:id="30"/>
+    <w:bookmarkEnd w:id="31"/>
+    <w:bookmarkStart w:id="32" w:name="alerts"/>
     <w:p>
       <w:pPr>
         <w:pStyle w:val="Heading2"/>
       </w:pPr>
       <w:r>
-        <w:t xml:space="preserve">8. Daily workflow</w:t>
-      </w:r>
-    </w:p>
-    <w:p>
-      <w:pPr>
-        <w:numPr>
-          <w:ilvl w:val="0"/>
-          <w:numId w:val="1004"/>
-        </w:numPr>
-      </w:pPr>
-      <w:r>
-        <w:t xml:space="preserve">Before the open, glance at the OI table. Note the max-OI call strike (resistance) and put strike (support) — these often bracket the day’s range. Check the VIX regime row and pick your strike accordingly.</w:t>
-      </w:r>
-    </w:p>
-    <w:p>
-      <w:pPr>
-        <w:numPr>
-          <w:ilvl w:val="0"/>
-          <w:numId w:val="1004"/>
-        </w:numPr>
-      </w:pPr>
-      <w:r>
-        <w:t xml:space="preserve">Read the Phase row through the morning. It tells you which kind of entry the day is likely to offer.</w:t>
-      </w:r>
-    </w:p>
-    <w:p>
-      <w:pPr>
-        <w:numPr>
-          <w:ilvl w:val="0"/>
-          <w:numId w:val="1004"/>
-        </w:numPr>
-      </w:pPr>
-      <w:r>
-        <w:t xml:space="preserve">Wait for a circle. Do not anticipate; the filters exist precisely to stop you taking the setups that look obvious but fail. A</w:t>
-      </w:r>
-      <w:r>
-        <w:t xml:space="preserve"> </w:t>
-      </w:r>
-      <w:r>
-        <w:rPr>
-          <w:rStyle w:val="VerbatimChar"/>
-        </w:rPr>
-        <w:t xml:space="preserve">W5</w:t>
-      </w:r>
-      <w:r>
-        <w:t xml:space="preserve"> </w:t>
-      </w:r>
-      <w:r>
-        <w:t xml:space="preserve">tag on your side means stand down for eight bars, no exceptions.</w:t>
-      </w:r>
-    </w:p>
-    <w:p>
-      <w:pPr>
-        <w:numPr>
-          <w:ilvl w:val="0"/>
-          <w:numId w:val="1004"/>
-        </w:numPr>
-      </w:pPr>
-      <w:r>
-        <w:t xml:space="preserve">On a green circle, buy the ATM CE named in the label; on a red circle, buy the ATM PE. Note the premium you actually paid, and note the source on the label — a</w:t>
-      </w:r>
-      <w:r>
-        <w:t xml:space="preserve"> </w:t>
-      </w:r>
-      <w:r>
-        <w:rPr>
-          <w:rStyle w:val="VerbatimChar"/>
-        </w:rPr>
-        <w:t xml:space="preserve">4-flag</w:t>
-      </w:r>
-      <w:r>
-        <w:t xml:space="preserve"> </w:t>
-      </w:r>
-      <w:r>
-        <w:t xml:space="preserve">entry is a continuation trade and behaves differently from a</w:t>
-      </w:r>
-      <w:r>
-        <w:t xml:space="preserve"> </w:t>
-      </w:r>
-      <w:r>
-        <w:rPr>
-          <w:rStyle w:val="VerbatimChar"/>
-        </w:rPr>
-        <w:t xml:space="preserve">zone</w:t>
-      </w:r>
-      <w:r>
-        <w:t xml:space="preserve"> </w:t>
-      </w:r>
-      <w:r>
-        <w:t xml:space="preserve">reversion.</w:t>
-      </w:r>
-    </w:p>
-    <w:p>
-      <w:pPr>
-        <w:numPr>
-          <w:ilvl w:val="0"/>
-          <w:numId w:val="1004"/>
-        </w:numPr>
-      </w:pPr>
-      <w:r>
-        <w:t xml:space="preserve">Set your stop on the premium: subtract the</w:t>
-      </w:r>
-      <w:r>
-        <w:t xml:space="preserve"> </w:t>
-      </w:r>
-      <w:r>
-        <w:t xml:space="preserve">“prem −”</w:t>
-      </w:r>
-      <w:r>
-        <w:t xml:space="preserve"> </w:t>
-      </w:r>
-      <w:r>
-        <w:t xml:space="preserve">figure from the SL label from your entry premium. Do the same with the</w:t>
-      </w:r>
-      <w:r>
-        <w:t xml:space="preserve"> </w:t>
-      </w:r>
-      <w:r>
-        <w:t xml:space="preserve">“prem +”</w:t>
-      </w:r>
-      <w:r>
-        <w:t xml:space="preserve"> </w:t>
-      </w:r>
-      <w:r>
-        <w:t xml:space="preserve">figure for the target.</w:t>
-      </w:r>
-    </w:p>
-    <w:p>
-      <w:pPr>
-        <w:numPr>
-          <w:ilvl w:val="0"/>
-          <w:numId w:val="1004"/>
-        </w:numPr>
-      </w:pPr>
-      <w:r>
-        <w:t xml:space="preserve">Cross-check the OI bias. A long while heavy call writing is being added just above your target is a lower-quality trade; consider taking a smaller size or booking earlier.</w:t>
-      </w:r>
-    </w:p>
-    <w:p>
-      <w:pPr>
-        <w:numPr>
-          <w:ilvl w:val="0"/>
-          <w:numId w:val="1004"/>
-        </w:numPr>
-      </w:pPr>
-      <w:r>
-        <w:t xml:space="preserve">Exit at the stop, the target, or 15:15 — whichever comes first. Never carry.</w:t>
-      </w:r>
-    </w:p>
-    <w:p>
-      <w:pPr>
-        <w:numPr>
-          <w:ilvl w:val="0"/>
-          <w:numId w:val="1004"/>
-        </w:numPr>
-      </w:pPr>
-      <w:r>
-        <w:t xml:space="preserve">At the close, read the Today and DIAG tables and log the result. After two weeks you will know whether the settings suit your market conditions.</w:t>
-      </w:r>
-    </w:p>
-    <w:bookmarkEnd w:id="33"/>
-    <w:bookmarkStart w:id="34" w:name="troubleshooting"/>
-    <w:p>
-      <w:pPr>
-        <w:pStyle w:val="Heading2"/>
-      </w:pPr>
-      <w:r>
-        <w:t xml:space="preserve">9. Troubleshooting</w:t>
+        <w:t xml:space="preserve">7. Alerts</w:t>
+      </w:r>
+    </w:p>
+    <w:p>
+      <w:pPr>
+        <w:pStyle w:val="FirstParagraph"/>
+      </w:pPr>
+      <w:r>
+        <w:t xml:space="preserve">Nine alert conditions are exposed. The first three are the ones to actually set:</w:t>
       </w:r>
     </w:p>
     <w:tbl>
@@ -4788,6 +4761,362 @@
                 <w:b/>
                 <w:bCs/>
               </w:rPr>
+              <w:t xml:space="preserve">Alert</w:t>
+            </w:r>
+          </w:p>
+        </w:tc>
+        <w:tc>
+          <w:tcPr/>
+          <w:p>
+            <w:pPr>
+              <w:pStyle w:val="Compact"/>
+              <w:jc w:val="left"/>
+            </w:pPr>
+            <w:r>
+              <w:rPr>
+                <w:b/>
+                <w:bCs/>
+              </w:rPr>
+              <w:t xml:space="preserve">Fires when</w:t>
+            </w:r>
+          </w:p>
+        </w:tc>
+      </w:tr>
+      <w:tr>
+        <w:tc>
+          <w:tcPr/>
+          <w:p>
+            <w:pPr>
+              <w:pStyle w:val="Compact"/>
+              <w:jc w:val="left"/>
+            </w:pPr>
+            <w:r>
+              <w:t xml:space="preserve">SD-X Buy CE / Buy PE</w:t>
+            </w:r>
+          </w:p>
+        </w:tc>
+        <w:tc>
+          <w:tcPr/>
+          <w:p>
+            <w:pPr>
+              <w:pStyle w:val="Compact"/>
+              <w:jc w:val="left"/>
+            </w:pPr>
+            <w:r>
+              <w:t xml:space="preserve">A signal circle prints</w:t>
+            </w:r>
+          </w:p>
+        </w:tc>
+      </w:tr>
+      <w:tr>
+        <w:tc>
+          <w:tcPr/>
+          <w:p>
+            <w:pPr>
+              <w:pStyle w:val="Compact"/>
+              <w:jc w:val="left"/>
+            </w:pPr>
+            <w:r>
+              <w:t xml:space="preserve">SD-X Square off</w:t>
+            </w:r>
+          </w:p>
+        </w:tc>
+        <w:tc>
+          <w:tcPr/>
+          <w:p>
+            <w:pPr>
+              <w:pStyle w:val="Compact"/>
+              <w:jc w:val="left"/>
+            </w:pPr>
+            <w:r>
+              <w:t xml:space="preserve">An open position reaches the square-off window</w:t>
+            </w:r>
+          </w:p>
+        </w:tc>
+      </w:tr>
+      <w:tr>
+        <w:tc>
+          <w:tcPr/>
+          <w:p>
+            <w:pPr>
+              <w:pStyle w:val="Compact"/>
+              <w:jc w:val="left"/>
+            </w:pPr>
+            <w:r>
+              <w:t xml:space="preserve">SD-X Wave 5 top / bottom</w:t>
+            </w:r>
+          </w:p>
+        </w:tc>
+        <w:tc>
+          <w:tcPr/>
+          <w:p>
+            <w:pPr>
+              <w:pStyle w:val="Compact"/>
+              <w:jc w:val="left"/>
+            </w:pPr>
+            <w:r>
+              <w:t xml:space="preserve">Exhaustion — stop chasing that side</w:t>
+            </w:r>
+          </w:p>
+        </w:tc>
+      </w:tr>
+      <w:tr>
+        <w:tc>
+          <w:tcPr/>
+          <w:p>
+            <w:pPr>
+              <w:pStyle w:val="Compact"/>
+              <w:jc w:val="left"/>
+            </w:pPr>
+            <w:r>
+              <w:t xml:space="preserve">SD-X Whale 4-flag long / short</w:t>
+            </w:r>
+          </w:p>
+        </w:tc>
+        <w:tc>
+          <w:tcPr/>
+          <w:p>
+            <w:pPr>
+              <w:pStyle w:val="Compact"/>
+              <w:jc w:val="left"/>
+            </w:pPr>
+            <w:r>
+              <w:t xml:space="preserve">A continuation run extends</w:t>
+            </w:r>
+          </w:p>
+        </w:tc>
+      </w:tr>
+      <w:tr>
+        <w:tc>
+          <w:tcPr/>
+          <w:p>
+            <w:pPr>
+              <w:pStyle w:val="Compact"/>
+              <w:jc w:val="left"/>
+            </w:pPr>
+            <w:r>
+              <w:t xml:space="preserve">SD-X Absorption at base / ceiling</w:t>
+            </w:r>
+          </w:p>
+        </w:tc>
+        <w:tc>
+          <w:tcPr/>
+          <w:p>
+            <w:pPr>
+              <w:pStyle w:val="Compact"/>
+              <w:jc w:val="left"/>
+            </w:pPr>
+            <w:r>
+              <w:t xml:space="preserve">An absorption wick holds the day’s edge</w:t>
+            </w:r>
+          </w:p>
+        </w:tc>
+      </w:tr>
+    </w:tbl>
+    <w:bookmarkEnd w:id="32"/>
+    <w:bookmarkStart w:id="33" w:name="daily-workflow"/>
+    <w:p>
+      <w:pPr>
+        <w:pStyle w:val="Heading2"/>
+      </w:pPr>
+      <w:r>
+        <w:t xml:space="preserve">8. Daily workflow</w:t>
+      </w:r>
+    </w:p>
+    <w:p>
+      <w:pPr>
+        <w:numPr>
+          <w:ilvl w:val="0"/>
+          <w:numId w:val="1004"/>
+        </w:numPr>
+      </w:pPr>
+      <w:r>
+        <w:t xml:space="preserve">Before the open, glance at the OI table. Note the max-OI call strike (resistance) and put strike (support) — these often bracket the day’s range. Check the VIX regime row and pick your strike accordingly.</w:t>
+      </w:r>
+    </w:p>
+    <w:p>
+      <w:pPr>
+        <w:numPr>
+          <w:ilvl w:val="0"/>
+          <w:numId w:val="1004"/>
+        </w:numPr>
+      </w:pPr>
+      <w:r>
+        <w:t xml:space="preserve">Read the Phase row through the morning. It tells you which kind of entry the day is likely to offer.</w:t>
+      </w:r>
+    </w:p>
+    <w:p>
+      <w:pPr>
+        <w:numPr>
+          <w:ilvl w:val="0"/>
+          <w:numId w:val="1004"/>
+        </w:numPr>
+      </w:pPr>
+      <w:r>
+        <w:t xml:space="preserve">Wait for a circle. Do not anticipate; the filters exist precisely to stop you taking the setups that look obvious but fail. A</w:t>
+      </w:r>
+      <w:r>
+        <w:t xml:space="preserve"> </w:t>
+      </w:r>
+      <w:r>
+        <w:rPr>
+          <w:rStyle w:val="VerbatimChar"/>
+        </w:rPr>
+        <w:t xml:space="preserve">W5</w:t>
+      </w:r>
+      <w:r>
+        <w:t xml:space="preserve"> </w:t>
+      </w:r>
+      <w:r>
+        <w:t xml:space="preserve">tag on your side means stand down for eight bars, no exceptions.</w:t>
+      </w:r>
+    </w:p>
+    <w:p>
+      <w:pPr>
+        <w:numPr>
+          <w:ilvl w:val="0"/>
+          <w:numId w:val="1004"/>
+        </w:numPr>
+      </w:pPr>
+      <w:r>
+        <w:t xml:space="preserve">On a green circle, buy the ATM CE named in the label; on a red circle, buy the ATM PE. Note the premium you actually paid, and note the source on the label — a</w:t>
+      </w:r>
+      <w:r>
+        <w:t xml:space="preserve"> </w:t>
+      </w:r>
+      <w:r>
+        <w:rPr>
+          <w:rStyle w:val="VerbatimChar"/>
+        </w:rPr>
+        <w:t xml:space="preserve">4-flag</w:t>
+      </w:r>
+      <w:r>
+        <w:t xml:space="preserve"> </w:t>
+      </w:r>
+      <w:r>
+        <w:t xml:space="preserve">entry is a continuation trade and behaves differently from a</w:t>
+      </w:r>
+      <w:r>
+        <w:t xml:space="preserve"> </w:t>
+      </w:r>
+      <w:r>
+        <w:rPr>
+          <w:rStyle w:val="VerbatimChar"/>
+        </w:rPr>
+        <w:t xml:space="preserve">zone</w:t>
+      </w:r>
+      <w:r>
+        <w:t xml:space="preserve"> </w:t>
+      </w:r>
+      <w:r>
+        <w:t xml:space="preserve">reversion.</w:t>
+      </w:r>
+    </w:p>
+    <w:p>
+      <w:pPr>
+        <w:numPr>
+          <w:ilvl w:val="0"/>
+          <w:numId w:val="1004"/>
+        </w:numPr>
+      </w:pPr>
+      <w:r>
+        <w:t xml:space="preserve">Set your stop on the premium: subtract the</w:t>
+      </w:r>
+      <w:r>
+        <w:t xml:space="preserve"> </w:t>
+      </w:r>
+      <w:r>
+        <w:t xml:space="preserve">“prem −”</w:t>
+      </w:r>
+      <w:r>
+        <w:t xml:space="preserve"> </w:t>
+      </w:r>
+      <w:r>
+        <w:t xml:space="preserve">figure from the SL label from your entry premium. Do the same with the</w:t>
+      </w:r>
+      <w:r>
+        <w:t xml:space="preserve"> </w:t>
+      </w:r>
+      <w:r>
+        <w:t xml:space="preserve">“prem +”</w:t>
+      </w:r>
+      <w:r>
+        <w:t xml:space="preserve"> </w:t>
+      </w:r>
+      <w:r>
+        <w:t xml:space="preserve">figure for the target.</w:t>
+      </w:r>
+    </w:p>
+    <w:p>
+      <w:pPr>
+        <w:numPr>
+          <w:ilvl w:val="0"/>
+          <w:numId w:val="1004"/>
+        </w:numPr>
+      </w:pPr>
+      <w:r>
+        <w:t xml:space="preserve">Cross-check the OI bias. A long while heavy call writing is being added just above your target is a lower-quality trade; consider taking a smaller size or booking earlier.</w:t>
+      </w:r>
+    </w:p>
+    <w:p>
+      <w:pPr>
+        <w:numPr>
+          <w:ilvl w:val="0"/>
+          <w:numId w:val="1004"/>
+        </w:numPr>
+      </w:pPr>
+      <w:r>
+        <w:t xml:space="preserve">Exit at the stop, the target, or 15:15 — whichever comes first. Never carry.</w:t>
+      </w:r>
+    </w:p>
+    <w:p>
+      <w:pPr>
+        <w:numPr>
+          <w:ilvl w:val="0"/>
+          <w:numId w:val="1004"/>
+        </w:numPr>
+      </w:pPr>
+      <w:r>
+        <w:t xml:space="preserve">At the close, read the Today and DIAG tables and log the result. After two weeks you will know whether the settings suit your market conditions.</w:t>
+      </w:r>
+    </w:p>
+    <w:bookmarkEnd w:id="33"/>
+    <w:bookmarkStart w:id="34" w:name="troubleshooting"/>
+    <w:p>
+      <w:pPr>
+        <w:pStyle w:val="Heading2"/>
+      </w:pPr>
+      <w:r>
+        <w:t xml:space="preserve">9. Troubleshooting</w:t>
+      </w:r>
+    </w:p>
+    <w:tbl>
+      <w:tblPr>
+        <w:tblStyle w:val="Table"/>
+        <w:tblW w:type="pct" w:w="5000"/>
+        <w:tblLayout w:type="fixed"/>
+        <w:tblLook w:firstRow="1" w:lastRow="0" w:firstColumn="0" w:lastColumn="0" w:noHBand="0" w:noVBand="0" w:val="0020"/>
+      </w:tblPr>
+      <w:tblGrid>
+        <w:gridCol w:w="3960"/>
+        <w:gridCol w:w="3960"/>
+      </w:tblGrid>
+      <w:tr>
+        <w:trPr>
+          <w:tblHeader w:val="on"/>
+        </w:trPr>
+        <w:tc>
+          <w:tcPr/>
+          <w:p>
+            <w:pPr>
+              <w:pStyle w:val="Compact"/>
+              <w:jc w:val="left"/>
+            </w:pPr>
+            <w:r>
+              <w:rPr>
+                <w:b/>
+                <w:bCs/>
+              </w:rPr>
               <w:t xml:space="preserve">Symptom</w:t>
             </w:r>
           </w:p>
@@ -5132,6 +5461,21 @@
                 <w:rStyle w:val="VerbatimChar"/>
               </w:rPr>
               <w:t xml:space="preserve">oi_chain.py</w:t>
+            </w:r>
+            <w:r>
+              <w:t xml:space="preserve"> </w:t>
+            </w:r>
+            <w:r>
+              <w:t xml:space="preserve">or</w:t>
+            </w:r>
+            <w:r>
+              <w:t xml:space="preserve"> </w:t>
+            </w:r>
+            <w:r>
+              <w:rPr>
+                <w:rStyle w:val="VerbatimChar"/>
+              </w:rPr>
+              <w:t xml:space="preserve">oi_desktop.py</w:t>
             </w:r>
             <w:r>
               <w:t xml:space="preserve">.</w:t>

</xml_diff>

<commit_message>
Strutural compression Opening range+ day bias 1:1 / 1:2 / 1:3 ladder Zone attack counter
</commit_message>
<xml_diff>
--- a/Nifty-Intra-OI/SD-X_v11_User_Guide.docx
+++ b/Nifty-Intra-OI/SD-X_v11_User_Guide.docx
@@ -2,7 +2,7 @@
 <file path=word/document.xml><?xml version="1.0" encoding="utf-8"?>
 <w:document xmlns:w="http://schemas.openxmlformats.org/wordprocessingml/2006/main" xmlns:m="http://schemas.openxmlformats.org/officeDocument/2006/math" xmlns:r="http://schemas.openxmlformats.org/officeDocument/2006/relationships" xmlns:o="urn:schemas-microsoft-com:office:office" xmlns:v="urn:schemas-microsoft-com:vml" xmlns:w10="urn:schemas-microsoft-com:office:word" xmlns:a="http://schemas.openxmlformats.org/drawingml/2006/main" xmlns:pic="http://schemas.openxmlformats.org/drawingml/2006/picture" xmlns:wp="http://schemas.openxmlformats.org/drawingml/2006/wordprocessingDrawing">
   <w:body>
-    <w:bookmarkStart w:id="36" w:name="sd-x-v11"/>
+    <w:bookmarkStart w:id="39" w:name="sd-x-v11"/>
     <w:p>
       <w:pPr>
         <w:pStyle w:val="Heading1"/>
@@ -70,6 +70,59 @@
       </w:r>
       <w:r>
         <w:t xml:space="preserve">— order-flow reading through bar colour, candle shape, flag runs and climax shelves — which contributes two continuation entry sources of its own and a set of vetoes that stop the reversion trades you should not be taking. It is still deliberately selective: on a strong one-way trend day it will often produce no signals at all.</w:t>
+      </w:r>
+    </w:p>
+    <w:p>
+      <w:pPr>
+        <w:pStyle w:val="BodyText"/>
+      </w:pPr>
+      <w:r>
+        <w:t xml:space="preserve">This version also ports three ideas from a GTI trading session: the</w:t>
+      </w:r>
+      <w:r>
+        <w:t xml:space="preserve"> </w:t>
+      </w:r>
+      <w:r>
+        <w:rPr>
+          <w:b/>
+          <w:bCs/>
+        </w:rPr>
+        <w:t xml:space="preserve">opening candle</w:t>
+      </w:r>
+      <w:r>
+        <w:t xml:space="preserve"> </w:t>
+      </w:r>
+      <w:r>
+        <w:t xml:space="preserve">and the day bias it sets,</w:t>
+      </w:r>
+      <w:r>
+        <w:t xml:space="preserve"> </w:t>
+      </w:r>
+      <w:r>
+        <w:rPr>
+          <w:b/>
+          <w:bCs/>
+        </w:rPr>
+        <w:t xml:space="preserve">structural compression</w:t>
+      </w:r>
+      <w:r>
+        <w:t xml:space="preserve"> </w:t>
+      </w:r>
+      <w:r>
+        <w:t xml:space="preserve">of the battlefield between the zones, and the</w:t>
+      </w:r>
+      <w:r>
+        <w:t xml:space="preserve"> </w:t>
+      </w:r>
+      <w:r>
+        <w:rPr>
+          <w:b/>
+          <w:bCs/>
+        </w:rPr>
+        <w:t xml:space="preserve">zone attack counter</w:t>
+      </w:r>
+      <w:r>
+        <w:t xml:space="preserve">. All three are described in sections 3.8 to 3.10. Two of them can act as hard gates that silence the script on most days, and both are off by default — read section 10 before turning them on.</w:t>
       </w:r>
     </w:p>
     <w:p>
@@ -279,7 +332,7 @@
       <w:r>
         <w:drawing>
           <wp:inline>
-            <wp:extent cx="5334000" cy="5076190"/>
+            <wp:extent cx="5334000" cy="5709602"/>
             <wp:effectExtent b="0" l="0" r="0" t="0"/>
             <wp:docPr descr="SD-X v11 chart legend" title="" id="11" name="Picture"/>
             <a:graphic>
@@ -300,7 +353,7 @@
                   <pic:spPr bwMode="auto">
                     <a:xfrm>
                       <a:off x="0" y="0"/>
-                      <a:ext cx="5334000" cy="5076190"/>
+                      <a:ext cx="5334000" cy="5709602"/>
                     </a:xfrm>
                     <a:prstGeom prst="rect">
                       <a:avLst/>
@@ -380,7 +433,7 @@
       </w:r>
     </w:p>
     <w:bookmarkEnd w:id="13"/>
-    <w:bookmarkStart w:id="23" w:name="technical-indicators-used"/>
+    <w:bookmarkStart w:id="26" w:name="technical-indicators-used"/>
     <w:p>
       <w:pPr>
         <w:pStyle w:val="Heading2"/>
@@ -2013,13 +2066,746 @@
       </w:r>
     </w:p>
     <w:bookmarkEnd w:id="20"/>
-    <w:bookmarkStart w:id="21" w:name="india-vix-regime"/>
+    <w:bookmarkStart w:id="21" w:name="opening-range-and-day-bias"/>
     <w:p>
       <w:pPr>
         <w:pStyle w:val="Heading3"/>
       </w:pPr>
       <w:r>
-        <w:t xml:space="preserve">3.8 India VIX regime</w:t>
+        <w:t xml:space="preserve">3.8 Opening range and day bias</w:t>
+      </w:r>
+    </w:p>
+    <w:p>
+      <w:pPr>
+        <w:pStyle w:val="FirstParagraph"/>
+      </w:pPr>
+      <w:r>
+        <w:t xml:space="preserve">Three thick blue lines’ worth of structure, added in this version and adapted from a GTI session: the opening candle owns the day.</w:t>
+      </w:r>
+    </w:p>
+    <w:p>
+      <w:pPr>
+        <w:pStyle w:val="BodyText"/>
+      </w:pPr>
+      <w:r>
+        <w:rPr>
+          <w:b/>
+          <w:bCs/>
+        </w:rPr>
+        <w:t xml:space="preserve">The opening candle.</w:t>
+      </w:r>
+      <w:r>
+        <w:t xml:space="preserve"> </w:t>
+      </w:r>
+      <w:r>
+        <w:t xml:space="preserve">The script accumulates the first</w:t>
+      </w:r>
+      <w:r>
+        <w:t xml:space="preserve"> </w:t>
+      </w:r>
+      <w:r>
+        <w:rPr>
+          <w:i/>
+          <w:iCs/>
+        </w:rPr>
+        <w:t xml:space="preserve">N</w:t>
+      </w:r>
+      <w:r>
+        <w:t xml:space="preserve"> </w:t>
+      </w:r>
+      <w:r>
+        <w:t xml:space="preserve">minutes of the session into one synthetic candle (default 9 minutes; use 5 or 15 if that suits your chart). Its high and low are drawn as a thick blue pair.</w:t>
+      </w:r>
+    </w:p>
+    <w:p>
+      <w:pPr>
+        <w:pStyle w:val="BodyText"/>
+      </w:pPr>
+      <w:r>
+        <w:rPr>
+          <w:b/>
+          <w:bCs/>
+        </w:rPr>
+        <w:t xml:space="preserve">The fake-candle rule.</w:t>
+      </w:r>
+      <w:r>
+        <w:t xml:space="preserve"> </w:t>
+      </w:r>
+      <w:r>
+        <w:t xml:space="preserve">If that candle opens exactly on its own high, or exactly on its own low, no two-way auction happened inside it — one side simply pushed from the bell. GTI treats such a candle as information-free and uses the</w:t>
+      </w:r>
+      <w:r>
+        <w:t xml:space="preserve"> </w:t>
+      </w:r>
+      <w:r>
+        <w:rPr>
+          <w:b/>
+          <w:bCs/>
+        </w:rPr>
+        <w:t xml:space="preserve">second</w:t>
+      </w:r>
+      <w:r>
+        <w:t xml:space="preserve"> </w:t>
+      </w:r>
+      <w:r>
+        <w:t xml:space="preserve">candle of the same length instead. The Day bias row is tagged</w:t>
+      </w:r>
+      <w:r>
+        <w:t xml:space="preserve"> </w:t>
+      </w:r>
+      <w:r>
+        <w:rPr>
+          <w:rStyle w:val="VerbatimChar"/>
+        </w:rPr>
+        <w:t xml:space="preserve">c2</w:t>
+      </w:r>
+      <w:r>
+        <w:t xml:space="preserve"> </w:t>
+      </w:r>
+      <w:r>
+        <w:t xml:space="preserve">when this substitution happened.</w:t>
+      </w:r>
+      <w:r>
+        <w:t xml:space="preserve"> </w:t>
+      </w:r>
+      <w:r>
+        <w:t xml:space="preserve">“Fake-candle tolerance”</w:t>
+      </w:r>
+      <w:r>
+        <w:t xml:space="preserve"> </w:t>
+      </w:r>
+      <w:r>
+        <w:t xml:space="preserve">widens the equality test from exact to a few points; leave it at 0 unless your feed’s opening print is noisy.</w:t>
+      </w:r>
+    </w:p>
+    <w:p>
+      <w:pPr>
+        <w:pStyle w:val="BodyText"/>
+      </w:pPr>
+      <w:r>
+        <w:rPr>
+          <w:b/>
+          <w:bCs/>
+        </w:rPr>
+        <w:t xml:space="preserve">The bias.</w:t>
+      </w:r>
+      <w:r>
+        <w:t xml:space="preserve"> </w:t>
+      </w:r>
+      <w:r>
+        <w:t xml:space="preserve">The first close through either edge of the reference candle sets the day’s direction and</w:t>
+      </w:r>
+      <w:r>
+        <w:t xml:space="preserve"> </w:t>
+      </w:r>
+      <w:r>
+        <w:rPr>
+          <w:b/>
+          <w:bCs/>
+        </w:rPr>
+        <w:t xml:space="preserve">latches it for the session</w:t>
+      </w:r>
+      <w:r>
+        <w:t xml:space="preserve">: a break up means buy-on-dip only, a break down means sell-on-rise only. A day that breaks up and then breaks down does not flip — GTI does not trade the second break.</w:t>
+      </w:r>
+    </w:p>
+    <w:p>
+      <w:pPr>
+        <w:pStyle w:val="BodyText"/>
+      </w:pPr>
+      <w:r>
+        <w:rPr>
+          <w:b/>
+          <w:bCs/>
+        </w:rPr>
+        <w:t xml:space="preserve">The ladder.</w:t>
+      </w:r>
+      <w:r>
+        <w:t xml:space="preserve"> </w:t>
+      </w:r>
+      <w:r>
+        <w:t xml:space="preserve">The reference candle’s own height, projected in 1:1, 1:2 and 1:3 multiples from each edge, drawn as fading blue lines. These are the day’s realistic profit stations, measured off the auction rather than off your stop. Set Target mode to</w:t>
+      </w:r>
+      <w:r>
+        <w:t xml:space="preserve"> </w:t>
+      </w:r>
+      <w:r>
+        <w:t xml:space="preserve">“Opening-range ladder”</w:t>
+      </w:r>
+      <w:r>
+        <w:t xml:space="preserve"> </w:t>
+      </w:r>
+      <w:r>
+        <w:t xml:space="preserve">and the script aims at the next unreached rung. Once 1:3 is tagged, institutions are booking — the original direction is spent, which is why</w:t>
+      </w:r>
+      <w:r>
+        <w:t xml:space="preserve"> </w:t>
+      </w:r>
+      <w:r>
+        <w:t xml:space="preserve">“Veto further entries once 1:N is reached”</w:t>
+      </w:r>
+      <w:r>
+        <w:t xml:space="preserve"> </w:t>
+      </w:r>
+      <w:r>
+        <w:t xml:space="preserve">exists.</w:t>
+      </w:r>
+    </w:p>
+    <w:tbl>
+      <w:tblPr>
+        <w:tblStyle w:val="Table"/>
+        <w:tblW w:type="pct" w:w="5000"/>
+        <w:tblLayout w:type="fixed"/>
+        <w:tblLook w:firstRow="1" w:lastRow="0" w:firstColumn="0" w:lastColumn="0" w:noHBand="0" w:noVBand="0" w:val="0020"/>
+      </w:tblPr>
+      <w:tblGrid>
+        <w:gridCol w:w="2640"/>
+        <w:gridCol w:w="2640"/>
+        <w:gridCol w:w="2640"/>
+      </w:tblGrid>
+      <w:tr>
+        <w:trPr>
+          <w:tblHeader w:val="on"/>
+        </w:trPr>
+        <w:tc>
+          <w:tcPr/>
+          <w:p>
+            <w:pPr>
+              <w:pStyle w:val="Compact"/>
+              <w:jc w:val="left"/>
+            </w:pPr>
+            <w:r>
+              <w:rPr>
+                <w:b/>
+                <w:bCs/>
+              </w:rPr>
+              <w:t xml:space="preserve">Setting</w:t>
+            </w:r>
+          </w:p>
+        </w:tc>
+        <w:tc>
+          <w:tcPr/>
+          <w:p>
+            <w:pPr>
+              <w:pStyle w:val="Compact"/>
+              <w:jc w:val="left"/>
+            </w:pPr>
+            <w:r>
+              <w:rPr>
+                <w:b/>
+                <w:bCs/>
+              </w:rPr>
+              <w:t xml:space="preserve">Default</w:t>
+            </w:r>
+          </w:p>
+        </w:tc>
+        <w:tc>
+          <w:tcPr/>
+          <w:p>
+            <w:pPr>
+              <w:pStyle w:val="Compact"/>
+              <w:jc w:val="left"/>
+            </w:pPr>
+            <w:r>
+              <w:rPr>
+                <w:b/>
+                <w:bCs/>
+              </w:rPr>
+              <w:t xml:space="preserve">Effect</w:t>
+            </w:r>
+          </w:p>
+        </w:tc>
+      </w:tr>
+      <w:tr>
+        <w:tc>
+          <w:tcPr/>
+          <w:p>
+            <w:pPr>
+              <w:pStyle w:val="Compact"/>
+              <w:jc w:val="left"/>
+            </w:pPr>
+            <w:r>
+              <w:t xml:space="preserve">Track the opening candle</w:t>
+            </w:r>
+          </w:p>
+        </w:tc>
+        <w:tc>
+          <w:tcPr/>
+          <w:p>
+            <w:pPr>
+              <w:pStyle w:val="Compact"/>
+              <w:jc w:val="left"/>
+            </w:pPr>
+            <w:r>
+              <w:t xml:space="preserve">On</w:t>
+            </w:r>
+          </w:p>
+        </w:tc>
+        <w:tc>
+          <w:tcPr/>
+          <w:p>
+            <w:pPr>
+              <w:pStyle w:val="Compact"/>
+              <w:jc w:val="left"/>
+            </w:pPr>
+            <w:r>
+              <w:t xml:space="preserve">Builds the range and the bias; drawing and the Day bias row depend on it</w:t>
+            </w:r>
+          </w:p>
+        </w:tc>
+      </w:tr>
+      <w:tr>
+        <w:tc>
+          <w:tcPr/>
+          <w:p>
+            <w:pPr>
+              <w:pStyle w:val="Compact"/>
+              <w:jc w:val="left"/>
+            </w:pPr>
+            <w:r>
+              <w:t xml:space="preserve">Opening candle length</w:t>
+            </w:r>
+          </w:p>
+        </w:tc>
+        <w:tc>
+          <w:tcPr/>
+          <w:p>
+            <w:pPr>
+              <w:pStyle w:val="Compact"/>
+              <w:jc w:val="left"/>
+            </w:pPr>
+            <w:r>
+              <w:t xml:space="preserve">9 minutes</w:t>
+            </w:r>
+          </w:p>
+        </w:tc>
+        <w:tc>
+          <w:tcPr/>
+          <w:p>
+            <w:pPr>
+              <w:pStyle w:val="Compact"/>
+              <w:jc w:val="left"/>
+            </w:pPr>
+            <w:r>
+              <w:t xml:space="preserve">GTI’s own preference. 5 and 15 both work; 9 has no special magic</w:t>
+            </w:r>
+          </w:p>
+        </w:tc>
+      </w:tr>
+      <w:tr>
+        <w:tc>
+          <w:tcPr/>
+          <w:p>
+            <w:pPr>
+              <w:pStyle w:val="Compact"/>
+              <w:jc w:val="left"/>
+            </w:pPr>
+            <w:r>
+              <w:t xml:space="preserve">Fake-candle tolerance</w:t>
+            </w:r>
+          </w:p>
+        </w:tc>
+        <w:tc>
+          <w:tcPr/>
+          <w:p>
+            <w:pPr>
+              <w:pStyle w:val="Compact"/>
+              <w:jc w:val="left"/>
+            </w:pPr>
+            <w:r>
+              <w:t xml:space="preserve">0 points</w:t>
+            </w:r>
+          </w:p>
+        </w:tc>
+        <w:tc>
+          <w:tcPr/>
+          <w:p>
+            <w:pPr>
+              <w:pStyle w:val="Compact"/>
+              <w:jc w:val="left"/>
+            </w:pPr>
+            <w:r>
+              <w:t xml:space="preserve">How close to its own high/low the open must be to count as fake</w:t>
+            </w:r>
+          </w:p>
+        </w:tc>
+      </w:tr>
+      <w:tr>
+        <w:tc>
+          <w:tcPr/>
+          <w:p>
+            <w:pPr>
+              <w:pStyle w:val="Compact"/>
+              <w:jc w:val="left"/>
+            </w:pPr>
+            <w:r>
+              <w:t xml:space="preserve">Trade only in the opening-break direction</w:t>
+            </w:r>
+          </w:p>
+        </w:tc>
+        <w:tc>
+          <w:tcPr/>
+          <w:p>
+            <w:pPr>
+              <w:pStyle w:val="Compact"/>
+              <w:jc w:val="left"/>
+            </w:pPr>
+            <w:r>
+              <w:rPr>
+                <w:b/>
+                <w:bCs/>
+              </w:rPr>
+              <w:t xml:space="preserve">Off</w:t>
+            </w:r>
+          </w:p>
+        </w:tc>
+        <w:tc>
+          <w:tcPr/>
+          <w:p>
+            <w:pPr>
+              <w:pStyle w:val="Compact"/>
+              <w:jc w:val="left"/>
+            </w:pPr>
+            <w:r>
+              <w:t xml:space="preserve">The hard gate. Turn it on to enforce one-side-per-day</w:t>
+            </w:r>
+          </w:p>
+        </w:tc>
+      </w:tr>
+      <w:tr>
+        <w:tc>
+          <w:tcPr/>
+          <w:p>
+            <w:pPr>
+              <w:pStyle w:val="Compact"/>
+              <w:jc w:val="left"/>
+            </w:pPr>
+            <w:r>
+              <w:t xml:space="preserve">Ladder rungs</w:t>
+            </w:r>
+          </w:p>
+        </w:tc>
+        <w:tc>
+          <w:tcPr/>
+          <w:p>
+            <w:pPr>
+              <w:pStyle w:val="Compact"/>
+              <w:jc w:val="left"/>
+            </w:pPr>
+            <w:r>
+              <w:t xml:space="preserve">3</w:t>
+            </w:r>
+          </w:p>
+        </w:tc>
+        <w:tc>
+          <w:tcPr/>
+          <w:p>
+            <w:pPr>
+              <w:pStyle w:val="Compact"/>
+              <w:jc w:val="left"/>
+            </w:pPr>
+            <w:r>
+              <w:t xml:space="preserve">How many 1:N projections to draw and target</w:t>
+            </w:r>
+          </w:p>
+        </w:tc>
+      </w:tr>
+      <w:tr>
+        <w:tc>
+          <w:tcPr/>
+          <w:p>
+            <w:pPr>
+              <w:pStyle w:val="Compact"/>
+              <w:jc w:val="left"/>
+            </w:pPr>
+            <w:r>
+              <w:t xml:space="preserve">Veto further entries once 1:N is reached</w:t>
+            </w:r>
+          </w:p>
+        </w:tc>
+        <w:tc>
+          <w:tcPr/>
+          <w:p>
+            <w:pPr>
+              <w:pStyle w:val="Compact"/>
+              <w:jc w:val="left"/>
+            </w:pPr>
+            <w:r>
+              <w:t xml:space="preserve">Off</w:t>
+            </w:r>
+          </w:p>
+        </w:tc>
+        <w:tc>
+          <w:tcPr/>
+          <w:p>
+            <w:pPr>
+              <w:pStyle w:val="Compact"/>
+              <w:jc w:val="left"/>
+            </w:pPr>
+            <w:r>
+              <w:t xml:space="preserve">Stops adding to a move that has already paid out</w:t>
+            </w:r>
+          </w:p>
+        </w:tc>
+      </w:tr>
+    </w:tbl>
+    <w:bookmarkEnd w:id="21"/>
+    <w:bookmarkStart w:id="22" w:name="structural-compression-the-battlefield"/>
+    <w:p>
+      <w:pPr>
+        <w:pStyle w:val="Heading3"/>
+      </w:pPr>
+      <w:r>
+        <w:t xml:space="preserve">3.9 Structural compression — the battlefield</w:t>
+      </w:r>
+    </w:p>
+    <w:p>
+      <w:pPr>
+        <w:pStyle w:val="FirstParagraph"/>
+      </w:pPr>
+      <w:r>
+        <w:t xml:space="preserve">Distinct from the purple squeeze shading, which is a Bollinger-inside-Keltner volatility read on a single bar.</w:t>
+      </w:r>
+      <w:r>
+        <w:t xml:space="preserve"> </w:t>
+      </w:r>
+      <w:r>
+        <w:rPr>
+          <w:b/>
+          <w:bCs/>
+        </w:rPr>
+        <w:t xml:space="preserve">Structural compression is the clear air between the demand zone’s ceiling and the supply zone’s floor</w:t>
+      </w:r>
+      <w:r>
+        <w:t xml:space="preserve"> </w:t>
+      </w:r>
+      <w:r>
+        <w:t xml:space="preserve">— the ground the two sides are still fighting over. When it collapses, buyers and sellers are transacting in the same prices and nobody can tell them apart, so the move that resolves it has to be large enough to separate them again.</w:t>
+      </w:r>
+    </w:p>
+    <w:p>
+      <w:pPr>
+        <w:pStyle w:val="BodyText"/>
+      </w:pPr>
+      <w:r>
+        <w:t xml:space="preserve">It is measured once, at the day’s first bar, from the zone edges the script is already drawing, and reported in the</w:t>
+      </w:r>
+      <w:r>
+        <w:t xml:space="preserve"> </w:t>
+      </w:r>
+      <w:r>
+        <w:rPr>
+          <w:b/>
+          <w:bCs/>
+        </w:rPr>
+        <w:t xml:space="preserve">Battlefield</w:t>
+      </w:r>
+      <w:r>
+        <w:t xml:space="preserve"> </w:t>
+      </w:r>
+      <w:r>
+        <w:t xml:space="preserve">row of the Today table as a point figure plus</w:t>
+      </w:r>
+      <w:r>
+        <w:t xml:space="preserve"> </w:t>
+      </w:r>
+      <w:r>
+        <w:rPr>
+          <w:rStyle w:val="VerbatimChar"/>
+        </w:rPr>
+        <w:t xml:space="preserve">COMPRESSED</w:t>
+      </w:r>
+      <w:r>
+        <w:t xml:space="preserve"> </w:t>
+      </w:r>
+      <w:r>
+        <w:t xml:space="preserve">or</w:t>
+      </w:r>
+      <w:r>
+        <w:t xml:space="preserve"> </w:t>
+      </w:r>
+      <w:r>
+        <w:rPr>
+          <w:rStyle w:val="VerbatimChar"/>
+        </w:rPr>
+        <w:t xml:space="preserve">open</w:t>
+      </w:r>
+      <w:r>
+        <w:t xml:space="preserve">. Compressed means the gap is under 0.75 ATR by default.</w:t>
+      </w:r>
+    </w:p>
+    <w:p>
+      <w:pPr>
+        <w:pStyle w:val="BodyText"/>
+      </w:pPr>
+      <w:r>
+        <w:t xml:space="preserve">This is the precondition GTI puts under everything else: a compressed morning is what makes the opening break worth trusting.</w:t>
+      </w:r>
+      <w:r>
+        <w:t xml:space="preserve"> </w:t>
+      </w:r>
+      <w:r>
+        <w:t xml:space="preserve">“Only take entries on compressed days”</w:t>
+      </w:r>
+      <w:r>
+        <w:t xml:space="preserve"> </w:t>
+      </w:r>
+      <w:r>
+        <w:t xml:space="preserve">enforces it. It is off by default because it will silence the script entirely on many perfectly tradeable days.</w:t>
+      </w:r>
+    </w:p>
+    <w:bookmarkEnd w:id="22"/>
+    <w:bookmarkStart w:id="23" w:name="zone-attack-counter"/>
+    <w:p>
+      <w:pPr>
+        <w:pStyle w:val="Heading3"/>
+      </w:pPr>
+      <w:r>
+        <w:t xml:space="preserve">3.10 Zone attack counter</w:t>
+      </w:r>
+    </w:p>
+    <w:p>
+      <w:pPr>
+        <w:pStyle w:val="FirstParagraph"/>
+      </w:pPr>
+      <w:r>
+        <w:t xml:space="preserve">The GTI framing: a zone is a wall until the third or fourth time somebody hits it. The first two attacks get ignored, the third gets a response, the fourth starts the fight.</w:t>
+      </w:r>
+    </w:p>
+    <w:p>
+      <w:pPr>
+        <w:pStyle w:val="BodyText"/>
+      </w:pPr>
+      <w:r>
+        <w:t xml:space="preserve">The script counts</w:t>
+      </w:r>
+      <w:r>
+        <w:t xml:space="preserve"> </w:t>
+      </w:r>
+      <w:r>
+        <w:rPr>
+          <w:b/>
+          <w:bCs/>
+        </w:rPr>
+        <w:t xml:space="preserve">black (institutional selling) candles that land inside the demand zone</w:t>
+      </w:r>
+      <w:r>
+        <w:t xml:space="preserve">, and</w:t>
+      </w:r>
+      <w:r>
+        <w:t xml:space="preserve"> </w:t>
+      </w:r>
+      <w:r>
+        <w:rPr>
+          <w:b/>
+          <w:bCs/>
+        </w:rPr>
+        <w:t xml:space="preserve">blue (institutional buying) candles that land inside the supply zone</w:t>
+      </w:r>
+      <w:r>
+        <w:t xml:space="preserve">, numbering each one on the chart. The count is wiped the moment price clears the opposite zone — the day’s read has been neutralised and starts again.</w:t>
+      </w:r>
+    </w:p>
+    <w:p>
+      <w:pPr>
+        <w:pStyle w:val="BodyText"/>
+      </w:pPr>
+      <w:r>
+        <w:t xml:space="preserve">At the threshold (default 3) the zone has demonstrably held, and the trade is the break of the last attack candle</w:t>
+      </w:r>
+      <w:r>
+        <w:t xml:space="preserve"> </w:t>
+      </w:r>
+      <w:r>
+        <w:rPr>
+          <w:b/>
+          <w:bCs/>
+        </w:rPr>
+        <w:t xml:space="preserve">away from the zone</w:t>
+      </w:r>
+      <w:r>
+        <w:t xml:space="preserve">:</w:t>
+      </w:r>
+    </w:p>
+    <w:p>
+      <w:pPr>
+        <w:pStyle w:val="Compact"/>
+        <w:numPr>
+          <w:ilvl w:val="0"/>
+          <w:numId w:val="1003"/>
+        </w:numPr>
+      </w:pPr>
+      <w:r>
+        <w:t xml:space="preserve">3+ black candles in demand, then a close above the last one’s high → long, stop under that candle’s low.</w:t>
+      </w:r>
+    </w:p>
+    <w:p>
+      <w:pPr>
+        <w:pStyle w:val="Compact"/>
+        <w:numPr>
+          <w:ilvl w:val="0"/>
+          <w:numId w:val="1003"/>
+        </w:numPr>
+      </w:pPr>
+      <w:r>
+        <w:t xml:space="preserve">3+ blue candles in supply, then a close below the last one’s low → short, stop above that candle’s high.</w:t>
+      </w:r>
+    </w:p>
+    <w:p>
+      <w:pPr>
+        <w:pStyle w:val="FirstParagraph"/>
+      </w:pPr>
+      <w:r>
+        <w:t xml:space="preserve">The fired-latch is keyed to the count, so if the third attack’s trade stops out, a fourth attack re-arms the setup — which is exactly the sequence GTI describes.</w:t>
+      </w:r>
+    </w:p>
+    <w:p>
+      <w:pPr>
+        <w:pStyle w:val="BodyText"/>
+      </w:pPr>
+      <w:r>
+        <w:t xml:space="preserve">This entry source is labelled</w:t>
+      </w:r>
+      <w:r>
+        <w:t xml:space="preserve"> </w:t>
+      </w:r>
+      <w:r>
+        <w:rPr>
+          <w:rStyle w:val="VerbatimChar"/>
+        </w:rPr>
+        <w:t xml:space="preserve">attack</w:t>
+      </w:r>
+      <w:r>
+        <w:t xml:space="preserve"> </w:t>
+      </w:r>
+      <w:r>
+        <w:t xml:space="preserve">on the entry label. It depends on the whale bar colours, so</w:t>
+      </w:r>
+      <w:r>
+        <w:t xml:space="preserve"> </w:t>
+      </w:r>
+      <w:r>
+        <w:rPr>
+          <w:b/>
+          <w:bCs/>
+        </w:rPr>
+        <w:t xml:space="preserve">on a feed with no volume it will produce far fewer signals</w:t>
+      </w:r>
+      <w:r>
+        <w:t xml:space="preserve"> </w:t>
+      </w:r>
+      <w:r>
+        <w:t xml:space="preserve">(see the note on volume in 3.6).</w:t>
+      </w:r>
+    </w:p>
+    <w:bookmarkEnd w:id="23"/>
+    <w:bookmarkStart w:id="24" w:name="india-vix-regime"/>
+    <w:p>
+      <w:pPr>
+        <w:pStyle w:val="Heading3"/>
+      </w:pPr>
+      <w:r>
+        <w:t xml:space="preserve">3.11 India VIX regime</w:t>
       </w:r>
     </w:p>
     <w:p>
@@ -2229,14 +3015,14 @@
         <w:t xml:space="preserve">The point is that in a high-VIX session an OTM option can lose money on a correct directional call, because implied volatility collapses faster than delta pays. Going ITM trades premium cost for a smaller vega exposure.</w:t>
       </w:r>
     </w:p>
-    <w:bookmarkEnd w:id="21"/>
-    <w:bookmarkStart w:id="22" w:name="open-interest-companion-script"/>
+    <w:bookmarkEnd w:id="24"/>
+    <w:bookmarkStart w:id="25" w:name="open-interest-companion-script"/>
     <w:p>
       <w:pPr>
         <w:pStyle w:val="Heading3"/>
       </w:pPr>
       <w:r>
-        <w:t xml:space="preserve">3.9 Open interest (companion script)</w:t>
+        <w:t xml:space="preserve">3.12 Open interest (companion script)</w:t>
       </w:r>
     </w:p>
     <w:p>
@@ -2819,9 +3605,9 @@
         <w:t xml:space="preserve">is the same data as a small always-on-top window instead of a terminal dump: pick the symbol (NIFTY/BANKNIFTY/FINNIFTY/MIDCPNIFTY) and expiry, set how many strikes each side of ATM and the auto-refresh interval, and it polls NSE on its own, pausing automatically once the feed’s own timestamp shows the market closed.</w:t>
       </w:r>
     </w:p>
-    <w:bookmarkEnd w:id="22"/>
-    <w:bookmarkEnd w:id="23"/>
-    <w:bookmarkStart w:id="26" w:name="how-a-signal-is-produced"/>
+    <w:bookmarkEnd w:id="25"/>
+    <w:bookmarkEnd w:id="26"/>
+    <w:bookmarkStart w:id="29" w:name="how-a-signal-is-produced"/>
     <w:p>
       <w:pPr>
         <w:pStyle w:val="Heading2"/>
@@ -3038,7 +3824,7 @@
               <w:jc w:val="left"/>
             </w:pPr>
             <w:r>
-              <w:t xml:space="preserve">Structural-target mode only: at least</w:t>
+              <w:t xml:space="preserve">At least</w:t>
             </w:r>
             <w:r>
               <w:t xml:space="preserve"> </w:t>
@@ -3050,7 +3836,40 @@
               <w:t xml:space="preserve"> </w:t>
             </w:r>
             <w:r>
-              <w:t xml:space="preserve">of clear space to the next tier.</w:t>
+              <w:t xml:space="preserve">of clear space to the next wall — the structural tier in</w:t>
+            </w:r>
+            <w:r>
+              <w:t xml:space="preserve"> </w:t>
+            </w:r>
+            <w:r>
+              <w:t xml:space="preserve">“Structure (gap tiers)”</w:t>
+            </w:r>
+            <w:r>
+              <w:t xml:space="preserve"> </w:t>
+            </w:r>
+            <w:r>
+              <w:t xml:space="preserve">mode, the next ladder rung in</w:t>
+            </w:r>
+            <w:r>
+              <w:t xml:space="preserve"> </w:t>
+            </w:r>
+            <w:r>
+              <w:t xml:space="preserve">“Opening-range ladder”</w:t>
+            </w:r>
+            <w:r>
+              <w:t xml:space="preserve"> </w:t>
+            </w:r>
+            <w:r>
+              <w:t xml:space="preserve">mode, the opposing zone edge in</w:t>
+            </w:r>
+            <w:r>
+              <w:t xml:space="preserve"> </w:t>
+            </w:r>
+            <w:r>
+              <w:t xml:space="preserve">“Fixed R:R”</w:t>
+            </w:r>
+            <w:r>
+              <w:t xml:space="preserve">.</w:t>
             </w:r>
           </w:p>
         </w:tc>
@@ -3088,19 +3907,29 @@
               <w:jc w:val="left"/>
             </w:pPr>
             <w:r>
-              <w:t xml:space="preserve">Not inside a Wave (5) lockout; not compressed, if you chose to block entries while compressed.</w:t>
-            </w:r>
-          </w:p>
-        </w:tc>
-        <w:tc>
-          <w:tcPr/>
-          <w:p>
-            <w:pPr>
-              <w:pStyle w:val="Compact"/>
-              <w:jc w:val="left"/>
-            </w:pPr>
-            <w:r>
-              <w:t xml:space="preserve">Blocked: W5 / squeeze</w:t>
+              <w:t xml:space="preserve">Not inside a Wave (5) lockout; not compressed if you chose to block that;</w:t>
+            </w:r>
+            <w:r>
+              <w:t xml:space="preserve"> </w:t>
+            </w:r>
+            <w:r>
+              <w:rPr>
+                <w:b/>
+                <w:bCs/>
+              </w:rPr>
+              <w:t xml:space="preserve">on the right side of the day bias if that veto is on; on a structurally compressed day if that is required; and not past the 1:N ladder rung if that veto is on.</w:t>
+            </w:r>
+          </w:p>
+        </w:tc>
+        <w:tc>
+          <w:tcPr/>
+          <w:p>
+            <w:pPr>
+              <w:pStyle w:val="Compact"/>
+              <w:jc w:val="left"/>
+            </w:pPr>
+            <w:r>
+              <w:t xml:space="preserve">Blocked: regime</w:t>
             </w:r>
           </w:p>
         </w:tc>
@@ -3126,7 +3955,16 @@
               <w:jc w:val="left"/>
             </w:pPr>
             <w:r>
-              <w:t xml:space="preserve">Inside the entry window, under the daily trade limit, no open position, past the cooldown.</w:t>
+              <w:t xml:space="preserve">Inside the entry window, under the daily trade limit, past the cooldown. An already-open trade no longer blocks the next signal — several can run at once, capped by</w:t>
+            </w:r>
+            <w:r>
+              <w:t xml:space="preserve"> </w:t>
+            </w:r>
+            <w:r>
+              <w:t xml:space="preserve">“Max trades per day”</w:t>
+            </w:r>
+            <w:r>
+              <w:t xml:space="preserve">.</w:t>
             </w:r>
           </w:p>
         </w:tc>
@@ -3152,13 +3990,13 @@
         <w:t xml:space="preserve">Stages 2 to 6 mark the bar with a small grey ✕ so you can see, on the chart, exactly where a setup existed and was rejected.</w:t>
       </w:r>
     </w:p>
-    <w:bookmarkStart w:id="24" w:name="the-four-entry-sources"/>
+    <w:bookmarkStart w:id="27" w:name="the-five-entry-sources"/>
     <w:p>
       <w:pPr>
         <w:pStyle w:val="Heading3"/>
       </w:pPr>
       <w:r>
-        <w:t xml:space="preserve">The four entry sources</w:t>
+        <w:t xml:space="preserve">The five entry sources</w:t>
       </w:r>
     </w:p>
     <w:p>
@@ -3463,6 +4301,59 @@
           </w:p>
         </w:tc>
       </w:tr>
+      <w:tr>
+        <w:tc>
+          <w:tcPr/>
+          <w:p>
+            <w:pPr>
+              <w:pStyle w:val="Compact"/>
+              <w:jc w:val="left"/>
+            </w:pPr>
+            <w:r>
+              <w:rPr>
+                <w:rStyle w:val="VerbatimChar"/>
+              </w:rPr>
+              <w:t xml:space="preserve">attack</w:t>
+            </w:r>
+          </w:p>
+        </w:tc>
+        <w:tc>
+          <w:tcPr/>
+          <w:p>
+            <w:pPr>
+              <w:pStyle w:val="Compact"/>
+              <w:jc w:val="left"/>
+            </w:pPr>
+            <w:r>
+              <w:t xml:space="preserve">The zone survived N institutional attacks (default 3) and price closes back through the last attack candle</w:t>
+            </w:r>
+          </w:p>
+        </w:tc>
+        <w:tc>
+          <w:tcPr/>
+          <w:p>
+            <w:pPr>
+              <w:pStyle w:val="Compact"/>
+              <w:jc w:val="left"/>
+            </w:pPr>
+            <w:r>
+              <w:t xml:space="preserve">That candle’s opposite extreme</w:t>
+            </w:r>
+          </w:p>
+        </w:tc>
+        <w:tc>
+          <w:tcPr/>
+          <w:p>
+            <w:pPr>
+              <w:pStyle w:val="Compact"/>
+              <w:jc w:val="left"/>
+            </w:pPr>
+            <w:r>
+              <w:t xml:space="preserve">Reversion</w:t>
+            </w:r>
+          </w:p>
+        </w:tc>
+      </w:tr>
     </w:tbl>
     <w:p>
       <w:pPr>
@@ -3481,8 +4372,8 @@
         <w:t xml:space="preserve">.</w:t>
       </w:r>
     </w:p>
-    <w:bookmarkEnd w:id="24"/>
-    <w:bookmarkStart w:id="25" w:name="entry-stop-and-target"/>
+    <w:bookmarkEnd w:id="27"/>
+    <w:bookmarkStart w:id="28" w:name="entry-stop-and-target"/>
     <w:p>
       <w:pPr>
         <w:pStyle w:val="Heading3"/>
@@ -3495,7 +4386,7 @@
       <w:pPr>
         <w:numPr>
           <w:ilvl w:val="0"/>
-          <w:numId w:val="1003"/>
+          <w:numId w:val="1004"/>
         </w:numPr>
       </w:pPr>
       <w:r>
@@ -3515,7 +4406,7 @@
       <w:pPr>
         <w:numPr>
           <w:ilvl w:val="0"/>
-          <w:numId w:val="1003"/>
+          <w:numId w:val="1004"/>
         </w:numPr>
       </w:pPr>
       <w:r>
@@ -3526,11 +4417,11 @@
       <w:pPr>
         <w:numPr>
           <w:ilvl w:val="0"/>
-          <w:numId w:val="1003"/>
+          <w:numId w:val="1004"/>
         </w:numPr>
       </w:pPr>
       <w:r>
-        <w:t xml:space="preserve">Black line = target: twice the risk by default, or the next structural tier in</w:t>
+        <w:t xml:space="preserve">Black line = target: twice the risk by default, the next structural tier in</w:t>
       </w:r>
       <w:r>
         <w:t xml:space="preserve"> </w:t>
@@ -3542,14 +4433,26 @@
         <w:t xml:space="preserve"> </w:t>
       </w:r>
       <w:r>
-        <w:t xml:space="preserve">mode.</w:t>
+        <w:t xml:space="preserve">mode, or the next 1:N rung in</w:t>
+      </w:r>
+      <w:r>
+        <w:t xml:space="preserve"> </w:t>
+      </w:r>
+      <w:r>
+        <w:t xml:space="preserve">“Opening-range ladder”</w:t>
+      </w:r>
+      <w:r>
+        <w:t xml:space="preserve"> </w:t>
+      </w:r>
+      <w:r>
+        <w:t xml:space="preserve">mode. Every mode falls back to the fixed multiple when its own target is unavailable — before the opening range settles, for instance.</w:t>
       </w:r>
     </w:p>
     <w:p>
       <w:pPr>
         <w:numPr>
           <w:ilvl w:val="0"/>
-          <w:numId w:val="1003"/>
+          <w:numId w:val="1004"/>
         </w:numPr>
       </w:pPr>
       <w:r>
@@ -3569,7 +4472,7 @@
       <w:pPr>
         <w:numPr>
           <w:ilvl w:val="0"/>
-          <w:numId w:val="1003"/>
+          <w:numId w:val="1004"/>
         </w:numPr>
       </w:pPr>
       <w:r>
@@ -3580,16 +4483,16 @@
       <w:pPr>
         <w:numPr>
           <w:ilvl w:val="0"/>
-          <w:numId w:val="1003"/>
+          <w:numId w:val="1004"/>
         </w:numPr>
       </w:pPr>
       <w:r>
         <w:t xml:space="preserve">A bar that spans both stop and target is treated as a stop. Intrabar order is unknowable on a 3-minute candle, so the script never awards itself the gift.</w:t>
       </w:r>
     </w:p>
-    <w:bookmarkEnd w:id="25"/>
-    <w:bookmarkEnd w:id="26"/>
-    <w:bookmarkStart w:id="27" w:name="intraday-rules-built-into-the-script"/>
+    <w:bookmarkEnd w:id="28"/>
+    <w:bookmarkEnd w:id="29"/>
+    <w:bookmarkStart w:id="30" w:name="intraday-rules-built-into-the-script"/>
     <w:p>
       <w:pPr>
         <w:pStyle w:val="Heading2"/>
@@ -3810,7 +4713,7 @@
               <w:jc w:val="left"/>
             </w:pPr>
             <w:r>
-              <w:t xml:space="preserve">Prevents revenge-trading a bad session</w:t>
+              <w:t xml:space="preserve">Prevents revenge-trading a bad session, and caps how many trades can be live at the same time</w:t>
             </w:r>
           </w:p>
         </w:tc>
@@ -3967,9 +4870,173 @@
           </w:p>
         </w:tc>
       </w:tr>
+      <w:tr>
+        <w:tc>
+          <w:tcPr/>
+          <w:p>
+            <w:pPr>
+              <w:pStyle w:val="Compact"/>
+              <w:jc w:val="left"/>
+            </w:pPr>
+            <w:r>
+              <w:t xml:space="preserve">Opening candle</w:t>
+            </w:r>
+          </w:p>
+        </w:tc>
+        <w:tc>
+          <w:tcPr/>
+          <w:p>
+            <w:pPr>
+              <w:pStyle w:val="Compact"/>
+              <w:jc w:val="left"/>
+            </w:pPr>
+            <w:r>
+              <w:t xml:space="preserve">First 9 minutes</w:t>
+            </w:r>
+          </w:p>
+        </w:tc>
+        <w:tc>
+          <w:tcPr/>
+          <w:p>
+            <w:pPr>
+              <w:pStyle w:val="Compact"/>
+              <w:jc w:val="left"/>
+            </w:pPr>
+            <w:r>
+              <w:t xml:space="preserve">The reference range; skipped and replaced by the second candle if it opens on its own high or low</w:t>
+            </w:r>
+          </w:p>
+        </w:tc>
+      </w:tr>
+      <w:tr>
+        <w:tc>
+          <w:tcPr/>
+          <w:p>
+            <w:pPr>
+              <w:pStyle w:val="Compact"/>
+              <w:jc w:val="left"/>
+            </w:pPr>
+            <w:r>
+              <w:t xml:space="preserve">Day bias</w:t>
+            </w:r>
+          </w:p>
+        </w:tc>
+        <w:tc>
+          <w:tcPr/>
+          <w:p>
+            <w:pPr>
+              <w:pStyle w:val="Compact"/>
+              <w:jc w:val="left"/>
+            </w:pPr>
+            <w:r>
+              <w:t xml:space="preserve">Latched, no flip</w:t>
+            </w:r>
+          </w:p>
+        </w:tc>
+        <w:tc>
+          <w:tcPr/>
+          <w:p>
+            <w:pPr>
+              <w:pStyle w:val="Compact"/>
+              <w:jc w:val="left"/>
+            </w:pPr>
+            <w:r>
+              <w:t xml:space="preserve">The first break of the opening range owns the session</w:t>
+            </w:r>
+          </w:p>
+        </w:tc>
+      </w:tr>
+      <w:tr>
+        <w:tc>
+          <w:tcPr/>
+          <w:p>
+            <w:pPr>
+              <w:pStyle w:val="Compact"/>
+              <w:jc w:val="left"/>
+            </w:pPr>
+            <w:r>
+              <w:t xml:space="preserve">Battlefield measurement</w:t>
+            </w:r>
+          </w:p>
+        </w:tc>
+        <w:tc>
+          <w:tcPr/>
+          <w:p>
+            <w:pPr>
+              <w:pStyle w:val="Compact"/>
+              <w:jc w:val="left"/>
+            </w:pPr>
+            <w:r>
+              <w:t xml:space="preserve">At the day’s first bar</w:t>
+            </w:r>
+          </w:p>
+        </w:tc>
+        <w:tc>
+          <w:tcPr/>
+          <w:p>
+            <w:pPr>
+              <w:pStyle w:val="Compact"/>
+              <w:jc w:val="left"/>
+            </w:pPr>
+            <w:r>
+              <w:t xml:space="preserve">Compression describes the day, not the bar, so it is not recomputed intraday</w:t>
+            </w:r>
+          </w:p>
+        </w:tc>
+      </w:tr>
+      <w:tr>
+        <w:tc>
+          <w:tcPr/>
+          <w:p>
+            <w:pPr>
+              <w:pStyle w:val="Compact"/>
+              <w:jc w:val="left"/>
+            </w:pPr>
+            <w:r>
+              <w:t xml:space="preserve">Attack count reset</w:t>
+            </w:r>
+          </w:p>
+        </w:tc>
+        <w:tc>
+          <w:tcPr/>
+          <w:p>
+            <w:pPr>
+              <w:pStyle w:val="Compact"/>
+              <w:jc w:val="left"/>
+            </w:pPr>
+            <w:r>
+              <w:t xml:space="preserve">On clearing the opposite zone</w:t>
+            </w:r>
+          </w:p>
+        </w:tc>
+        <w:tc>
+          <w:tcPr/>
+          <w:p>
+            <w:pPr>
+              <w:pStyle w:val="Compact"/>
+              <w:jc w:val="left"/>
+            </w:pPr>
+            <w:r>
+              <w:t xml:space="preserve">GTI’s</w:t>
+            </w:r>
+            <w:r>
+              <w:t xml:space="preserve"> </w:t>
+            </w:r>
+            <w:r>
+              <w:t xml:space="preserve">“data neutralised”</w:t>
+            </w:r>
+            <w:r>
+              <w:t xml:space="preserve"> </w:t>
+            </w:r>
+            <w:r>
+              <w:t xml:space="preserve">— the previous attacks no longer count</w:t>
+            </w:r>
+          </w:p>
+        </w:tc>
+      </w:tr>
     </w:tbl>
-    <w:bookmarkEnd w:id="27"/>
-    <w:bookmarkStart w:id="31" w:name="reading-the-two-tables"/>
+    <w:bookmarkEnd w:id="30"/>
+    <w:bookmarkStart w:id="34" w:name="reading-the-two-tables"/>
     <w:p>
       <w:pPr>
         <w:pStyle w:val="Heading2"/>
@@ -3978,7 +5045,7 @@
         <w:t xml:space="preserve">6. Reading the two tables</w:t>
       </w:r>
     </w:p>
-    <w:bookmarkStart w:id="28" w:name="today-top-right"/>
+    <w:bookmarkStart w:id="31" w:name="today-top-right"/>
     <w:p>
       <w:pPr>
         <w:pStyle w:val="Heading3"/>
@@ -4136,6 +5203,133 @@
           </w:p>
         </w:tc>
       </w:tr>
+      <w:tr>
+        <w:tc>
+          <w:tcPr/>
+          <w:p>
+            <w:pPr>
+              <w:pStyle w:val="Compact"/>
+              <w:jc w:val="left"/>
+            </w:pPr>
+            <w:r>
+              <w:t xml:space="preserve">Battlefield</w:t>
+            </w:r>
+          </w:p>
+        </w:tc>
+        <w:tc>
+          <w:tcPr/>
+          <w:p>
+            <w:pPr>
+              <w:pStyle w:val="Compact"/>
+              <w:jc w:val="left"/>
+            </w:pPr>
+            <w:r>
+              <w:t xml:space="preserve">Points of clear air between the zones at the open, tagged</w:t>
+            </w:r>
+            <w:r>
+              <w:t xml:space="preserve"> </w:t>
+            </w:r>
+            <w:r>
+              <w:rPr>
+                <w:rStyle w:val="VerbatimChar"/>
+              </w:rPr>
+              <w:t xml:space="preserve">COMPRESSED</w:t>
+            </w:r>
+            <w:r>
+              <w:t xml:space="preserve"> </w:t>
+            </w:r>
+            <w:r>
+              <w:t xml:space="preserve">or</w:t>
+            </w:r>
+            <w:r>
+              <w:t xml:space="preserve"> </w:t>
+            </w:r>
+            <w:r>
+              <w:rPr>
+                <w:rStyle w:val="VerbatimChar"/>
+              </w:rPr>
+              <w:t xml:space="preserve">open</w:t>
+            </w:r>
+            <w:r>
+              <w:t xml:space="preserve">. Compressed days are the ones GTI trades.</w:t>
+            </w:r>
+          </w:p>
+        </w:tc>
+      </w:tr>
+      <w:tr>
+        <w:tc>
+          <w:tcPr/>
+          <w:p>
+            <w:pPr>
+              <w:pStyle w:val="Compact"/>
+              <w:jc w:val="left"/>
+            </w:pPr>
+            <w:r>
+              <w:t xml:space="preserve">Day bias</w:t>
+            </w:r>
+          </w:p>
+        </w:tc>
+        <w:tc>
+          <w:tcPr/>
+          <w:p>
+            <w:pPr>
+              <w:pStyle w:val="Compact"/>
+              <w:jc w:val="left"/>
+            </w:pPr>
+            <w:r>
+              <w:rPr>
+                <w:rStyle w:val="VerbatimChar"/>
+              </w:rPr>
+              <w:t xml:space="preserve">LONG buy-on-dip</w:t>
+            </w:r>
+            <w:r>
+              <w:t xml:space="preserve">,</w:t>
+            </w:r>
+            <w:r>
+              <w:t xml:space="preserve"> </w:t>
+            </w:r>
+            <w:r>
+              <w:rPr>
+                <w:rStyle w:val="VerbatimChar"/>
+              </w:rPr>
+              <w:t xml:space="preserve">SHORT sell-on-rise</w:t>
+            </w:r>
+            <w:r>
+              <w:t xml:space="preserve">, or</w:t>
+            </w:r>
+            <w:r>
+              <w:t xml:space="preserve"> </w:t>
+            </w:r>
+            <w:r>
+              <w:rPr>
+                <w:rStyle w:val="VerbatimChar"/>
+              </w:rPr>
+              <w:t xml:space="preserve">unbroken</w:t>
+            </w:r>
+            <w:r>
+              <w:t xml:space="preserve"> </w:t>
+            </w:r>
+            <w:r>
+              <w:t xml:space="preserve">while the opening range still holds, with the range in brackets.</w:t>
+            </w:r>
+            <w:r>
+              <w:t xml:space="preserve"> </w:t>
+            </w:r>
+            <w:r>
+              <w:rPr>
+                <w:rStyle w:val="VerbatimChar"/>
+              </w:rPr>
+              <w:t xml:space="preserve">c2</w:t>
+            </w:r>
+            <w:r>
+              <w:t xml:space="preserve"> </w:t>
+            </w:r>
+            <w:r>
+              <w:t xml:space="preserve">means the first candle was fake and the second was used.</w:t>
+            </w:r>
+          </w:p>
+        </w:tc>
+      </w:tr>
     </w:tbl>
     <w:p>
       <w:pPr>
@@ -4209,8 +5403,8 @@
         <w:t xml:space="preserve">is where you get stopped out for no reason.</w:t>
       </w:r>
     </w:p>
-    <w:bookmarkEnd w:id="28"/>
-    <w:bookmarkStart w:id="29" w:name="diag-bottom-right"/>
+    <w:bookmarkEnd w:id="31"/>
+    <w:bookmarkStart w:id="32" w:name="diag-bottom-right"/>
     <w:p>
       <w:pPr>
         <w:pStyle w:val="Heading3"/>
@@ -4515,69 +5709,57 @@
               <w:jc w:val="left"/>
             </w:pPr>
             <w:r>
-              <w:t xml:space="preserve">Structural target was too close to be worth the risk</w:t>
-            </w:r>
-          </w:p>
-        </w:tc>
-        <w:tc>
-          <w:tcPr/>
-          <w:p>
-            <w:pPr>
-              <w:pStyle w:val="Compact"/>
-              <w:jc w:val="left"/>
-            </w:pPr>
-            <w:r>
-              <w:t xml:space="preserve">Only appears in</w:t>
-            </w:r>
-            <w:r>
-              <w:t xml:space="preserve"> </w:t>
-            </w:r>
-            <w:r>
-              <w:t xml:space="preserve">“Structure (gap tiers)”</w:t>
-            </w:r>
-            <w:r>
-              <w:t xml:space="preserve"> </w:t>
-            </w:r>
-            <w:r>
-              <w:t xml:space="preserve">mode. Lower Min R:R, or switch to Fixed R:R.</w:t>
-            </w:r>
-          </w:p>
-        </w:tc>
-      </w:tr>
-      <w:tr>
-        <w:tc>
-          <w:tcPr/>
-          <w:p>
-            <w:pPr>
-              <w:pStyle w:val="Compact"/>
-              <w:jc w:val="left"/>
-            </w:pPr>
-            <w:r>
-              <w:t xml:space="preserve">Blocked: W5 / squeeze</w:t>
-            </w:r>
-          </w:p>
-        </w:tc>
-        <w:tc>
-          <w:tcPr/>
-          <w:p>
-            <w:pPr>
-              <w:pStyle w:val="Compact"/>
-              <w:jc w:val="left"/>
-            </w:pPr>
-            <w:r>
-              <w:t xml:space="preserve">Setups vetoed by a Wave (5) lockout or by compression</w:t>
-            </w:r>
-          </w:p>
-        </w:tc>
-        <w:tc>
-          <w:tcPr/>
-          <w:p>
-            <w:pPr>
-              <w:pStyle w:val="Compact"/>
-              <w:jc w:val="left"/>
-            </w:pPr>
-            <w:r>
-              <w:t xml:space="preserve">If this is high on days you would have won, shorten the lockout or lengthen the wave lookback</w:t>
+              <w:t xml:space="preserve">The wall ahead was too close to be worth the risk — a short taken just above demand, a long taken into supply</w:t>
+            </w:r>
+          </w:p>
+        </w:tc>
+        <w:tc>
+          <w:tcPr/>
+          <w:p>
+            <w:pPr>
+              <w:pStyle w:val="Compact"/>
+              <w:jc w:val="left"/>
+            </w:pPr>
+            <w:r>
+              <w:t xml:space="preserve">Lower Min R:R to loosen it (0.25 effectively disables it).</w:t>
+            </w:r>
+          </w:p>
+        </w:tc>
+      </w:tr>
+      <w:tr>
+        <w:tc>
+          <w:tcPr/>
+          <w:p>
+            <w:pPr>
+              <w:pStyle w:val="Compact"/>
+              <w:jc w:val="left"/>
+            </w:pPr>
+            <w:r>
+              <w:t xml:space="preserve">Blocked: regime</w:t>
+            </w:r>
+          </w:p>
+        </w:tc>
+        <w:tc>
+          <w:tcPr/>
+          <w:p>
+            <w:pPr>
+              <w:pStyle w:val="Compact"/>
+              <w:jc w:val="left"/>
+            </w:pPr>
+            <w:r>
+              <w:t xml:space="preserve">Setups vetoed by a Wave (5) lockout, by compression, by the day-bias gate, by the compressed-days-only gate, or by the 1:N ladder veto</w:t>
+            </w:r>
+          </w:p>
+        </w:tc>
+        <w:tc>
+          <w:tcPr/>
+          <w:p>
+            <w:pPr>
+              <w:pStyle w:val="Compact"/>
+              <w:jc w:val="left"/>
+            </w:pPr>
+            <w:r>
+              <w:t xml:space="preserve">If this is high on days you would have won, shorten the lockout, lengthen the wave lookback, or check whether a GTI gate you turned on is doing the blocking</w:t>
             </w:r>
           </w:p>
         </w:tc>
@@ -4697,8 +5879,8 @@
         </w:tc>
       </w:tr>
     </w:tbl>
-    <w:bookmarkEnd w:id="29"/>
-    <w:bookmarkStart w:id="30" w:name="option-chain-top-left-companion-script"/>
+    <w:bookmarkEnd w:id="32"/>
+    <w:bookmarkStart w:id="33" w:name="option-chain-top-left-companion-script"/>
     <w:p>
       <w:pPr>
         <w:pStyle w:val="Heading3"/>
@@ -4715,9 +5897,9 @@
         <w:t xml:space="preserve">One row per strike around ATM with CE OI, CE change, PE OI and PE change. The ATM row is highlighted and marked with an arrow; the highest-OI CE and PE cells are shaded. Summary rows give totals, PCR, the support and resistance strikes, where today’s writing is concentrated, the overall bias, and the futures buildup. The last row shows live ATM CE and PE premiums with the rupee cost of one lot.</w:t>
       </w:r>
     </w:p>
-    <w:bookmarkEnd w:id="30"/>
-    <w:bookmarkEnd w:id="31"/>
-    <w:bookmarkStart w:id="32" w:name="alerts"/>
+    <w:bookmarkEnd w:id="33"/>
+    <w:bookmarkEnd w:id="34"/>
+    <w:bookmarkStart w:id="35" w:name="alerts"/>
     <w:p>
       <w:pPr>
         <w:pStyle w:val="Heading2"/>
@@ -4731,7 +5913,7 @@
         <w:pStyle w:val="FirstParagraph"/>
       </w:pPr>
       <w:r>
-        <w:t xml:space="preserve">Nine alert conditions are exposed. The first three are the ones to actually set:</w:t>
+        <w:t xml:space="preserve">Fourteen alert conditions are exposed. The first three are the ones to actually set:</w:t>
       </w:r>
     </w:p>
     <w:tbl>
@@ -4912,9 +6094,87 @@
           </w:p>
         </w:tc>
       </w:tr>
+      <w:tr>
+        <w:tc>
+          <w:tcPr/>
+          <w:p>
+            <w:pPr>
+              <w:pStyle w:val="Compact"/>
+              <w:jc w:val="left"/>
+            </w:pPr>
+            <w:r>
+              <w:t xml:space="preserve">SD-X Opening break</w:t>
+            </w:r>
+          </w:p>
+        </w:tc>
+        <w:tc>
+          <w:tcPr/>
+          <w:p>
+            <w:pPr>
+              <w:pStyle w:val="Compact"/>
+              <w:jc w:val="left"/>
+            </w:pPr>
+            <w:r>
+              <w:t xml:space="preserve">The opening candle breaks and the day bias is set</w:t>
+            </w:r>
+          </w:p>
+        </w:tc>
+      </w:tr>
+      <w:tr>
+        <w:tc>
+          <w:tcPr/>
+          <w:p>
+            <w:pPr>
+              <w:pStyle w:val="Compact"/>
+              <w:jc w:val="left"/>
+            </w:pPr>
+            <w:r>
+              <w:t xml:space="preserve">SD-X Zone attack long / short</w:t>
+            </w:r>
+          </w:p>
+        </w:tc>
+        <w:tc>
+          <w:tcPr/>
+          <w:p>
+            <w:pPr>
+              <w:pStyle w:val="Compact"/>
+              <w:jc w:val="left"/>
+            </w:pPr>
+            <w:r>
+              <w:t xml:space="preserve">A zone survived its Nth attack and the last attack candle is broken</w:t>
+            </w:r>
+          </w:p>
+        </w:tc>
+      </w:tr>
+      <w:tr>
+        <w:tc>
+          <w:tcPr/>
+          <w:p>
+            <w:pPr>
+              <w:pStyle w:val="Compact"/>
+              <w:jc w:val="left"/>
+            </w:pPr>
+            <w:r>
+              <w:t xml:space="preserve">SD-X Ladder 1:N up / down</w:t>
+            </w:r>
+          </w:p>
+        </w:tc>
+        <w:tc>
+          <w:tcPr/>
+          <w:p>
+            <w:pPr>
+              <w:pStyle w:val="Compact"/>
+              <w:jc w:val="left"/>
+            </w:pPr>
+            <w:r>
+              <w:t xml:space="preserve">The opening-range ladder target is reached — the original move has paid out</w:t>
+            </w:r>
+          </w:p>
+        </w:tc>
+      </w:tr>
     </w:tbl>
-    <w:bookmarkEnd w:id="32"/>
-    <w:bookmarkStart w:id="33" w:name="daily-workflow"/>
+    <w:bookmarkEnd w:id="35"/>
+    <w:bookmarkStart w:id="36" w:name="daily-workflow"/>
     <w:p>
       <w:pPr>
         <w:pStyle w:val="Heading2"/>
@@ -4927,7 +6187,7 @@
       <w:pPr>
         <w:numPr>
           <w:ilvl w:val="0"/>
-          <w:numId w:val="1004"/>
+          <w:numId w:val="1005"/>
         </w:numPr>
       </w:pPr>
       <w:r>
@@ -4938,18 +6198,132 @@
       <w:pPr>
         <w:numPr>
           <w:ilvl w:val="0"/>
-          <w:numId w:val="1004"/>
+          <w:numId w:val="1005"/>
         </w:numPr>
       </w:pPr>
       <w:r>
-        <w:t xml:space="preserve">Read the Phase row through the morning. It tells you which kind of entry the day is likely to offer.</w:t>
+        <w:t xml:space="preserve">At the open, read the</w:t>
+      </w:r>
+      <w:r>
+        <w:t xml:space="preserve"> </w:t>
+      </w:r>
+      <w:r>
+        <w:rPr>
+          <w:b/>
+          <w:bCs/>
+        </w:rPr>
+        <w:t xml:space="preserve">Battlefield</w:t>
+      </w:r>
+      <w:r>
+        <w:t xml:space="preserve"> </w:t>
+      </w:r>
+      <w:r>
+        <w:t xml:space="preserve">row.</w:t>
+      </w:r>
+      <w:r>
+        <w:t xml:space="preserve"> </w:t>
+      </w:r>
+      <w:r>
+        <w:rPr>
+          <w:rStyle w:val="VerbatimChar"/>
+        </w:rPr>
+        <w:t xml:space="preserve">COMPRESSED</w:t>
+      </w:r>
+      <w:r>
+        <w:t xml:space="preserve"> </w:t>
+      </w:r>
+      <w:r>
+        <w:t xml:space="preserve">says the two sides are on top of each other and the day should resolve one way — those are the days the GTI method is built for.</w:t>
+      </w:r>
+      <w:r>
+        <w:t xml:space="preserve"> </w:t>
+      </w:r>
+      <w:r>
+        <w:rPr>
+          <w:rStyle w:val="VerbatimChar"/>
+        </w:rPr>
+        <w:t xml:space="preserve">open</w:t>
+      </w:r>
+      <w:r>
+        <w:t xml:space="preserve"> </w:t>
+      </w:r>
+      <w:r>
+        <w:t xml:space="preserve">says there is room between the zones and the day can drift; expect chop and take fewer trades.</w:t>
       </w:r>
     </w:p>
     <w:p>
       <w:pPr>
         <w:numPr>
           <w:ilvl w:val="0"/>
-          <w:numId w:val="1004"/>
+          <w:numId w:val="1005"/>
+        </w:numPr>
+      </w:pPr>
+      <w:r>
+        <w:t xml:space="preserve">Watch the</w:t>
+      </w:r>
+      <w:r>
+        <w:t xml:space="preserve"> </w:t>
+      </w:r>
+      <w:r>
+        <w:rPr>
+          <w:b/>
+          <w:bCs/>
+        </w:rPr>
+        <w:t xml:space="preserve">Day bias</w:t>
+      </w:r>
+      <w:r>
+        <w:t xml:space="preserve"> </w:t>
+      </w:r>
+      <w:r>
+        <w:t xml:space="preserve">row through the first fifteen to twenty minutes. It stays</w:t>
+      </w:r>
+      <w:r>
+        <w:t xml:space="preserve"> </w:t>
+      </w:r>
+      <w:r>
+        <w:rPr>
+          <w:rStyle w:val="VerbatimChar"/>
+        </w:rPr>
+        <w:t xml:space="preserve">unbroken</w:t>
+      </w:r>
+      <w:r>
+        <w:t xml:space="preserve"> </w:t>
+      </w:r>
+      <w:r>
+        <w:t xml:space="preserve">until the opening candle breaks, then names the only direction worth trading. A</w:t>
+      </w:r>
+      <w:r>
+        <w:t xml:space="preserve"> </w:t>
+      </w:r>
+      <w:r>
+        <w:rPr>
+          <w:rStyle w:val="VerbatimChar"/>
+        </w:rPr>
+        <w:t xml:space="preserve">c2</w:t>
+      </w:r>
+      <w:r>
+        <w:t xml:space="preserve"> </w:t>
+      </w:r>
+      <w:r>
+        <w:t xml:space="preserve">tag means the first candle opened on its own high or low and was discarded.</w:t>
+      </w:r>
+    </w:p>
+    <w:p>
+      <w:pPr>
+        <w:numPr>
+          <w:ilvl w:val="0"/>
+          <w:numId w:val="1005"/>
+        </w:numPr>
+      </w:pPr>
+      <w:r>
+        <w:t xml:space="preserve">Read the Phase row through the morning. It tells you which kind of entry the day is likely to offer.</w:t>
+      </w:r>
+    </w:p>
+    <w:p>
+      <w:pPr>
+        <w:numPr>
+          <w:ilvl w:val="0"/>
+          <w:numId w:val="1005"/>
         </w:numPr>
       </w:pPr>
       <w:r>
@@ -4975,7 +6349,7 @@
       <w:pPr>
         <w:numPr>
           <w:ilvl w:val="0"/>
-          <w:numId w:val="1004"/>
+          <w:numId w:val="1005"/>
         </w:numPr>
       </w:pPr>
       <w:r>
@@ -5016,7 +6390,7 @@
       <w:pPr>
         <w:numPr>
           <w:ilvl w:val="0"/>
-          <w:numId w:val="1004"/>
+          <w:numId w:val="1005"/>
         </w:numPr>
       </w:pPr>
       <w:r>
@@ -5051,7 +6425,7 @@
       <w:pPr>
         <w:numPr>
           <w:ilvl w:val="0"/>
-          <w:numId w:val="1004"/>
+          <w:numId w:val="1005"/>
         </w:numPr>
       </w:pPr>
       <w:r>
@@ -5062,26 +6436,37 @@
       <w:pPr>
         <w:numPr>
           <w:ilvl w:val="0"/>
-          <w:numId w:val="1004"/>
+          <w:numId w:val="1005"/>
         </w:numPr>
       </w:pPr>
       <w:r>
-        <w:t xml:space="preserve">Exit at the stop, the target, or 15:15 — whichever comes first. Never carry.</w:t>
+        <w:t xml:space="preserve">Book into the ladder rungs. 1:1 is the first honest exit, 1:2 is the common one, 1:3 is where institutions book and the move usually stalls. After 1:3 prints, the higher-probability trade is the contra, not another entry in the same direction — the script will not take one for you, and the ladder veto only stops it adding to the move.</w:t>
       </w:r>
     </w:p>
     <w:p>
       <w:pPr>
         <w:numPr>
           <w:ilvl w:val="0"/>
-          <w:numId w:val="1004"/>
+          <w:numId w:val="1005"/>
         </w:numPr>
       </w:pPr>
       <w:r>
+        <w:t xml:space="preserve">Exit at the stop, the target, or 15:15 — whichever comes first. Never carry.</w:t>
+      </w:r>
+    </w:p>
+    <w:p>
+      <w:pPr>
+        <w:numPr>
+          <w:ilvl w:val="0"/>
+          <w:numId w:val="1005"/>
+        </w:numPr>
+      </w:pPr>
+      <w:r>
         <w:t xml:space="preserve">At the close, read the Today and DIAG tables and log the result. After two weeks you will know whether the settings suit your market conditions.</w:t>
       </w:r>
     </w:p>
-    <w:bookmarkEnd w:id="33"/>
-    <w:bookmarkStart w:id="34" w:name="troubleshooting"/>
+    <w:bookmarkEnd w:id="36"/>
+    <w:bookmarkStart w:id="37" w:name="troubleshooting"/>
     <w:p>
       <w:pPr>
         <w:pStyle w:val="Heading2"/>
@@ -5305,13 +6690,39 @@
               <w:jc w:val="left"/>
             </w:pPr>
             <w:r>
-              <w:t xml:space="preserve">You are in structural-target mode with tiers close overhead. Lower Min R:R or switch Target mode to</w:t>
+              <w:t xml:space="preserve">Price is pinned between the zones — usually a low-VIX range day. Lower Min R:R, or widen the zones (raise Auto lookback / Min zone height).</w:t>
+            </w:r>
+          </w:p>
+        </w:tc>
+      </w:tr>
+      <w:tr>
+        <w:tc>
+          <w:tcPr/>
+          <w:p>
+            <w:pPr>
+              <w:pStyle w:val="Compact"/>
+              <w:jc w:val="left"/>
+            </w:pPr>
+            <w:r>
+              <w:t xml:space="preserve">Signals cluster in chop</w:t>
+            </w:r>
+          </w:p>
+        </w:tc>
+        <w:tc>
+          <w:tcPr/>
+          <w:p>
+            <w:pPr>
+              <w:pStyle w:val="Compact"/>
+              <w:jc w:val="left"/>
+            </w:pPr>
+            <w:r>
+              <w:t xml:space="preserve">Raise the cross-index pivot length from 8 to 10 or 12, increase the cooldown, and turn on</w:t>
             </w:r>
             <w:r>
               <w:t xml:space="preserve"> </w:t>
             </w:r>
             <w:r>
-              <w:t xml:space="preserve">“Fixed R:R”</w:t>
+              <w:t xml:space="preserve">“Block entries while compressed”</w:t>
             </w:r>
             <w:r>
               <w:t xml:space="preserve">.</w:t>
@@ -5328,28 +6739,183 @@
               <w:jc w:val="left"/>
             </w:pPr>
             <w:r>
-              <w:t xml:space="preserve">Signals cluster in chop</w:t>
-            </w:r>
-          </w:p>
-        </w:tc>
-        <w:tc>
-          <w:tcPr/>
-          <w:p>
-            <w:pPr>
-              <w:pStyle w:val="Compact"/>
-              <w:jc w:val="left"/>
-            </w:pPr>
-            <w:r>
-              <w:t xml:space="preserve">Raise the cross-index pivot length from 8 to 10 or 12, increase the cooldown, and turn on</w:t>
+              <w:t xml:space="preserve">Day bias never leaves</w:t>
             </w:r>
             <w:r>
               <w:t xml:space="preserve"> </w:t>
             </w:r>
             <w:r>
-              <w:t xml:space="preserve">“Block entries while compressed”</w:t>
-            </w:r>
-            <w:r>
-              <w:t xml:space="preserve">.</w:t>
+              <w:rPr>
+                <w:rStyle w:val="VerbatimChar"/>
+              </w:rPr>
+              <w:t xml:space="preserve">unbroken</w:t>
+            </w:r>
+          </w:p>
+        </w:tc>
+        <w:tc>
+          <w:tcPr/>
+          <w:p>
+            <w:pPr>
+              <w:pStyle w:val="Compact"/>
+              <w:jc w:val="left"/>
+            </w:pPr>
+            <w:r>
+              <w:t xml:space="preserve">Price stayed inside the opening candle all session. On a 9-minute range that is rare; on a 15-minute one it is not. Either lower the opening candle length or accept it as a no-trade day.</w:t>
+            </w:r>
+          </w:p>
+        </w:tc>
+      </w:tr>
+      <w:tr>
+        <w:tc>
+          <w:tcPr/>
+          <w:p>
+            <w:pPr>
+              <w:pStyle w:val="Compact"/>
+              <w:jc w:val="left"/>
+            </w:pPr>
+            <w:r>
+              <w:t xml:space="preserve">Every setup shows</w:t>
+            </w:r>
+            <w:r>
+              <w:t xml:space="preserve"> </w:t>
+            </w:r>
+            <w:r>
+              <w:t xml:space="preserve">“Blocked: regime”</w:t>
+            </w:r>
+            <w:r>
+              <w:t xml:space="preserve"> </w:t>
+            </w:r>
+            <w:r>
+              <w:t xml:space="preserve">after you enabled a GTI gate</w:t>
+            </w:r>
+          </w:p>
+        </w:tc>
+        <w:tc>
+          <w:tcPr/>
+          <w:p>
+            <w:pPr>
+              <w:pStyle w:val="Compact"/>
+              <w:jc w:val="left"/>
+            </w:pPr>
+            <w:r>
+              <w:t xml:space="preserve">Expected.</w:t>
+            </w:r>
+            <w:r>
+              <w:t xml:space="preserve"> </w:t>
+            </w:r>
+            <w:r>
+              <w:t xml:space="preserve">“Trade only in the opening-break direction”</w:t>
+            </w:r>
+            <w:r>
+              <w:t xml:space="preserve"> </w:t>
+            </w:r>
+            <w:r>
+              <w:t xml:space="preserve">halves the tradeable setups by construction, and</w:t>
+            </w:r>
+            <w:r>
+              <w:t xml:space="preserve"> </w:t>
+            </w:r>
+            <w:r>
+              <w:t xml:space="preserve">“Only take entries on compressed days”</w:t>
+            </w:r>
+            <w:r>
+              <w:t xml:space="preserve"> </w:t>
+            </w:r>
+            <w:r>
+              <w:t xml:space="preserve">removes most days entirely. Turn one on at a time and watch the SIGNALS row for a fortnight before adding the other.</w:t>
+            </w:r>
+          </w:p>
+        </w:tc>
+      </w:tr>
+      <w:tr>
+        <w:tc>
+          <w:tcPr/>
+          <w:p>
+            <w:pPr>
+              <w:pStyle w:val="Compact"/>
+              <w:jc w:val="left"/>
+            </w:pPr>
+            <w:r>
+              <w:t xml:space="preserve">No</w:t>
+            </w:r>
+            <w:r>
+              <w:t xml:space="preserve"> </w:t>
+            </w:r>
+            <w:r>
+              <w:rPr>
+                <w:rStyle w:val="VerbatimChar"/>
+              </w:rPr>
+              <w:t xml:space="preserve">attack</w:t>
+            </w:r>
+            <w:r>
+              <w:t xml:space="preserve"> </w:t>
+            </w:r>
+            <w:r>
+              <w:t xml:space="preserve">entries ever fire</w:t>
+            </w:r>
+          </w:p>
+        </w:tc>
+        <w:tc>
+          <w:tcPr/>
+          <w:p>
+            <w:pPr>
+              <w:pStyle w:val="Compact"/>
+              <w:jc w:val="left"/>
+            </w:pPr>
+            <w:r>
+              <w:t xml:space="preserve">The counter needs blue and black whale bars, which need real volume. On a spot index there are none. Chart the futures, or accept that this source is inactive.</w:t>
+            </w:r>
+          </w:p>
+        </w:tc>
+      </w:tr>
+      <w:tr>
+        <w:tc>
+          <w:tcPr/>
+          <w:p>
+            <w:pPr>
+              <w:pStyle w:val="Compact"/>
+              <w:jc w:val="left"/>
+            </w:pPr>
+            <w:r>
+              <w:t xml:space="preserve">Attack numbers reset constantly</w:t>
+            </w:r>
+          </w:p>
+        </w:tc>
+        <w:tc>
+          <w:tcPr/>
+          <w:p>
+            <w:pPr>
+              <w:pStyle w:val="Compact"/>
+              <w:jc w:val="left"/>
+            </w:pPr>
+            <w:r>
+              <w:t xml:space="preserve">Price is crossing between the zones, which neutralises the count by design. It means the zones are too close together or too narrow, not that the counter is broken.</w:t>
+            </w:r>
+          </w:p>
+        </w:tc>
+      </w:tr>
+      <w:tr>
+        <w:tc>
+          <w:tcPr/>
+          <w:p>
+            <w:pPr>
+              <w:pStyle w:val="Compact"/>
+              <w:jc w:val="left"/>
+            </w:pPr>
+            <w:r>
+              <w:t xml:space="preserve">Ladder rungs are absurdly far away</w:t>
+            </w:r>
+          </w:p>
+        </w:tc>
+        <w:tc>
+          <w:tcPr/>
+          <w:p>
+            <w:pPr>
+              <w:pStyle w:val="Compact"/>
+              <w:jc w:val="left"/>
+            </w:pPr>
+            <w:r>
+              <w:t xml:space="preserve">A wide opening candle projects a wide ladder. On a gap-and-run open the 1:3 rung can be a whole day’s range away — use Fixed R:R or the gap tiers on those days rather than aiming at it.</w:t>
             </w:r>
           </w:p>
         </w:tc>
@@ -5528,8 +7094,8 @@
         </w:tc>
       </w:tr>
     </w:tbl>
-    <w:bookmarkEnd w:id="34"/>
-    <w:bookmarkStart w:id="35" w:name="limitations-and-risk"/>
+    <w:bookmarkEnd w:id="37"/>
+    <w:bookmarkStart w:id="38" w:name="limitations-and-risk"/>
     <w:p>
       <w:pPr>
         <w:pStyle w:val="Heading2"/>
@@ -5550,7 +7116,7 @@
       <w:pPr>
         <w:numPr>
           <w:ilvl w:val="0"/>
-          <w:numId w:val="1005"/>
+          <w:numId w:val="1006"/>
         </w:numPr>
       </w:pPr>
       <w:r>
@@ -5561,7 +7127,7 @@
       <w:pPr>
         <w:numPr>
           <w:ilvl w:val="0"/>
-          <w:numId w:val="1005"/>
+          <w:numId w:val="1006"/>
         </w:numPr>
       </w:pPr>
       <w:r>
@@ -5572,7 +7138,7 @@
       <w:pPr>
         <w:numPr>
           <w:ilvl w:val="0"/>
-          <w:numId w:val="1005"/>
+          <w:numId w:val="1006"/>
         </w:numPr>
       </w:pPr>
       <w:r>
@@ -5583,7 +7149,7 @@
       <w:pPr>
         <w:numPr>
           <w:ilvl w:val="0"/>
-          <w:numId w:val="1005"/>
+          <w:numId w:val="1006"/>
         </w:numPr>
       </w:pPr>
       <w:r>
@@ -5594,7 +7160,7 @@
       <w:pPr>
         <w:numPr>
           <w:ilvl w:val="0"/>
-          <w:numId w:val="1005"/>
+          <w:numId w:val="1006"/>
         </w:numPr>
       </w:pPr>
       <w:r>
@@ -5605,7 +7171,7 @@
       <w:pPr>
         <w:numPr>
           <w:ilvl w:val="0"/>
-          <w:numId w:val="1005"/>
+          <w:numId w:val="1006"/>
         </w:numPr>
       </w:pPr>
       <w:r>
@@ -5616,7 +7182,174 @@
       <w:pPr>
         <w:numPr>
           <w:ilvl w:val="0"/>
-          <w:numId w:val="1005"/>
+          <w:numId w:val="1006"/>
+        </w:numPr>
+      </w:pPr>
+      <w:r>
+        <w:rPr>
+          <w:b/>
+          <w:bCs/>
+        </w:rPr>
+        <w:t xml:space="preserve">The GTI additions come from a recorded teaching session, not from a tested edge.</w:t>
+      </w:r>
+      <w:r>
+        <w:t xml:space="preserve"> </w:t>
+      </w:r>
+      <w:r>
+        <w:t xml:space="preserve">They were adopted because the reasoning is coherent and the mechanics are cheap to compute, not because they have been validated on this instrument. The presenter demonstrated them by scrolling back over selected days on his own chart, which is the weakest form of evidence there is. Treat all three as hypotheses under test.</w:t>
+      </w:r>
+    </w:p>
+    <w:p>
+      <w:pPr>
+        <w:numPr>
+          <w:ilvl w:val="0"/>
+          <w:numId w:val="1006"/>
+        </w:numPr>
+      </w:pPr>
+      <w:r>
+        <w:rPr>
+          <w:b/>
+          <w:bCs/>
+        </w:rPr>
+        <w:t xml:space="preserve">The day-bias veto is the single most destructive setting in the script.</w:t>
+      </w:r>
+      <w:r>
+        <w:t xml:space="preserve"> </w:t>
+      </w:r>
+      <w:r>
+        <w:t xml:space="preserve">It removes one entire direction for the whole session on the strength of one candle’s break, and that break can be a false one. Enable it alone, log a fortnight, and compare the SIGNALS row and the win rate against the same period without it before you keep it.</w:t>
+      </w:r>
+    </w:p>
+    <w:p>
+      <w:pPr>
+        <w:numPr>
+          <w:ilvl w:val="0"/>
+          <w:numId w:val="1006"/>
+        </w:numPr>
+      </w:pPr>
+      <w:r>
+        <w:rPr>
+          <w:b/>
+          <w:bCs/>
+        </w:rPr>
+        <w:t xml:space="preserve">“Only take entries on compressed days”</w:t>
+      </w:r>
+      <w:r>
+        <w:rPr>
+          <w:b/>
+          <w:bCs/>
+        </w:rPr>
+        <w:t xml:space="preserve"> </w:t>
+      </w:r>
+      <w:r>
+        <w:rPr>
+          <w:b/>
+          <w:bCs/>
+        </w:rPr>
+        <w:t xml:space="preserve">will produce no signals for days at a time.</w:t>
+      </w:r>
+      <w:r>
+        <w:t xml:space="preserve"> </w:t>
+      </w:r>
+      <w:r>
+        <w:t xml:space="preserve">That is what it is for. If you find yourself widening the compression threshold to get trades back, you have removed the filter and kept only its cost.</w:t>
+      </w:r>
+    </w:p>
+    <w:p>
+      <w:pPr>
+        <w:numPr>
+          <w:ilvl w:val="0"/>
+          <w:numId w:val="1006"/>
+        </w:numPr>
+      </w:pPr>
+      <w:r>
+        <w:t xml:space="preserve">The battlefield measurement is taken once, at the day’s first bar, from whatever zone mode you have selected. In</w:t>
+      </w:r>
+      <w:r>
+        <w:t xml:space="preserve"> </w:t>
+      </w:r>
+      <w:r>
+        <w:t xml:space="preserve">“Auto (near price)”</w:t>
+      </w:r>
+      <w:r>
+        <w:t xml:space="preserve"> </w:t>
+      </w:r>
+      <w:r>
+        <w:t xml:space="preserve">mode those edges are a trailing 40-bar range, which spans yesterday and today at 09:15 — close to the two-day structure the method assumes, but not identical to it. In pivot modes it can be measuring something considerably older. Check the Battlefield figure against the chart before trusting it.</w:t>
+      </w:r>
+    </w:p>
+    <w:p>
+      <w:pPr>
+        <w:numPr>
+          <w:ilvl w:val="0"/>
+          <w:numId w:val="1006"/>
+        </w:numPr>
+      </w:pPr>
+      <w:r>
+        <w:t xml:space="preserve">The attack counter reads whale bar colours, which on a feed without volume do not exist. It is not a fallback-safe source the way the candle-shape tests are.</w:t>
+      </w:r>
+    </w:p>
+    <w:p>
+      <w:pPr>
+        <w:numPr>
+          <w:ilvl w:val="0"/>
+          <w:numId w:val="1006"/>
+        </w:numPr>
+      </w:pPr>
+      <w:r>
+        <w:rPr>
+          <w:b/>
+          <w:bCs/>
+        </w:rPr>
+        <w:t xml:space="preserve">The GTI stop-loss discipline is much tighter than this script’s default.</w:t>
+      </w:r>
+      <w:r>
+        <w:t xml:space="preserve"> </w:t>
+      </w:r>
+      <w:r>
+        <w:t xml:space="preserve">The method caps a Nifty stop at roughly 20 points and a BankNifty stop at roughly 35, on the grounds that a correct read does not need more. SD-X ships with</w:t>
+      </w:r>
+      <w:r>
+        <w:t xml:space="preserve"> </w:t>
+      </w:r>
+      <w:r>
+        <w:t xml:space="preserve">“Max stop distance”</w:t>
+      </w:r>
+      <w:r>
+        <w:t xml:space="preserve"> </w:t>
+      </w:r>
+      <w:r>
+        <w:t xml:space="preserve">at 70. If you are trading the GTI rules, set that to 20 for Nifty or 35 for BankNifty and expect the</w:t>
+      </w:r>
+      <w:r>
+        <w:t xml:space="preserve"> </w:t>
+      </w:r>
+      <w:r>
+        <w:t xml:space="preserve">“Blocked: risk”</w:t>
+      </w:r>
+      <w:r>
+        <w:t xml:space="preserve"> </w:t>
+      </w:r>
+      <w:r>
+        <w:t xml:space="preserve">count to rise sharply — that rise is the filter working, not a fault.</w:t>
+      </w:r>
+    </w:p>
+    <w:p>
+      <w:pPr>
+        <w:numPr>
+          <w:ilvl w:val="0"/>
+          <w:numId w:val="1006"/>
+        </w:numPr>
+      </w:pPr>
+      <w:r>
+        <w:t xml:space="preserve">The 1:3 contra idea — that institutions book at the third projection and the reverse trade becomes attractive — is described in the source session but never given an entry rule. Nothing in this script trades it. The ladder veto only stops the script adding to a move that has already reached its target.</w:t>
+      </w:r>
+    </w:p>
+    <w:p>
+      <w:pPr>
+        <w:numPr>
+          <w:ilvl w:val="0"/>
+          <w:numId w:val="1006"/>
         </w:numPr>
       </w:pPr>
       <w:r>
@@ -5635,8 +7368,8 @@
         <w:t xml:space="preserve">This document describes a charting tool. It is not investment advice, and nothing in it is a recommendation to buy or sell any instrument. Test on paper before committing capital.</w:t>
       </w:r>
     </w:p>
-    <w:bookmarkEnd w:id="35"/>
-    <w:bookmarkEnd w:id="36"/>
+    <w:bookmarkEnd w:id="38"/>
+    <w:bookmarkEnd w:id="39"/>
     <w:sectPr>
       <w:footnotePr>
         <w:numRestart w:val="eachSect"/>
@@ -5948,6 +7681,9 @@
     <w:abstractNumId w:val="991"/>
   </w:num>
   <w:num w:numId="1004">
+    <w:abstractNumId w:val="991"/>
+  </w:num>
+  <w:num w:numId="1005">
     <w:abstractNumId w:val="99411"/>
     <w:lvlOverride w:ilvl="0">
       <w:startOverride w:val="1"/>
@@ -5977,7 +7713,7 @@
       <w:startOverride w:val="1"/>
     </w:lvlOverride>
   </w:num>
-  <w:num w:numId="1005">
+  <w:num w:numId="1006">
     <w:abstractNumId w:val="991"/>
   </w:num>
 </w:numbering>

</xml_diff>

<commit_message>
Sharks OI script added
</commit_message>
<xml_diff>
--- a/Nifty-Intra-OI/SD-X_v11_User_Guide.docx
+++ b/Nifty-Intra-OI/SD-X_v11_User_Guide.docx
@@ -2,7 +2,7 @@
 <file path=word/document.xml><?xml version="1.0" encoding="utf-8"?>
 <w:document xmlns:w="http://schemas.openxmlformats.org/wordprocessingml/2006/main" xmlns:m="http://schemas.openxmlformats.org/officeDocument/2006/math" xmlns:r="http://schemas.openxmlformats.org/officeDocument/2006/relationships" xmlns:o="urn:schemas-microsoft-com:office:office" xmlns:v="urn:schemas-microsoft-com:vml" xmlns:w10="urn:schemas-microsoft-com:office:word" xmlns:a="http://schemas.openxmlformats.org/drawingml/2006/main" xmlns:pic="http://schemas.openxmlformats.org/drawingml/2006/picture" xmlns:wp="http://schemas.openxmlformats.org/drawingml/2006/wordprocessingDrawing">
   <w:body>
-    <w:bookmarkStart w:id="40" w:name="sd-x-v11"/>
+    <w:bookmarkStart w:id="41" w:name="sd-x-v11"/>
     <w:p>
       <w:pPr>
         <w:pStyle w:val="Heading1"/>
@@ -433,7 +433,7 @@
       </w:r>
     </w:p>
     <w:bookmarkEnd w:id="13"/>
-    <w:bookmarkStart w:id="26" w:name="technical-indicators-used"/>
+    <w:bookmarkStart w:id="27" w:name="technical-indicators-used"/>
     <w:p>
       <w:pPr>
         <w:pStyle w:val="Heading2"/>
@@ -4067,8 +4067,336 @@
       </w:r>
     </w:p>
     <w:bookmarkEnd w:id="25"/>
+    <w:bookmarkStart w:id="26" w:name="shark-flow-companion-pane-script"/>
+    <w:p>
+      <w:pPr>
+        <w:pStyle w:val="Heading3"/>
+      </w:pPr>
+      <w:r>
+        <w:t xml:space="preserve">3.13 Shark flow (companion pane script)</w:t>
+      </w:r>
+    </w:p>
+    <w:p>
+      <w:pPr>
+        <w:pStyle w:val="FirstParagraph"/>
+      </w:pPr>
+      <w:r>
+        <w:rPr>
+          <w:rStyle w:val="VerbatimChar"/>
+        </w:rPr>
+        <w:t xml:space="preserve">sdx_v11_sharks.pine</w:t>
+      </w:r>
+      <w:r>
+        <w:t xml:space="preserve"> </w:t>
+      </w:r>
+      <w:r>
+        <w:t xml:space="preserve">answers one question the chart alone can answer without any option data:</w:t>
+      </w:r>
+      <w:r>
+        <w:t xml:space="preserve"> </w:t>
+      </w:r>
+      <w:r>
+        <w:rPr>
+          <w:b/>
+          <w:bCs/>
+        </w:rPr>
+        <w:t xml:space="preserve">where did the big lots print today, and which way did they lean?</w:t>
+      </w:r>
+      <w:r>
+        <w:t xml:space="preserve"> </w:t>
+      </w:r>
+      <w:r>
+        <w:t xml:space="preserve">It makes no data requests at all, so it runs on a TradingView plan with no NSE F&amp;O entitlement. Load it in its own pane under the signals script.</w:t>
+      </w:r>
+    </w:p>
+    <w:p>
+      <w:pPr>
+        <w:pStyle w:val="BodyText"/>
+      </w:pPr>
+      <w:r>
+        <w:t xml:space="preserve">It uses the signals script’s own whale-bar test (3.6) — volume above 1.35× its 20-bar average, direction from the bar’s body and wicks — so a blue bar on the chart is a buy column here and a black bar a sell column. A bar that qualifies both ways (wide wicks both sides) is a fight nobody won and counts as zero.</w:t>
+      </w:r>
+    </w:p>
+    <w:tbl>
+      <w:tblPr>
+        <w:tblStyle w:val="Table"/>
+        <w:tblW w:type="pct" w:w="5000"/>
+        <w:tblLayout w:type="fixed"/>
+        <w:tblLook w:firstRow="1" w:lastRow="0" w:firstColumn="0" w:lastColumn="0" w:noHBand="0" w:noVBand="0" w:val="0020"/>
+      </w:tblPr>
+      <w:tblGrid>
+        <w:gridCol w:w="3960"/>
+        <w:gridCol w:w="3960"/>
+      </w:tblGrid>
+      <w:tr>
+        <w:trPr>
+          <w:tblHeader w:val="on"/>
+        </w:trPr>
+        <w:tc>
+          <w:tcPr/>
+          <w:p>
+            <w:pPr>
+              <w:pStyle w:val="Compact"/>
+              <w:jc w:val="left"/>
+            </w:pPr>
+            <w:r>
+              <w:rPr>
+                <w:b/>
+                <w:bCs/>
+              </w:rPr>
+              <w:t xml:space="preserve">Element</w:t>
+            </w:r>
+          </w:p>
+        </w:tc>
+        <w:tc>
+          <w:tcPr/>
+          <w:p>
+            <w:pPr>
+              <w:pStyle w:val="Compact"/>
+              <w:jc w:val="left"/>
+            </w:pPr>
+            <w:r>
+              <w:rPr>
+                <w:b/>
+                <w:bCs/>
+              </w:rPr>
+              <w:t xml:space="preserve">What it shows</w:t>
+            </w:r>
+          </w:p>
+        </w:tc>
+      </w:tr>
+      <w:tr>
+        <w:tc>
+          <w:tcPr/>
+          <w:p>
+            <w:pPr>
+              <w:pStyle w:val="Compact"/>
+              <w:jc w:val="left"/>
+            </w:pPr>
+            <w:r>
+              <w:t xml:space="preserve">Columns</w:t>
+            </w:r>
+          </w:p>
+        </w:tc>
+        <w:tc>
+          <w:tcPr/>
+          <w:p>
+            <w:pPr>
+              <w:pStyle w:val="Compact"/>
+              <w:jc w:val="left"/>
+            </w:pPr>
+            <w:r>
+              <w:t xml:space="preserve">Each whale bar’s volume, blue for institutional buying, black for selling</w:t>
+            </w:r>
+          </w:p>
+        </w:tc>
+      </w:tr>
+      <w:tr>
+        <w:tc>
+          <w:tcPr/>
+          <w:p>
+            <w:pPr>
+              <w:pStyle w:val="Compact"/>
+              <w:jc w:val="left"/>
+            </w:pPr>
+            <w:r>
+              <w:t xml:space="preserve">Line</w:t>
+            </w:r>
+          </w:p>
+        </w:tc>
+        <w:tc>
+          <w:tcPr/>
+          <w:p>
+            <w:pPr>
+              <w:pStyle w:val="Compact"/>
+              <w:jc w:val="left"/>
+            </w:pPr>
+            <w:r>
+              <w:t xml:space="preserve">Today’s cumulative signed whale volume — buying minus selling since the open. Green above the neutral band, red below, grey inside it</w:t>
+            </w:r>
+          </w:p>
+        </w:tc>
+      </w:tr>
+      <w:tr>
+        <w:tc>
+          <w:tcPr/>
+          <w:p>
+            <w:pPr>
+              <w:pStyle w:val="Compact"/>
+              <w:jc w:val="left"/>
+            </w:pPr>
+            <w:r>
+              <w:t xml:space="preserve">Sharks</w:t>
+            </w:r>
+          </w:p>
+        </w:tc>
+        <w:tc>
+          <w:tcPr/>
+          <w:p>
+            <w:pPr>
+              <w:pStyle w:val="Compact"/>
+              <w:jc w:val="left"/>
+            </w:pPr>
+            <w:r>
+              <w:t xml:space="preserve">The verdict:</w:t>
+            </w:r>
+            <w:r>
+              <w:t xml:space="preserve"> </w:t>
+            </w:r>
+            <w:r>
+              <w:rPr>
+                <w:b/>
+                <w:bCs/>
+              </w:rPr>
+              <w:t xml:space="preserve">Bullish</w:t>
+            </w:r>
+            <w:r>
+              <w:t xml:space="preserve">,</w:t>
+            </w:r>
+            <w:r>
+              <w:t xml:space="preserve"> </w:t>
+            </w:r>
+            <w:r>
+              <w:rPr>
+                <w:b/>
+                <w:bCs/>
+              </w:rPr>
+              <w:t xml:space="preserve">Bearish</w:t>
+            </w:r>
+            <w:r>
+              <w:t xml:space="preserve"> </w:t>
+            </w:r>
+            <w:r>
+              <w:t xml:space="preserve">or</w:t>
+            </w:r>
+            <w:r>
+              <w:t xml:space="preserve"> </w:t>
+            </w:r>
+            <w:r>
+              <w:rPr>
+                <w:b/>
+                <w:bCs/>
+              </w:rPr>
+              <w:t xml:space="preserve">Neutral</w:t>
+            </w:r>
+            <w:r>
+              <w:t xml:space="preserve">. The band is 10% of the day’s gross whale volume, so it self-scales between a quiet morning and expiry day</w:t>
+            </w:r>
+          </w:p>
+        </w:tc>
+      </w:tr>
+      <w:tr>
+        <w:tc>
+          <w:tcPr/>
+          <w:p>
+            <w:pPr>
+              <w:pStyle w:val="Compact"/>
+              <w:jc w:val="left"/>
+            </w:pPr>
+            <w:r>
+              <w:t xml:space="preserve">Flow today</w:t>
+            </w:r>
+          </w:p>
+        </w:tc>
+        <w:tc>
+          <w:tcPr/>
+          <w:p>
+            <w:pPr>
+              <w:pStyle w:val="Compact"/>
+              <w:jc w:val="left"/>
+            </w:pPr>
+            <w:r>
+              <w:t xml:space="preserve">The net figure and how many whale bars went each way</w:t>
+            </w:r>
+          </w:p>
+        </w:tc>
+      </w:tr>
+      <w:tr>
+        <w:tc>
+          <w:tcPr/>
+          <w:p>
+            <w:pPr>
+              <w:pStyle w:val="Compact"/>
+              <w:jc w:val="left"/>
+            </w:pPr>
+            <w:r>
+              <w:t xml:space="preserve">Big buy / Big sell</w:t>
+            </w:r>
+          </w:p>
+        </w:tc>
+        <w:tc>
+          <w:tcPr/>
+          <w:p>
+            <w:pPr>
+              <w:pStyle w:val="Compact"/>
+              <w:jc w:val="left"/>
+            </w:pPr>
+            <w:r>
+              <w:t xml:space="preserve">The single loudest whale bar each side, with the price it closed at and the time. That level is where the sharks showed their hand — treat it as support (buy) or resistance (sell) until it is closed through</w:t>
+            </w:r>
+          </w:p>
+        </w:tc>
+      </w:tr>
+    </w:tbl>
+    <w:p>
+      <w:pPr>
+        <w:pStyle w:val="BodyText"/>
+      </w:pPr>
+      <w:r>
+        <w:t xml:space="preserve">Alerts:</w:t>
+      </w:r>
+      <w:r>
+        <w:t xml:space="preserve"> </w:t>
+      </w:r>
+      <w:r>
+        <w:t xml:space="preserve">“SD-X Sharks turn bullish / bearish”</w:t>
+      </w:r>
+      <w:r>
+        <w:t xml:space="preserve"> </w:t>
+      </w:r>
+      <w:r>
+        <w:t xml:space="preserve">fire when the line crosses out of the neutral band.</w:t>
+      </w:r>
+    </w:p>
+    <w:p>
+      <w:pPr>
+        <w:pStyle w:val="BodyText"/>
+      </w:pPr>
+      <w:r>
+        <w:t xml:space="preserve">What it is not: a read of</w:t>
+      </w:r>
+      <w:r>
+        <w:t xml:space="preserve"> </w:t>
+      </w:r>
+      <w:r>
+        <w:rPr>
+          <w:i/>
+          <w:iCs/>
+        </w:rPr>
+        <w:t xml:space="preserve">positions</w:t>
+      </w:r>
+      <w:r>
+        <w:t xml:space="preserve">. Open interest is positions; this is traded volume on a spot index, which TradingView synthesises from the constituents. It says who was aggressive on the tape today, not what they are holding. For the positions read, use the desktop OI window’s</w:t>
+      </w:r>
+      <w:r>
+        <w:t xml:space="preserve"> </w:t>
+      </w:r>
+      <w:r>
+        <w:rPr>
+          <w:rStyle w:val="VerbatimChar"/>
+        </w:rPr>
+        <w:t xml:space="preserve">intraday</w:t>
+      </w:r>
+      <w:r>
+        <w:t xml:space="preserve"> </w:t>
+      </w:r>
+      <w:r>
+        <w:t xml:space="preserve">view (§3.12), which has the option chain and premiums the chart does not.</w:t>
+      </w:r>
+    </w:p>
     <w:bookmarkEnd w:id="26"/>
-    <w:bookmarkStart w:id="29" w:name="how-a-signal-is-produced"/>
+    <w:bookmarkEnd w:id="27"/>
+    <w:bookmarkStart w:id="30" w:name="how-a-signal-is-produced"/>
     <w:p>
       <w:pPr>
         <w:pStyle w:val="Heading2"/>
@@ -4451,7 +4779,7 @@
         <w:t xml:space="preserve">Stages 2 to 6 mark the bar with a small grey ✕ so you can see, on the chart, exactly where a setup existed and was rejected.</w:t>
       </w:r>
     </w:p>
-    <w:bookmarkStart w:id="27" w:name="the-six-entry-sources"/>
+    <w:bookmarkStart w:id="28" w:name="the-six-entry-sources"/>
     <w:p>
       <w:pPr>
         <w:pStyle w:val="Heading3"/>
@@ -4945,8 +5273,8 @@
         <w:t xml:space="preserve">.</w:t>
       </w:r>
     </w:p>
-    <w:bookmarkEnd w:id="27"/>
-    <w:bookmarkStart w:id="28" w:name="entry-stop-and-target"/>
+    <w:bookmarkEnd w:id="28"/>
+    <w:bookmarkStart w:id="29" w:name="entry-stop-and-target"/>
     <w:p>
       <w:pPr>
         <w:pStyle w:val="Heading3"/>
@@ -5063,9 +5391,9 @@
         <w:t xml:space="preserve">A bar that spans both stop and target is treated as a stop. Intrabar order is unknowable on a 3-minute candle, so the script never awards itself the gift.</w:t>
       </w:r>
     </w:p>
-    <w:bookmarkEnd w:id="28"/>
     <w:bookmarkEnd w:id="29"/>
-    <w:bookmarkStart w:id="30" w:name="intraday-rules-built-into-the-script"/>
+    <w:bookmarkEnd w:id="30"/>
+    <w:bookmarkStart w:id="31" w:name="intraday-rules-built-into-the-script"/>
     <w:p>
       <w:pPr>
         <w:pStyle w:val="Heading2"/>
@@ -5624,8 +5952,8 @@
         </w:tc>
       </w:tr>
     </w:tbl>
-    <w:bookmarkEnd w:id="30"/>
-    <w:bookmarkStart w:id="35" w:name="reading-the-two-tables"/>
+    <w:bookmarkEnd w:id="31"/>
+    <w:bookmarkStart w:id="36" w:name="reading-the-two-tables"/>
     <w:p>
       <w:pPr>
         <w:pStyle w:val="Heading2"/>
@@ -5634,7 +5962,7 @@
         <w:t xml:space="preserve">6. Reading the two tables</w:t>
       </w:r>
     </w:p>
-    <w:bookmarkStart w:id="31" w:name="today-top-right"/>
+    <w:bookmarkStart w:id="32" w:name="today-top-right"/>
     <w:p>
       <w:pPr>
         <w:pStyle w:val="Heading3"/>
@@ -5992,8 +6320,8 @@
         <w:t xml:space="preserve">is where you get stopped out for no reason.</w:t>
       </w:r>
     </w:p>
-    <w:bookmarkEnd w:id="31"/>
-    <w:bookmarkStart w:id="32" w:name="diag-bottom-right"/>
+    <w:bookmarkEnd w:id="32"/>
+    <w:bookmarkStart w:id="33" w:name="diag-bottom-right"/>
     <w:p>
       <w:pPr>
         <w:pStyle w:val="Heading3"/>
@@ -6556,8 +6884,8 @@
         </w:tc>
       </w:tr>
     </w:tbl>
-    <w:bookmarkEnd w:id="32"/>
-    <w:bookmarkStart w:id="33" w:name="option-chain-top-left-companion-script"/>
+    <w:bookmarkEnd w:id="33"/>
+    <w:bookmarkStart w:id="34" w:name="option-chain-top-left-companion-script"/>
     <w:p>
       <w:pPr>
         <w:pStyle w:val="Heading3"/>
@@ -6574,8 +6902,8 @@
         <w:t xml:space="preserve">One row per strike around ATM with CE OI, CE change, PE OI and PE change. The ATM row is highlighted and marked with an arrow; the highest-OI CE and PE cells are shaded. Summary rows give totals, PCR, the support and resistance strikes, where today’s writing is concentrated, the overall bias, and the futures buildup. The last row shows live ATM CE and PE premiums with the rupee cost of one lot.</w:t>
       </w:r>
     </w:p>
-    <w:bookmarkEnd w:id="33"/>
-    <w:bookmarkStart w:id="34" w:name="X6d8286a18ef7ca0abd97a6296aa3604952b8fd7"/>
+    <w:bookmarkEnd w:id="34"/>
+    <w:bookmarkStart w:id="35" w:name="X6d8286a18ef7ca0abd97a6296aa3604952b8fd7"/>
     <w:p>
       <w:pPr>
         <w:pStyle w:val="Heading3"/>
@@ -7620,9 +7948,9 @@
         </w:tc>
       </w:tr>
     </w:tbl>
-    <w:bookmarkEnd w:id="34"/>
     <w:bookmarkEnd w:id="35"/>
-    <w:bookmarkStart w:id="36" w:name="alerts"/>
+    <w:bookmarkEnd w:id="36"/>
+    <w:bookmarkStart w:id="37" w:name="alerts"/>
     <w:p>
       <w:pPr>
         <w:pStyle w:val="Heading2"/>
@@ -7922,8 +8250,8 @@
         </w:tc>
       </w:tr>
     </w:tbl>
-    <w:bookmarkEnd w:id="36"/>
-    <w:bookmarkStart w:id="37" w:name="daily-workflow"/>
+    <w:bookmarkEnd w:id="37"/>
+    <w:bookmarkStart w:id="38" w:name="daily-workflow"/>
     <w:p>
       <w:pPr>
         <w:pStyle w:val="Heading2"/>
@@ -8214,8 +8542,8 @@
         <w:t xml:space="preserve">At the close, read the Today and DIAG tables and log the result. After two weeks you will know whether the settings suit your market conditions.</w:t>
       </w:r>
     </w:p>
-    <w:bookmarkEnd w:id="37"/>
-    <w:bookmarkStart w:id="38" w:name="troubleshooting"/>
+    <w:bookmarkEnd w:id="38"/>
+    <w:bookmarkStart w:id="39" w:name="troubleshooting"/>
     <w:p>
       <w:pPr>
         <w:pStyle w:val="Heading2"/>
@@ -8843,8 +9171,8 @@
         </w:tc>
       </w:tr>
     </w:tbl>
-    <w:bookmarkEnd w:id="38"/>
-    <w:bookmarkStart w:id="39" w:name="limitations-and-risk"/>
+    <w:bookmarkEnd w:id="39"/>
+    <w:bookmarkStart w:id="40" w:name="limitations-and-risk"/>
     <w:p>
       <w:pPr>
         <w:pStyle w:val="Heading2"/>
@@ -9140,8 +9468,8 @@
         <w:t xml:space="preserve">This document describes a charting tool. It is not investment advice, and nothing in it is a recommendation to buy or sell any instrument. Test on paper before committing capital.</w:t>
       </w:r>
     </w:p>
-    <w:bookmarkEnd w:id="39"/>
     <w:bookmarkEnd w:id="40"/>
+    <w:bookmarkEnd w:id="41"/>
     <w:sectPr>
       <w:footnotePr>
         <w:numRestart w:val="eachSect"/>

</xml_diff>